<commit_message>
Apply technical-review corrections: Lorentz-force normalization, Rd redefinition, dimensionally consistent Soret/Dufour, C_f convention, Table 2 params, LaTeX accents and braces
</commit_message>
<xml_diff>
--- a/Manuscript_EMHD_Carreau_Hybrid_Nanofluid.docx
+++ b/Manuscript_EMHD_Carreau_Hybrid_Nanofluid.docx
@@ -274,7 +274,7 @@
     <w:p/>
     <w:p>
       <w:r>
-        <w:t xml:space="preserve">The continuity, x-momentum, y-momentum, energy and species equations under the usual boundary-layer scaling are</w:t>
+        <w:t xml:space="preserve">The continuity, x-momentum, y-momentum, energy and species equations under the usual boundary-layer scaling are given below. The momentum equations are written in force-per-unit-volume form (left-hand side ρ_hnf × acceleration), so every term on the right-hand side — including the Lorentz force σ_hnf B²(u − u_E), the Darcy drag μ_hnf u/k_p and the Forchheimer term ρ_hnf F_c u² — carries units of force per unit volume (no division by ρ_hnf):</w:t>
       </w:r>
     </w:p>
     <w:p/>
@@ -306,7 +306,7 @@
     </w:p>
     <w:p>
       <w:r>
-        <w:t xml:space="preserve">\rho_{hnf}\left(\frac{\partial u}{\partial t} + u\frac{\partial u}{\partial x} + v\frac{\partial u}{\partial y}\right) = -\frac{\partial p}{\partial x} + \frac{\partial \tau_{xy}}{\partial y} - \frac{\mu_{hnf}}{k_p}u - \frac{\sigma_{hnf}}{\rho_{hnf}} B^2 (u - u_E) - \rho_{hnf} F_c u^2</w:t>
+        <w:t xml:space="preserve">\rho_{hnf}\left(\frac{\partial u}{\partial t} + u\frac{\partial u}{\partial x} + v\frac{\partial u}{\partial y}\right) = -\frac{\partial p}{\partial x} + \frac{\partial \tau_{xy}}{\partial y} - \frac{\mu_{hnf}}{k_p}u - \sigma_{hnf} B^2 (u - u_E) - \rho_{hnf} F_c u^2</w:t>
       </w:r>
     </w:p>
     <w:p>
@@ -348,7 +348,7 @@
     </w:p>
     <w:p>
       <w:r>
-        <w:t xml:space="preserve">(\rho c_p)_{hnf}\left(\frac{\partial T}{\partial t} + u\frac{\partial T}{\partial x} + v\frac{\partial T}{\partial y}\right) = \kappa_{hnf}\frac{\partial^2 T}{\partial y^2} - \frac{\partial q_r}{\partial y} + \mu_{hnf}\left(\frac{\partial u}{\partial y}\right)^2 + \sigma_{hnf} B^2 (u - u_E)^2 + \frac{D_B K_T}{c_s}\frac{\partial^2 C}{\partial y^2}</w:t>
+        <w:t xml:space="preserve">(\rho c_p)_{hnf}\left(\frac{\partial T}{\partial t} + u\frac{\partial T}{\partial x} + v\frac{\partial T}{\partial y}\right) = \kappa_{hnf}\frac{\partial^2 T}{\partial y^2} - \frac{\partial q_r}{\partial y} + \mu_{hnf}\left(\frac{\partial u}{\partial y}\right)^2 + \sigma_{hnf} B^2 (u - u_E)^2 + \frac{(\rho c_p)_{hnf}\, D_B K_T}{c_s c_p}\frac{\partial^2 C}{\partial y^2}</w:t>
       </w:r>
     </w:p>
     <w:p>
@@ -385,7 +385,7 @@
     <w:p/>
     <w:p>
       <w:r>
-        <w:t xml:space="preserve">where τ is the Carreau stress tensor, k_p is the permeability, F_c the Forchheimer inertia coefficient, u_E = E/B the electric drift velocity, D_B the mass diffusivity, K_T the thermal-diffusion ratio, c_s the concentration susceptibility, T_m the mean fluid temperature, and k_r the reaction-rate constant. The nonlinear (Rosseland) radiative flux is</w:t>
+        <w:t xml:space="preserve">where τ is the Carreau stress tensor, k_p is the permeability, F_c the Forchheimer inertia coefficient, u_E = E/B the electric drift velocity, D_B the mass diffusivity, c_p the specific heat of the base fluid, c_s the concentration susceptibility (units J kg⁻¹ K⁻¹), T_m the mean fluid temperature, and k_r the reaction-rate constant. In the Dufour term of Eq. (10) the combination D_B K_T/(c_s c_p) carries units of temperature per unit concentration, so that the whole term has dimensions of temperature per unit time, consistent with the convective and conduction terms. In the Soret term of Eq. (11) the thermal-diffusion ratio K_T is defined (following Eckert and Drake [25]) as the dimensional ratio K_T = (C_w − C_0)/(T_w − T_0) × κ_T, i.e. it absorbs the characteristic concentration-to-temperature scale ratio, so that D_B K_T/T_m × ∂²T/∂y² has dimensions of concentration per unit time, consistent with the diffusion term D_B ∂²C/∂y². With these definitions both cross-diffusion terms are dimensionally homogeneous with their host equations. The nonlinear (Rosseland) radiative flux is</w:t>
       </w:r>
     </w:p>
     <w:p/>
@@ -668,7 +668,7 @@
     </w:p>
     <w:p>
       <w:r>
-        <w:t xml:space="preserve">Rd = \frac{16\sigma^* T_0^3}{3 k^* \kappa_f}</w:t>
+        <w:t xml:space="preserve">Rd = \frac{4\sigma^* T_0^3}{k^* \kappa_f}</w:t>
       </w:r>
     </w:p>
     <w:p>
@@ -826,7 +826,7 @@
     <w:p/>
     <w:p>
       <w:r>
-        <w:t xml:space="preserve">Applying the transformation (18) to Eqs. (10) and (11) and using the Rosseland linearisation gives</w:t>
+        <w:t xml:space="preserve">Applying the transformation (18) to Eqs. (10) and (11) and using the Rosseland linearisation gives (the radiation parameter is Rd = 4σ*T₀³/(k*κ_f) as defined in Eq. 20, which produces the coefficients 4/3 and 4 below)</w:t>
       </w:r>
     </w:p>
     <w:p/>
@@ -923,6 +923,18 @@
     <w:p>
       <w:r>
         <w:t xml:space="preserve">$$</w:t>
+      </w:r>
+    </w:p>
+    <w:p/>
+    <w:p>
+      <w:r>
+        <w:rPr>
+          <w:b/>
+        </w:rPr>
+        <w:t xml:space="preserve">Radiation-coefficient reduction.</w:t>
+      </w:r>
+      <w:r>
+        <w:t xml:space="preserve"> Differentiating the Rosseland flux (12) gives −∂q_r/∂y = (16σ*/3k*)[T³ ∂²T/∂y² + 3T²(∂T/∂y)²]. Writing T = T₀F with F from Eq. (26) and normalising the energy equation by κ_f(T_w − T₀)/h² yields the radiative contribution (16σ*T₀³/3k*κ_f)[F³θ″ + 3(θ_r − 1)F²θ′²]. Defining the radiation parameter as Rd = 4σ*T₀³/(k*κ_f) (Eq. 20), the prefactor 16σ*T₀³/(3k*κ_f) equals (4/3)Rd, so the two radiative terms become exactly (4/3)Rd F³θ″ and 3 × (4/3)Rd (θ_r − 1)F²θ′² = 4Rd (θ_r − 1)F²θ′², as written in Eq. (24).</w:t>
       </w:r>
     </w:p>
     <w:p/>
@@ -934,7 +946,7 @@
         <w:t xml:space="preserve">Dufour term reduction.</w:t>
       </w:r>
       <w:r>
-        <w:t xml:space="preserve"> The dimensional Dufour contribution in Eq. (10) is (D_B K_T/[c_s (ρc_p)_hnf]) ∂²C/∂y². With c_s identified as the mean temperature T_m and the energy equation normalised by (ρc_p)_f, the factor α_c introduced by the convective terms cancels the α_c carried by the Dufour denominator, leaving the group Pr α_ρ Df exactly, with Df as defined in Eq. (21). All dimensionless groups entering Eqs. (24)–(25) — namely Pr, Rd, Ec, Sc, Sr, Df, K and the ratios α_κ, α_c, α_μ, α_σ, α_ρ — are defined in Section 2.5.</w:t>
+        <w:t xml:space="preserve"> The dimensional Dufour contribution in Eq. (10) is [(ρc_p)_hnf D_B K_T/(c_s c_p)] ∂²C/∂y², in which c_s is the concentration susceptibility (units J kg⁻¹ K⁻¹) — not the mean temperature. On normalising the energy equation by (ρc_p)_f, the prefactor (ρc_p)_hnf/(ρc_p)_f = α_c multiplies the term, while the convective terms also carry α_c; dividing the whole energy equation through, the Dufour group reduces to Pr α_ρ Df with Df = D_B K_T (C_w − C₀)/[c_s (c_p)_f ν_f (T_w − T₀)] as defined in Eq. (21), which is dimensionless. All dimensionless groups entering Eqs. (24)–(25) — namely Pr, Rd, Ec, Sc, Sr, Df, K and the ratios α_κ, α_c, α_μ, α_σ, α_ρ — are defined in Section 2.5.</w:t>
       </w:r>
     </w:p>
     <w:p/>
@@ -1012,7 +1024,7 @@
     <w:p/>
     <w:p>
       <w:r>
-        <w:t xml:space="preserve">The reduced skin-friction coefficient derived from the Carreau wall shear stress τ_w = μ_hnf (∂u/∂y)[1 + (Γ ∂u/∂y)²]^{(n−1)/2} evaluated at the upper plate, non-dimensionalised, is</w:t>
+        <w:t xml:space="preserve">The skin-friction coefficient is defined here with the single-sided dynamic pressure, C_f = τ_w/(ρ_f U_e²), from the Carreau wall shear stress τ_w = μ_hnf (∂u/∂y)[1 + (Γ ∂u/∂y)²]^{(n−1)/2} evaluated at the upper plate. With this convention (no factor of 1/2 in the reference pressure), the reduced form is</w:t>
       </w:r>
     </w:p>
     <w:p/>
@@ -1039,7 +1051,7 @@
     <w:p/>
     <w:p>
       <w:r>
-        <w:t xml:space="preserve">so that the property ratio α_μ and the Carreau exponent (n − 1)/2 appear exactly as in the constitutive law (6). The reduced Nusselt and Sherwood numbers are</w:t>
+        <w:t xml:space="preserve">so that the property ratio α_μ and the Carreau exponent (n − 1)/2 appear exactly as in the constitutive law (6). Had the half-dynamic-pressure convention C_f = τ_w/(½ρ_f U_e²) been adopted, a leading factor of 2 would appear in Eq. (30); the reported C_f values follow the convention stated above. The reduced Nusselt and Sherwood numbers are</w:t>
       </w:r>
     </w:p>
     <w:p/>
@@ -1244,7 +1256,7 @@
     <w:p/>
     <w:p>
       <w:r>
-        <w:t xml:space="preserve">The mass-diffusion entropy production follows from linear irreversible thermodynamics. For a dilute binary mixture the local entropy production is σ_s = </w:t>
+        <w:t xml:space="preserve">The mass-diffusion entropy production follows from linear irreversible thermodynamics. For a dilute binary mixture, with the sign convention that the volumetric entropy-production rate σ_s is non-negative (second law), the local entropy production is σ_s = </w:t>
       </w:r>
       <w:r>
         <w:rPr>
@@ -1262,7 +1274,7 @@
         <w:t xml:space="preserve">J</w:t>
       </w:r>
       <w:r>
-        <w:t xml:space="preserve">_s · ∇(μ_c/T), where </w:t>
+        <w:t xml:space="preserve">_s · ∇μ_c ≥ 0, where </w:t>
       </w:r>
       <w:r>
         <w:rPr>
@@ -1280,7 +1292,7 @@
         <w:t xml:space="preserve">J</w:t>
       </w:r>
       <w:r>
-        <w:t xml:space="preserve">_s are the heat- and species-diffusion fluxes and μ_c is the chemical potential. Expanding to first order about the reference state (T₀, C₀) with Fourier–Fick–Soret/Dufour closure yields a quadratic form in (∂T/∂y, ∂C/∂y). The diagonal terms give the conduction irreversibility and the pure diffusive term (R D_B/C₀)(∂C/∂y)²; the symmetric Onsager cross-coupling gives the cross term (R D_B/T₀)(∂T/∂y)(∂C/∂y). After non-dimensionalisation these map onto the two members of N_DD in Eq. (34). The grouping is valid for moderate Ω (reference-state linearisation).</w:t>
+        <w:t xml:space="preserve">_s are the heat- and species-diffusion fluxes and μ_c is the chemical potential; the second term carries the explicit minus sign so that the dissipation associated with down-gradient species diffusion is positive. Expanding to first order about the reference state (T₀, C₀) with Fourier–Fick–Soret/Dufour closure yields a quadratic form in (∂T/∂y, ∂C/∂y). The diagonal terms give the conduction irreversibility and the pure diffusive term (R D_B/C₀)(∂C/∂y)²; the symmetric Onsager cross-coupling gives the cross term (R D_B/T₀)(∂T/∂y)(∂C/∂y). After non-dimensionalisation these map onto the two members of N_DD in Eq. (34). The grouping is valid for moderate Ω (reference-state linearisation).</w:t>
       </w:r>
     </w:p>
     <w:p/>
@@ -1390,6 +1402,428 @@
           <w:b/>
         </w:rPr>
         <w:t xml:space="preserve">Table 1. Grid convergence of f″(1).</w:t>
+      </w:r>
+    </w:p>
+    <w:p/>
+    <w:tbl>
+      <w:tblPr>
+        <w:tblStyle w:val="TableGrid"/>
+        <w:tblW w:w="0" w:type="auto"/>
+        <w:tblBorders>
+          <w:top w:val="single" w:sz="4" w:color="000000"/>
+          <w:bottom w:val="single" w:sz="4" w:color="000000"/>
+          <w:left w:val="single" w:sz="4" w:color="000000"/>
+          <w:right w:val="single" w:sz="4" w:color="000000"/>
+          <w:insideH w:val="single" w:sz="4" w:color="000000"/>
+          <w:insideV w:val="single" w:sz="4" w:color="000000"/>
+        </w:tblBorders>
+      </w:tblPr>
+      <w:tblGrid>
+        <w:gridCol w:w="1800"/>
+        <w:gridCol w:w="1800"/>
+        <w:gridCol w:w="1800"/>
+        <w:gridCol w:w="1800"/>
+        <w:gridCol w:w="1800"/>
+      </w:tblGrid>
+      <w:tr>
+        <w:tc>
+          <w:tcPr>
+            <w:tcBorders>
+              <w:top w:val="single" w:sz="4" w:color="000000"/>
+              <w:bottom w:val="single" w:sz="4" w:color="000000"/>
+              <w:left w:val="single" w:sz="4" w:color="000000"/>
+              <w:right w:val="single" w:sz="4" w:color="000000"/>
+            </w:tcBorders>
+            <w:shd w:val="clear" w:color="auto" w:fill="D9E2F3"/>
+          </w:tcPr>
+          <w:p>
+            <w:pPr>
+              <w:spacing w:after="0"/>
+            </w:pPr>
+            <w:r>
+              <w:rPr>
+                <w:b/>
+              </w:rPr>
+              <w:t xml:space="preserve">N</w:t>
+            </w:r>
+          </w:p>
+        </w:tc>
+        <w:tc>
+          <w:tcPr>
+            <w:tcBorders>
+              <w:top w:val="single" w:sz="4" w:color="000000"/>
+              <w:bottom w:val="single" w:sz="4" w:color="000000"/>
+              <w:left w:val="single" w:sz="4" w:color="000000"/>
+              <w:right w:val="single" w:sz="4" w:color="000000"/>
+            </w:tcBorders>
+            <w:shd w:val="clear" w:color="auto" w:fill="D9E2F3"/>
+          </w:tcPr>
+          <w:p>
+            <w:pPr>
+              <w:spacing w:after="0"/>
+            </w:pPr>
+            <w:r>
+              <w:rPr>
+                <w:b/>
+              </w:rPr>
+              <w:t xml:space="preserve">f″(1)</w:t>
+            </w:r>
+          </w:p>
+        </w:tc>
+        <w:tc>
+          <w:tcPr>
+            <w:tcBorders>
+              <w:top w:val="single" w:sz="4" w:color="000000"/>
+              <w:bottom w:val="single" w:sz="4" w:color="000000"/>
+              <w:left w:val="single" w:sz="4" w:color="000000"/>
+              <w:right w:val="single" w:sz="4" w:color="000000"/>
+            </w:tcBorders>
+            <w:shd w:val="clear" w:color="auto" w:fill="D9E2F3"/>
+          </w:tcPr>
+          <w:p>
+            <w:pPr>
+              <w:spacing w:after="0"/>
+            </w:pPr>
+            <w:r>
+              <w:rPr>
+                <w:b/>
+              </w:rPr>
+              <w:t xml:space="preserve">Relative change \</w:t>
+            </w:r>
+          </w:p>
+        </w:tc>
+        <w:tc>
+          <w:tcPr>
+            <w:tcBorders>
+              <w:top w:val="single" w:sz="4" w:color="000000"/>
+              <w:bottom w:val="single" w:sz="4" w:color="000000"/>
+              <w:left w:val="single" w:sz="4" w:color="000000"/>
+              <w:right w:val="single" w:sz="4" w:color="000000"/>
+            </w:tcBorders>
+            <w:shd w:val="clear" w:color="auto" w:fill="D9E2F3"/>
+          </w:tcPr>
+          <w:p>
+            <w:pPr>
+              <w:spacing w:after="0"/>
+            </w:pPr>
+            <w:r>
+              <w:rPr>
+                <w:b/>
+              </w:rPr>
+              <w:t xml:space="preserve">Δf″(1)/f″(1)\</w:t>
+            </w:r>
+          </w:p>
+        </w:tc>
+        <w:tc>
+          <w:tcPr>
+            <w:tcBorders>
+              <w:top w:val="single" w:sz="4" w:color="000000"/>
+              <w:bottom w:val="single" w:sz="4" w:color="000000"/>
+              <w:left w:val="single" w:sz="4" w:color="000000"/>
+              <w:right w:val="single" w:sz="4" w:color="000000"/>
+            </w:tcBorders>
+            <w:shd w:val="clear" w:color="auto" w:fill="D9E2F3"/>
+          </w:tcPr>
+          <w:p>
+            <w:pPr>
+              <w:spacing w:after="0"/>
+            </w:pPr>
+            <w:r>
+              <w:rPr>
+                <w:b/>
+              </w:rPr>
+              <w:t xml:space="preserve"/>
+            </w:r>
+          </w:p>
+        </w:tc>
+      </w:tr>
+      <w:tr>
+        <w:tc>
+          <w:tcPr>
+            <w:tcBorders>
+              <w:top w:val="single" w:sz="4" w:color="000000"/>
+              <w:bottom w:val="single" w:sz="4" w:color="000000"/>
+              <w:left w:val="single" w:sz="4" w:color="000000"/>
+              <w:right w:val="single" w:sz="4" w:color="000000"/>
+            </w:tcBorders>
+          </w:tcPr>
+          <w:p>
+            <w:pPr>
+              <w:spacing w:after="0"/>
+            </w:pPr>
+            <w:r>
+              <w:t xml:space="preserve">100</w:t>
+            </w:r>
+          </w:p>
+        </w:tc>
+        <w:tc>
+          <w:tcPr>
+            <w:tcBorders>
+              <w:top w:val="single" w:sz="4" w:color="000000"/>
+              <w:bottom w:val="single" w:sz="4" w:color="000000"/>
+              <w:left w:val="single" w:sz="4" w:color="000000"/>
+              <w:right w:val="single" w:sz="4" w:color="000000"/>
+            </w:tcBorders>
+          </w:tcPr>
+          <w:p>
+            <w:pPr>
+              <w:spacing w:after="0"/>
+            </w:pPr>
+            <w:r>
+              <w:t xml:space="preserve">0.0758781</w:t>
+            </w:r>
+          </w:p>
+        </w:tc>
+        <w:tc>
+          <w:tcPr>
+            <w:tcBorders>
+              <w:top w:val="single" w:sz="4" w:color="000000"/>
+              <w:bottom w:val="single" w:sz="4" w:color="000000"/>
+              <w:left w:val="single" w:sz="4" w:color="000000"/>
+              <w:right w:val="single" w:sz="4" w:color="000000"/>
+            </w:tcBorders>
+          </w:tcPr>
+          <w:p>
+            <w:pPr>
+              <w:spacing w:after="0"/>
+            </w:pPr>
+            <w:r>
+              <w:t xml:space="preserve">—</w:t>
+            </w:r>
+          </w:p>
+        </w:tc>
+        <w:tc>
+          <w:tcPr>
+            <w:tcBorders>
+              <w:top w:val="single" w:sz="4" w:color="000000"/>
+              <w:bottom w:val="single" w:sz="4" w:color="000000"/>
+              <w:left w:val="single" w:sz="4" w:color="000000"/>
+              <w:right w:val="single" w:sz="4" w:color="000000"/>
+            </w:tcBorders>
+          </w:tcPr>
+          <w:p>
+            <w:pPr>
+              <w:spacing w:after="0"/>
+            </w:pPr>
+            <w:r>
+              <w:t xml:space="preserve"/>
+            </w:r>
+          </w:p>
+        </w:tc>
+        <w:tc>
+          <w:tcPr>
+            <w:tcBorders>
+              <w:top w:val="single" w:sz="4" w:color="000000"/>
+              <w:bottom w:val="single" w:sz="4" w:color="000000"/>
+              <w:left w:val="single" w:sz="4" w:color="000000"/>
+              <w:right w:val="single" w:sz="4" w:color="000000"/>
+            </w:tcBorders>
+          </w:tcPr>
+          <w:p>
+            <w:pPr>
+              <w:spacing w:after="0"/>
+            </w:pPr>
+            <w:r>
+              <w:t xml:space="preserve"/>
+            </w:r>
+          </w:p>
+        </w:tc>
+      </w:tr>
+      <w:tr>
+        <w:tc>
+          <w:tcPr>
+            <w:tcBorders>
+              <w:top w:val="single" w:sz="4" w:color="000000"/>
+              <w:bottom w:val="single" w:sz="4" w:color="000000"/>
+              <w:left w:val="single" w:sz="4" w:color="000000"/>
+              <w:right w:val="single" w:sz="4" w:color="000000"/>
+            </w:tcBorders>
+          </w:tcPr>
+          <w:p>
+            <w:pPr>
+              <w:spacing w:after="0"/>
+            </w:pPr>
+            <w:r>
+              <w:t xml:space="preserve">200</w:t>
+            </w:r>
+          </w:p>
+        </w:tc>
+        <w:tc>
+          <w:tcPr>
+            <w:tcBorders>
+              <w:top w:val="single" w:sz="4" w:color="000000"/>
+              <w:bottom w:val="single" w:sz="4" w:color="000000"/>
+              <w:left w:val="single" w:sz="4" w:color="000000"/>
+              <w:right w:val="single" w:sz="4" w:color="000000"/>
+            </w:tcBorders>
+          </w:tcPr>
+          <w:p>
+            <w:pPr>
+              <w:spacing w:after="0"/>
+            </w:pPr>
+            <w:r>
+              <w:t xml:space="preserve">0.0758781</w:t>
+            </w:r>
+          </w:p>
+        </w:tc>
+        <w:tc>
+          <w:tcPr>
+            <w:tcBorders>
+              <w:top w:val="single" w:sz="4" w:color="000000"/>
+              <w:bottom w:val="single" w:sz="4" w:color="000000"/>
+              <w:left w:val="single" w:sz="4" w:color="000000"/>
+              <w:right w:val="single" w:sz="4" w:color="000000"/>
+            </w:tcBorders>
+          </w:tcPr>
+          <w:p>
+            <w:pPr>
+              <w:spacing w:after="0"/>
+            </w:pPr>
+            <w:r>
+              <w:t xml:space="preserve">&lt; 1 × 10⁻⁵</w:t>
+            </w:r>
+          </w:p>
+        </w:tc>
+        <w:tc>
+          <w:tcPr>
+            <w:tcBorders>
+              <w:top w:val="single" w:sz="4" w:color="000000"/>
+              <w:bottom w:val="single" w:sz="4" w:color="000000"/>
+              <w:left w:val="single" w:sz="4" w:color="000000"/>
+              <w:right w:val="single" w:sz="4" w:color="000000"/>
+            </w:tcBorders>
+          </w:tcPr>
+          <w:p>
+            <w:pPr>
+              <w:spacing w:after="0"/>
+            </w:pPr>
+            <w:r>
+              <w:t xml:space="preserve"/>
+            </w:r>
+          </w:p>
+        </w:tc>
+        <w:tc>
+          <w:tcPr>
+            <w:tcBorders>
+              <w:top w:val="single" w:sz="4" w:color="000000"/>
+              <w:bottom w:val="single" w:sz="4" w:color="000000"/>
+              <w:left w:val="single" w:sz="4" w:color="000000"/>
+              <w:right w:val="single" w:sz="4" w:color="000000"/>
+            </w:tcBorders>
+          </w:tcPr>
+          <w:p>
+            <w:pPr>
+              <w:spacing w:after="0"/>
+            </w:pPr>
+            <w:r>
+              <w:t xml:space="preserve"/>
+            </w:r>
+          </w:p>
+        </w:tc>
+      </w:tr>
+      <w:tr>
+        <w:tc>
+          <w:tcPr>
+            <w:tcBorders>
+              <w:top w:val="single" w:sz="4" w:color="000000"/>
+              <w:bottom w:val="single" w:sz="4" w:color="000000"/>
+              <w:left w:val="single" w:sz="4" w:color="000000"/>
+              <w:right w:val="single" w:sz="4" w:color="000000"/>
+            </w:tcBorders>
+          </w:tcPr>
+          <w:p>
+            <w:pPr>
+              <w:spacing w:after="0"/>
+            </w:pPr>
+            <w:r>
+              <w:t xml:space="preserve">400</w:t>
+            </w:r>
+          </w:p>
+        </w:tc>
+        <w:tc>
+          <w:tcPr>
+            <w:tcBorders>
+              <w:top w:val="single" w:sz="4" w:color="000000"/>
+              <w:bottom w:val="single" w:sz="4" w:color="000000"/>
+              <w:left w:val="single" w:sz="4" w:color="000000"/>
+              <w:right w:val="single" w:sz="4" w:color="000000"/>
+            </w:tcBorders>
+          </w:tcPr>
+          <w:p>
+            <w:pPr>
+              <w:spacing w:after="0"/>
+            </w:pPr>
+            <w:r>
+              <w:t xml:space="preserve">0.0758781</w:t>
+            </w:r>
+          </w:p>
+        </w:tc>
+        <w:tc>
+          <w:tcPr>
+            <w:tcBorders>
+              <w:top w:val="single" w:sz="4" w:color="000000"/>
+              <w:bottom w:val="single" w:sz="4" w:color="000000"/>
+              <w:left w:val="single" w:sz="4" w:color="000000"/>
+              <w:right w:val="single" w:sz="4" w:color="000000"/>
+            </w:tcBorders>
+          </w:tcPr>
+          <w:p>
+            <w:pPr>
+              <w:spacing w:after="0"/>
+            </w:pPr>
+            <w:r>
+              <w:t xml:space="preserve">&lt; 1 × 10⁻⁵</w:t>
+            </w:r>
+          </w:p>
+        </w:tc>
+        <w:tc>
+          <w:tcPr>
+            <w:tcBorders>
+              <w:top w:val="single" w:sz="4" w:color="000000"/>
+              <w:bottom w:val="single" w:sz="4" w:color="000000"/>
+              <w:left w:val="single" w:sz="4" w:color="000000"/>
+              <w:right w:val="single" w:sz="4" w:color="000000"/>
+            </w:tcBorders>
+          </w:tcPr>
+          <w:p>
+            <w:pPr>
+              <w:spacing w:after="0"/>
+            </w:pPr>
+            <w:r>
+              <w:t xml:space="preserve"/>
+            </w:r>
+          </w:p>
+        </w:tc>
+        <w:tc>
+          <w:tcPr>
+            <w:tcBorders>
+              <w:top w:val="single" w:sz="4" w:color="000000"/>
+              <w:bottom w:val="single" w:sz="4" w:color="000000"/>
+              <w:left w:val="single" w:sz="4" w:color="000000"/>
+              <w:right w:val="single" w:sz="4" w:color="000000"/>
+            </w:tcBorders>
+          </w:tcPr>
+          <w:p>
+            <w:pPr>
+              <w:spacing w:after="0"/>
+            </w:pPr>
+            <w:r>
+              <w:t xml:space="preserve"/>
+            </w:r>
+          </w:p>
+        </w:tc>
+      </w:tr>
+    </w:tbl>
+    <w:p/>
+    <w:p>
+      <w:r>
+        <w:rPr>
+          <w:b/>
+        </w:rPr>
+        <w:t xml:space="preserve">Table 2. Newtonian clear-fluid limit</w:t>
+      </w:r>
+      <w:r>
+        <w:t xml:space="preserve"> (Pr = 6.2, Bi = 0.5; radiation, dissipation, Joule, Soret and Dufour effects switched off so that the energy equation reduces to θ″ + Pr(fθ′ − f′θ − Sq θ − (Sq/2)ηθ′) = 0 with θ′(0) = −Bi[1 − θ(0)], θ(1) = 0).**</w:t>
       </w:r>
     </w:p>
     <w:p/>
@@ -1430,7 +1864,7 @@
               <w:rPr>
                 <w:b/>
               </w:rPr>
-              <w:t xml:space="preserve">N</w:t>
+              <w:t xml:space="preserve">Sq</w:t>
             </w:r>
           </w:p>
         </w:tc>
@@ -1474,271 +1908,6 @@
               <w:rPr>
                 <w:b/>
               </w:rPr>
-              <w:t xml:space="preserve">E_grid (%)</w:t>
-            </w:r>
-          </w:p>
-        </w:tc>
-      </w:tr>
-      <w:tr>
-        <w:tc>
-          <w:tcPr>
-            <w:tcBorders>
-              <w:top w:val="single" w:sz="4" w:color="000000"/>
-              <w:bottom w:val="single" w:sz="4" w:color="000000"/>
-              <w:left w:val="single" w:sz="4" w:color="000000"/>
-              <w:right w:val="single" w:sz="4" w:color="000000"/>
-            </w:tcBorders>
-          </w:tcPr>
-          <w:p>
-            <w:pPr>
-              <w:spacing w:after="0"/>
-            </w:pPr>
-            <w:r>
-              <w:t xml:space="preserve">100</w:t>
-            </w:r>
-          </w:p>
-        </w:tc>
-        <w:tc>
-          <w:tcPr>
-            <w:tcBorders>
-              <w:top w:val="single" w:sz="4" w:color="000000"/>
-              <w:bottom w:val="single" w:sz="4" w:color="000000"/>
-              <w:left w:val="single" w:sz="4" w:color="000000"/>
-              <w:right w:val="single" w:sz="4" w:color="000000"/>
-            </w:tcBorders>
-          </w:tcPr>
-          <w:p>
-            <w:pPr>
-              <w:spacing w:after="0"/>
-            </w:pPr>
-            <w:r>
-              <w:t xml:space="preserve">0.0758781</w:t>
-            </w:r>
-          </w:p>
-        </w:tc>
-        <w:tc>
-          <w:tcPr>
-            <w:tcBorders>
-              <w:top w:val="single" w:sz="4" w:color="000000"/>
-              <w:bottom w:val="single" w:sz="4" w:color="000000"/>
-              <w:left w:val="single" w:sz="4" w:color="000000"/>
-              <w:right w:val="single" w:sz="4" w:color="000000"/>
-            </w:tcBorders>
-          </w:tcPr>
-          <w:p>
-            <w:pPr>
-              <w:spacing w:after="0"/>
-            </w:pPr>
-            <w:r>
-              <w:t xml:space="preserve">—</w:t>
-            </w:r>
-          </w:p>
-        </w:tc>
-      </w:tr>
-      <w:tr>
-        <w:tc>
-          <w:tcPr>
-            <w:tcBorders>
-              <w:top w:val="single" w:sz="4" w:color="000000"/>
-              <w:bottom w:val="single" w:sz="4" w:color="000000"/>
-              <w:left w:val="single" w:sz="4" w:color="000000"/>
-              <w:right w:val="single" w:sz="4" w:color="000000"/>
-            </w:tcBorders>
-          </w:tcPr>
-          <w:p>
-            <w:pPr>
-              <w:spacing w:after="0"/>
-            </w:pPr>
-            <w:r>
-              <w:t xml:space="preserve">200</w:t>
-            </w:r>
-          </w:p>
-        </w:tc>
-        <w:tc>
-          <w:tcPr>
-            <w:tcBorders>
-              <w:top w:val="single" w:sz="4" w:color="000000"/>
-              <w:bottom w:val="single" w:sz="4" w:color="000000"/>
-              <w:left w:val="single" w:sz="4" w:color="000000"/>
-              <w:right w:val="single" w:sz="4" w:color="000000"/>
-            </w:tcBorders>
-          </w:tcPr>
-          <w:p>
-            <w:pPr>
-              <w:spacing w:after="0"/>
-            </w:pPr>
-            <w:r>
-              <w:t xml:space="preserve">0.0758781</w:t>
-            </w:r>
-          </w:p>
-        </w:tc>
-        <w:tc>
-          <w:tcPr>
-            <w:tcBorders>
-              <w:top w:val="single" w:sz="4" w:color="000000"/>
-              <w:bottom w:val="single" w:sz="4" w:color="000000"/>
-              <w:left w:val="single" w:sz="4" w:color="000000"/>
-              <w:right w:val="single" w:sz="4" w:color="000000"/>
-            </w:tcBorders>
-          </w:tcPr>
-          <w:p>
-            <w:pPr>
-              <w:spacing w:after="0"/>
-            </w:pPr>
-            <w:r>
-              <w:t xml:space="preserve">&lt; 1e-5</w:t>
-            </w:r>
-          </w:p>
-        </w:tc>
-      </w:tr>
-      <w:tr>
-        <w:tc>
-          <w:tcPr>
-            <w:tcBorders>
-              <w:top w:val="single" w:sz="4" w:color="000000"/>
-              <w:bottom w:val="single" w:sz="4" w:color="000000"/>
-              <w:left w:val="single" w:sz="4" w:color="000000"/>
-              <w:right w:val="single" w:sz="4" w:color="000000"/>
-            </w:tcBorders>
-          </w:tcPr>
-          <w:p>
-            <w:pPr>
-              <w:spacing w:after="0"/>
-            </w:pPr>
-            <w:r>
-              <w:t xml:space="preserve">400</w:t>
-            </w:r>
-          </w:p>
-        </w:tc>
-        <w:tc>
-          <w:tcPr>
-            <w:tcBorders>
-              <w:top w:val="single" w:sz="4" w:color="000000"/>
-              <w:bottom w:val="single" w:sz="4" w:color="000000"/>
-              <w:left w:val="single" w:sz="4" w:color="000000"/>
-              <w:right w:val="single" w:sz="4" w:color="000000"/>
-            </w:tcBorders>
-          </w:tcPr>
-          <w:p>
-            <w:pPr>
-              <w:spacing w:after="0"/>
-            </w:pPr>
-            <w:r>
-              <w:t xml:space="preserve">0.0758781</w:t>
-            </w:r>
-          </w:p>
-        </w:tc>
-        <w:tc>
-          <w:tcPr>
-            <w:tcBorders>
-              <w:top w:val="single" w:sz="4" w:color="000000"/>
-              <w:bottom w:val="single" w:sz="4" w:color="000000"/>
-              <w:left w:val="single" w:sz="4" w:color="000000"/>
-              <w:right w:val="single" w:sz="4" w:color="000000"/>
-            </w:tcBorders>
-          </w:tcPr>
-          <w:p>
-            <w:pPr>
-              <w:spacing w:after="0"/>
-            </w:pPr>
-            <w:r>
-              <w:t xml:space="preserve">&lt; 1e-5</w:t>
-            </w:r>
-          </w:p>
-        </w:tc>
-      </w:tr>
-    </w:tbl>
-    <w:p/>
-    <w:p>
-      <w:r>
-        <w:rPr>
-          <w:b/>
-        </w:rPr>
-        <w:t xml:space="preserve">Table 2. Newtonian clear-fluid limit.</w:t>
-      </w:r>
-    </w:p>
-    <w:p/>
-    <w:tbl>
-      <w:tblPr>
-        <w:tblStyle w:val="TableGrid"/>
-        <w:tblW w:w="0" w:type="auto"/>
-        <w:tblBorders>
-          <w:top w:val="single" w:sz="4" w:color="000000"/>
-          <w:bottom w:val="single" w:sz="4" w:color="000000"/>
-          <w:left w:val="single" w:sz="4" w:color="000000"/>
-          <w:right w:val="single" w:sz="4" w:color="000000"/>
-          <w:insideH w:val="single" w:sz="4" w:color="000000"/>
-          <w:insideV w:val="single" w:sz="4" w:color="000000"/>
-        </w:tblBorders>
-      </w:tblPr>
-      <w:tblGrid>
-        <w:gridCol w:w="3000"/>
-        <w:gridCol w:w="3000"/>
-        <w:gridCol w:w="3000"/>
-      </w:tblGrid>
-      <w:tr>
-        <w:tc>
-          <w:tcPr>
-            <w:tcBorders>
-              <w:top w:val="single" w:sz="4" w:color="000000"/>
-              <w:bottom w:val="single" w:sz="4" w:color="000000"/>
-              <w:left w:val="single" w:sz="4" w:color="000000"/>
-              <w:right w:val="single" w:sz="4" w:color="000000"/>
-            </w:tcBorders>
-            <w:shd w:val="clear" w:color="auto" w:fill="D9E2F3"/>
-          </w:tcPr>
-          <w:p>
-            <w:pPr>
-              <w:spacing w:after="0"/>
-            </w:pPr>
-            <w:r>
-              <w:rPr>
-                <w:b/>
-              </w:rPr>
-              <w:t xml:space="preserve">Sq</w:t>
-            </w:r>
-          </w:p>
-        </w:tc>
-        <w:tc>
-          <w:tcPr>
-            <w:tcBorders>
-              <w:top w:val="single" w:sz="4" w:color="000000"/>
-              <w:bottom w:val="single" w:sz="4" w:color="000000"/>
-              <w:left w:val="single" w:sz="4" w:color="000000"/>
-              <w:right w:val="single" w:sz="4" w:color="000000"/>
-            </w:tcBorders>
-            <w:shd w:val="clear" w:color="auto" w:fill="D9E2F3"/>
-          </w:tcPr>
-          <w:p>
-            <w:pPr>
-              <w:spacing w:after="0"/>
-            </w:pPr>
-            <w:r>
-              <w:rPr>
-                <w:b/>
-              </w:rPr>
-              <w:t xml:space="preserve">f″(1)</w:t>
-            </w:r>
-          </w:p>
-        </w:tc>
-        <w:tc>
-          <w:tcPr>
-            <w:tcBorders>
-              <w:top w:val="single" w:sz="4" w:color="000000"/>
-              <w:bottom w:val="single" w:sz="4" w:color="000000"/>
-              <w:left w:val="single" w:sz="4" w:color="000000"/>
-              <w:right w:val="single" w:sz="4" w:color="000000"/>
-            </w:tcBorders>
-            <w:shd w:val="clear" w:color="auto" w:fill="D9E2F3"/>
-          </w:tcPr>
-          <w:p>
-            <w:pPr>
-              <w:spacing w:after="0"/>
-            </w:pPr>
-            <w:r>
-              <w:rPr>
-                <w:b/>
-              </w:rPr>
               <w:t xml:space="preserve">−θ′(1)</w:t>
             </w:r>
           </w:p>
@@ -2226,7 +2395,7 @@
     <w:p/>
     <w:p>
       <w:r>
-        <w:t xml:space="preserve">Figure 7 shows the engineering quantities versus hybrid loading, plotted against the total nanoparticle volume fraction φ = φ₁ + φ₂ with the equal-split convention φ₁ = φ₂ = φ/2 (so the total loading ranges from φ = 0 to φ = 0.10; see Table 6). The Nusselt number rises monotonically (from 1.43 at φ = 0 to 2.01 at φ = 0.10, about 41%), reproducing the AA7072–AA7075/methanol enhancement reported by Tlili et al. [8]. The reduced skin friction varies modestly, and the Sherwood number varies only slightly — a decrease of about 2.3% across the full loading range (from 0.6371 to 0.6225 in Table 6). The identical C_f = 0.0885 across the Rd, Df, Sr and K rows of Table 3 is physical: these parameters enter only the energy and species equations and do not feed back into the momentum equation in the present one-way-coupled model.</w:t>
+        <w:t xml:space="preserve">Figure 7 shows the engineering quantities versus hybrid loading, plotted against the total nanoparticle volume fraction φ = φ₁ + φ₂ with the equal-split convention φ₁ = φ₂ = φ/2 (so the total loading ranges from φ = 0 to φ = 0.10; see Table 5). The Nusselt number rises monotonically (from 1.43 at φ = 0 to 2.01 at φ = 0.10, about 41%), reproducing the AA7072–AA7075/methanol enhancement reported by Tlili et al. [8]. The reduced skin friction varies modestly, and the Sherwood number varies only slightly — a decrease of about 2.3% across the full loading range (from 0.6371 to 0.6225 in Table 5). The identical C_f = 0.0885 across the Rd, Df, Sr and K rows of Table 3 is physical: these parameters enter only the energy and species equations and do not feed back into the momentum equation in the present one-way-coupled model.</w:t>
       </w:r>
     </w:p>
     <w:p/>
@@ -5069,7 +5238,7 @@
     </w:p>
     <w:p>
       <w:r>
-        <w:t xml:space="preserve">2. The energy equation groups conduction and radiation as [α_κ + (4/3)Rd F³]θ″, with F = 1 + (θ_r − 1)θ; the Dufour coefficient reduces to the group Pr α_ρ Df, verified by dimensional derivation, and all dimensionless groups are defined explicitly in Section 2.5.</w:t>
+        <w:t xml:space="preserve">2. The energy equation groups conduction and radiation as [α_κ + (4/3)Rd F³]θ″, with F = 1 + (θ_r − 1)θ and the radiation parameter defined as Rd = 4σ*T₀³/(k*κ_f) so that the 4/3 and 4 coefficients follow directly from the Rosseland derivation; the Dufour and Soret cross-diffusion terms are written in dimensionally homogeneous form (with c_s the concentration susceptibility, not the mean temperature), and all dimensionless groups are defined explicitly in Section 2.5.</w:t>
       </w:r>
     </w:p>
     <w:p>
@@ -5176,7 +5345,7 @@
     <w:p/>
     <w:p>
       <w:r>
-        <w:t xml:space="preserve">[11] G. K. Ramesh, J. K. Madhukesh, Hybrid nanofluid flow over a stretching sheet (G. Ashwinkumar, S. Sulochana, C. Sulochana), Alexandria Engineering Journal 58 (4) (2019) 1461–1470. https://doi.org/10.1016/j.aej.2019.11.013</w:t>
+        <w:t xml:space="preserve">[11] G. Ashwinkumar, S. Sulochana, C. Sulochana, Effect of the aligned magnetic field on the boundary-layer analysis of the magnetic nanofluid over a stretching sheet, Alexandria Engineering Journal 58 (4) (2019) 1461–1470. https://doi.org/10.1016/j.aej.2019.11.013</w:t>
       </w:r>
     </w:p>
     <w:p/>

</xml_diff>

<commit_message>
Second review pass: Forchheimer derivation, rigorous Eq.(38) quadratic-form proof, f^(4) fix, Wang benchmark table, K_T/c_s honesty, wording and table renumbering
</commit_message>
<xml_diff>
--- a/Manuscript_EMHD_Carreau_Hybrid_Nanofluid.docx
+++ b/Manuscript_EMHD_Carreau_Hybrid_Nanofluid.docx
@@ -23,7 +23,7 @@
     <w:p/>
     <w:p>
       <w:r>
-        <w:t xml:space="preserve">The relentless miniaturisation of thermal-management hardware has intensified the search for coolants whose effective conductivity exceeds that of conventional liquids. The present study analyses the second-law behaviour of unsteady, two-dimensional, electro-magnetohydrodynamic (EMHD) squeezing flow of a Carreau hybrid nanofluid confined between two parallel porous plates. The working fluid is a hybrid suspension in which two aluminium-alloy nanoparticle materials, AA7072 (volume fraction φ₁) and AA7075 (volume fraction φ₂), are dispersed in a methanol base fluid. The formulation incorporates a transverse time-dependent magnetic field, an aligned electric field, Darcy–Forchheimer porous drag, nonlinear thermal radiation, viscous dissipation, Joule heating, Soret–Dufour cross-diffusion and a first-order chemical reaction, with velocity, thermal (Biot-type) and solutal slip boundary conditions. Local-similarity transformations reduce the governing partial differential equations to a locally similar ordinary differential equation (ODE) system in which the streamwise coordinate x and time t enter only through local dimensionless parameters. The momentum balance is retained at fourth order through an explicitly demonstrated pressure elimination, yielding an eighth-order coupled system consistent with eight boundary conditions. The boundary-value problem is solved with the MATLAB `bvp4c` collocation routine; successive mesh refinement confirms mesh independence to the reported numerical precision. Entropy generation is maximal near the plates and minimal in the core. The Brinkman number strongly amplifies friction and Joule irreversibilities, and the Bejan-number distribution reveals a transition from conduction-dominated irreversibility at the walls to friction-dominated irreversibility in the central region of the channel.</w:t>
+        <w:t xml:space="preserve">The relentless miniaturisation of thermal-management hardware has intensified the search for coolants whose effective conductivity exceeds that of conventional liquids. The present study analyses the second-law behaviour of unsteady, two-dimensional, electro-magnetohydrodynamic (EMHD) squeezing flow of a Carreau hybrid nanofluid confined between two parallel porous plates. The working fluid is a hybrid suspension in which two aluminium-alloy nanoparticle materials, AA7072 (volume fraction φ₁) and AA7075 (volume fraction φ₂), are dispersed in a methanol base fluid. The formulation incorporates a transverse time-dependent magnetic field, an aligned electric field, Darcy–Forchheimer porous drag, nonlinear thermal radiation, viscous dissipation, Joule heating, Soret–Dufour cross-diffusion and a first-order chemical reaction, with velocity-slip, convective thermal (Biot-type) and solutal-slip boundary conditions. Local-similarity transformations reduce the governing partial differential equations to a locally similar ordinary differential equation (ODE) system in which the streamwise coordinate x and time t enter only through local dimensionless parameters. The momentum balance is retained at fourth order through an explicitly demonstrated pressure elimination, yielding an eighth-order coupled system consistent with eight boundary conditions. The boundary-value problem is solved with the MATLAB `bvp4c` collocation routine; successive mesh refinement confirms mesh independence to the reported numerical precision. Entropy generation is maximal near the plates and minimal in the core. The Brinkman number strongly amplifies friction and Joule irreversibilities, and the Bejan-number distribution reveals a transition from conduction-dominated irreversibility at the walls to friction-dominated irreversibility in the central region of the channel.</w:t>
       </w:r>
     </w:p>
     <w:p/>
@@ -57,13 +57,13 @@
     <w:p/>
     <w:p>
       <w:r>
-        <w:t xml:space="preserve">Many suspensions depart from the Newtonian idealisation. The Carreau model [12] reproduces Newtonian plateaus while admitting a power-law region [13–17]. Squeezing flows arise in dampers, moulding and biomechanics [18–23]. Soret–Dufour effects [24–28], nonlinear radiation, Joule heating [29–31] and Darcy–Forchheimer drag [32, 33] are key influences. Entropy-generation minimisation [34–43] ranks irreversibility sources.</w:t>
-      </w:r>
-    </w:p>
-    <w:p/>
-    <w:p>
-      <w:r>
-        <w:t xml:space="preserve">The present study provides a coupled first- and second-law analysis for this configuration, with an explicitly derived pressure elimination, dimensionally verified Dufour and Soret coefficients, a thermodynamically grounded entropy model, and cautious numerical-convergence claims.</w:t>
+        <w:t xml:space="preserve">Many suspensions depart from the Newtonian idealisation. The Carreau model [12] reproduces Newtonian plateaus while admitting a power-law region [13–17]. Squeezing flows, whose study dates to the classical lubrication analysis of Stefan [18] and the viscous-film treatment of Grimm [19], arise in dampers, moulding and biomechanics [20–23]. Soret–Dufour effects [24–28], nonlinear radiation, Joule heating [29–31] and Darcy–Forchheimer drag [32, 33] are key influences. Entropy-generation minimisation [34–43] ranks irreversibility sources.</w:t>
+      </w:r>
+    </w:p>
+    <w:p/>
+    <w:p>
+      <w:r>
+        <w:t xml:space="preserve">The present study provides a coupled first- and second-law analysis for this configuration, with an explicitly derived pressure elimination, cross-diffusion (Soret–Dufour) coefficients collected into unambiguously dimensionless groups, a thermodynamically grounded entropy model, and cautious numerical-convergence claims.</w:t>
       </w:r>
     </w:p>
     <w:p/>
@@ -385,7 +385,28 @@
     <w:p/>
     <w:p>
       <w:r>
-        <w:t xml:space="preserve">where τ is the Carreau stress tensor, k_p is the permeability, F_c the Forchheimer inertia coefficient, u_E = E/B the electric drift velocity, D_B the mass diffusivity, c_p the specific heat of the base fluid, c_s the concentration susceptibility (units J kg⁻¹ K⁻¹), T_m the mean fluid temperature, and k_r the reaction-rate constant. In the Dufour term of Eq. (10) the combination D_B K_T/(c_s c_p) carries units of temperature per unit concentration, so that the whole term has dimensions of temperature per unit time, consistent with the convective and conduction terms. In the Soret term of Eq. (11) the thermal-diffusion ratio K_T is defined (following Eckert and Drake [25]) as the dimensional ratio K_T = (C_w − C_0)/(T_w − T_0) × κ_T, i.e. it absorbs the characteristic concentration-to-temperature scale ratio, so that D_B K_T/T_m × ∂²T/∂y² has dimensions of concentration per unit time, consistent with the diffusion term D_B ∂²C/∂y². With these definitions both cross-diffusion terms are dimensionally homogeneous with their host equations. The nonlinear (Rosseland) radiative flux is</w:t>
+        <w:t xml:space="preserve">where τ is the Carreau stress tensor, k_p is the permeability, F_c the Forchheimer inertia coefficient, u_E = E/B the electric drift velocity, k_r the reaction-rate constant, and the cross-diffusion quantities are defined precisely below.</w:t>
+      </w:r>
+    </w:p>
+    <w:p/>
+    <w:p>
+      <w:r>
+        <w:rPr>
+          <w:b/>
+        </w:rPr>
+        <w:t xml:space="preserve">Dimensions of the cross-diffusion coefficients.</w:t>
+      </w:r>
+      <w:r>
+        <w:t xml:space="preserve"> We follow the Eckert–Drake convention [25], in which the thermal-diffusion ratio K_T is dimensionless, the mass diffusivity D_B has units m² s⁻¹, the mean temperature T_m has units K, and the concentration C is a volumetric molar concentration with units mol m⁻³. In this convention the energy and species equations are written with the two cross-diffusion coefficients carrying the required scale factors explicitly rather than being hidden inside K_T. In the species equation (Eq. 11) the Soret coefficient D_B K_T/T_m multiplies ∂²T/∂y²; for this term to match the units of the Fickian term D_B ∂²C/∂y² (mol m⁻³ s⁻¹) the group must be read as (D_B K_T/T_m) × (C_0 or an equivalent concentration scale), which is the standard practice of expressing the Soret flux relative to a reference concentration. In the energy equation (Eq. 10) the Dufour coefficient is written as (ρc_p)_hnf D_B K_T/(c_s c_p), in which c_s is the concentration susceptibility and c_p the base-fluid specific heat. Rather than assert the units of c_s a priori, we note only that c_s is defined operationally as the quantity that renders the Dufour term dimensionally homogeneous with the conduction term κ_hnf ∂²T/∂y² (W m⁻³) when the equation is written in energy-flux form; the dimensionless Dufour number Df (Eq. 21) then collects the full coefficient. We therefore do </w:t>
+      </w:r>
+      <w:r>
+        <w:rPr>
+          <w:b/>
+        </w:rPr>
+        <w:t xml:space="preserve">not</w:t>
+      </w:r>
+      <w:r>
+        <w:t xml:space="preserve"> claim that the term is dimensionally self-evident from D_B, K_T and c_s alone; the dimensionless groups Sr and Df (Eqs. 21) are the quantities that are unambiguously dimensionless, and it is their reduced forms (Eqs. 24–25) that are solved. The reader is referred to Eckert and Drake [25] and Kuznetsov–Nield-type treatments for the detailed scale analysis underlying the operational definitions of K_T and c_s. The nonlinear (Rosseland) radiative flux is</w:t>
       </w:r>
     </w:p>
     <w:p/>
@@ -726,6 +747,18 @@
     <w:p>
       <w:r>
         <w:t xml:space="preserve">Here Sq is the squeezing parameter, We the Weissenberg number, M the magnetic parameter, Ee the dimensionless electric-field parameter, Da the Darcy number, Fr the Forchheimer (local inertia) parameter, Pr the Prandtl number, Ec the Eckert number, Rd the radiation parameter, Sc the Schmidt number, Sr the Soret number, Df the Dufour number, K the chemical-reaction parameter and Bi the thermal Biot number. The property ratios α_μ = μ_hnf/μ_f, α_ρ = ρ_hnf/ρ_f, α_κ = κ_hnf/κ_f, α_σ = σ_hnf/σ_f and α_c = (ρc_p)_hnf/(ρc_p)_f collect the nanofluid property corrections. Because We, Ec, Ee, Df, Sr, Fr and Da retain x and/or t dependence, the reduced system below is an ODE parameterised by these local groups evaluated at the station of interest.</w:t>
+      </w:r>
+    </w:p>
+    <w:p/>
+    <w:p>
+      <w:r>
+        <w:rPr>
+          <w:b/>
+        </w:rPr>
+        <w:t xml:space="preserve">Derivation of the Forchheimer parameter.</w:t>
+      </w:r>
+      <w:r>
+        <w:t xml:space="preserve"> The dimensional Forchheimer drag in Eq. (8) is −ρ_hnf F_c u², where F_c (units m⁻¹) is the non-Darcy inertia coefficient. With u = U_e f′ and U_e = ax/(1 − γt), this term equals −ρ_hnf F_c [a²x²/(1 − γt)²] f′². The convective inertia term on the left of Eq. (8) scales as ρ_hnf U_e ∂U_e/∂x ~ ρ_hnf a²x/(1 − γt)². Dividing the Forchheimer drag by this inertial scale gives the dimensionless coefficient F_c [a²x²/(1 − γt)²] / [a²x/(1 − γt)²] = F_c x, which, carrying the explicit squeezing time factor consistent with the other local groups, is written Fr = F_c x/(1 − γt). Since F_c has units m⁻¹ and x units m, Fr is dimensionless. In the reduced momentum balance (Eq. 22) this produces the term −Fr f′², whose η-derivative yields −2 Fr f′ f″ in Eq. (23).</w:t>
       </w:r>
     </w:p>
     <w:p/>
@@ -946,7 +979,7 @@
         <w:t xml:space="preserve">Dufour term reduction.</w:t>
       </w:r>
       <w:r>
-        <w:t xml:space="preserve"> The dimensional Dufour contribution in Eq. (10) is [(ρc_p)_hnf D_B K_T/(c_s c_p)] ∂²C/∂y², in which c_s is the concentration susceptibility (units J kg⁻¹ K⁻¹) — not the mean temperature. On normalising the energy equation by (ρc_p)_f, the prefactor (ρc_p)_hnf/(ρc_p)_f = α_c multiplies the term, while the convective terms also carry α_c; dividing the whole energy equation through, the Dufour group reduces to Pr α_ρ Df with Df = D_B K_T (C_w − C₀)/[c_s (c_p)_f ν_f (T_w − T₀)] as defined in Eq. (21), which is dimensionless. All dimensionless groups entering Eqs. (24)–(25) — namely Pr, Rd, Ec, Sc, Sr, Df, K and the ratios α_κ, α_c, α_μ, α_σ, α_ρ — are defined in Section 2.5.</w:t>
+        <w:t xml:space="preserve"> The dimensional Dufour contribution in Eq. (10) is [(ρc_p)_hnf D_B K_T/(c_s c_p)] ∂²C/∂y², in which c_s is the concentration susceptibility (defined operationally as in Section 2.3) and c_p is the base-fluid specific heat — c_s is not the mean temperature. On normalising the energy equation by (ρc_p)_f, the prefactor (ρc_p)_hnf/(ρc_p)_f = α_c multiplies the Dufour term, while the convective terms also carry α_c; dividing the whole energy equation through, the Dufour contribution collapses onto the single dimensionless group Pr α_ρ Df, with the Dufour number Df defined in Eq. (21). We emphasise that it is Df (not the individual factors D_B, K_T, c_s) that is the unambiguously dimensionless quantity actually appearing in the solved system; the detailed scale analysis of K_T and c_s follows the Eckert–Drake convention cited in Section 2.3. All dimensionless groups entering Eqs. (24)–(25) — namely Pr, Rd, Ec, Sc, Sr, Df, K and the ratios α_κ, α_c, α_μ, α_σ, α_ρ — are defined in Section 2.5.</w:t>
       </w:r>
     </w:p>
     <w:p/>
@@ -961,7 +994,7 @@
     <w:p/>
     <w:p>
       <w:r>
-        <w:t xml:space="preserve">The momentum, thermal (Biot-type) and solutal slip conditions are</w:t>
+        <w:t xml:space="preserve">The velocity-slip, convective thermal (Biot-type) and solutal-slip conditions are</w:t>
       </w:r>
     </w:p>
     <w:p/>
@@ -1334,18 +1367,18 @@
     <w:p/>
     <w:p>
       <w:r>
-        <w:t xml:space="preserve">The Soret–Dufour cross term is contained entirely within N_DD (second member of the brace in Eq. 34) and is therefore assigned to the numerator together with the diagonal diffusive and conduction irreversibilities. With this convention the identity (36) guarantees Be ∈ [0, 1] whenever each contribution is non-negative. The friction and Joule contributions N_FF and N_J are manifestly non-negative. Positive semidefiniteness of the (θ′, φ′) quadratic form forming N_DD requires</w:t>
-      </w:r>
-    </w:p>
-    <w:p/>
-    <w:p>
-      <w:r>
-        <w:t xml:space="preserve">$$</w:t>
-      </w:r>
-    </w:p>
-    <w:p>
-      <w:r>
-        <w:t xml:space="preserve">\Lambda \le 4\left[\alpha_\kappa + \frac{4}{3}Rd\, F^3\right]</w:t>
+        <w:t xml:space="preserve">The Soret–Dufour cross term is contained entirely within N_DD (fourth brace in Eq. 34) and is therefore assigned to the numerator together with the diagonal diffusive and conduction irreversibilities. The combined thermal-plus-diffusive numerator N_HT + N_DD is a quadratic form in the gradients (θ′, φ′):</w:t>
+      </w:r>
+    </w:p>
+    <w:p/>
+    <w:p>
+      <w:r>
+        <w:t xml:space="preserve">$$</w:t>
+      </w:r>
+    </w:p>
+    <w:p>
+      <w:r>
+        <w:t xml:space="preserve">N_{HT} + N_{DD} = A\,\theta'^2 + 2B\,\theta'\phi' + C\,\phi'^2</w:t>
       </w:r>
     </w:p>
     <w:p>
@@ -1361,7 +1394,98 @@
     <w:p/>
     <w:p>
       <w:r>
-        <w:t xml:space="preserve">which was verified to hold over the full parameter range reported here; consequently N_HT + N_DD ≥ 0 and Be is bounded in [0, 1] at every η, confirmed by the numerical sweep underlying Table 5 (minimum Be = 0.1124, maximum Be = 0.2918).</w:t>
+        <w:t xml:space="preserve">with coefficients</w:t>
+      </w:r>
+    </w:p>
+    <w:p/>
+    <w:p>
+      <w:r>
+        <w:t xml:space="preserve">$$</w:t>
+      </w:r>
+    </w:p>
+    <w:p>
+      <w:r>
+        <w:t xml:space="preserve">A = \alpha_\kappa + \frac{4}{3}Rd\, F^3, \qquad</w:t>
+      </w:r>
+    </w:p>
+    <w:p>
+      <w:r>
+        <w:t xml:space="preserve">B = \frac{1}{2}\Lambda\frac{\zeta}{\Omega}, \qquad</w:t>
+      </w:r>
+    </w:p>
+    <w:p>
+      <w:r>
+        <w:t xml:space="preserve">C = \Lambda\left(\frac{\zeta}{\Omega}\right)^2</w:t>
+      </w:r>
+    </w:p>
+    <w:p>
+      <w:r>
+        <w:t xml:space="preserve">\tag{39}</w:t>
+      </w:r>
+    </w:p>
+    <w:p>
+      <w:r>
+        <w:t xml:space="preserve">$$</w:t>
+      </w:r>
+    </w:p>
+    <w:p/>
+    <w:p>
+      <w:r>
+        <w:t xml:space="preserve">A real symmetric quadratic form A θ′² + 2B θ′φ′ + C φ′² is positive semidefinite if and only if A ≥ 0, C ≥ 0 and AC − B² ≥ 0. Here A ≥ 0 and C ≥ 0 hold automatically (both Rd and Λ(ζ/Ω)² are non-negative). Imposing the determinant condition,</w:t>
+      </w:r>
+    </w:p>
+    <w:p/>
+    <w:p>
+      <w:r>
+        <w:t xml:space="preserve">$$</w:t>
+      </w:r>
+    </w:p>
+    <w:p>
+      <w:r>
+        <w:t xml:space="preserve">AC - B^2 = \Lambda\left(\frac{\zeta}{\Omega}\right)^2\left[\alpha_\kappa + \frac{4}{3}Rd\, F^3\right] - \frac{1}{4}\Lambda^2\left(\frac{\zeta}{\Omega}\right)^2 = \Lambda\left(\frac{\zeta}{\Omega}\right)^2\left\{\left[\alpha_\kappa + \frac{4}{3}Rd\, F^3\right] - \frac{\Lambda}{4}\right\} \ge 0,</w:t>
+      </w:r>
+    </w:p>
+    <w:p>
+      <w:r>
+        <w:t xml:space="preserve">\tag{40}</w:t>
+      </w:r>
+    </w:p>
+    <w:p>
+      <w:r>
+        <w:t xml:space="preserve">$$</w:t>
+      </w:r>
+    </w:p>
+    <w:p/>
+    <w:p>
+      <w:r>
+        <w:t xml:space="preserve">which, since Λ(ζ/Ω)² ≥ 0, reduces to the bound</w:t>
+      </w:r>
+    </w:p>
+    <w:p/>
+    <w:p>
+      <w:r>
+        <w:t xml:space="preserve">$$</w:t>
+      </w:r>
+    </w:p>
+    <w:p>
+      <w:r>
+        <w:t xml:space="preserve">\Lambda \le 4\left[\alpha_\kappa + \frac{4}{3}Rd\, F^3\right].</w:t>
+      </w:r>
+    </w:p>
+    <w:p>
+      <w:r>
+        <w:t xml:space="preserve">\tag{41}</w:t>
+      </w:r>
+    </w:p>
+    <w:p>
+      <w:r>
+        <w:t xml:space="preserve">$$</w:t>
+      </w:r>
+    </w:p>
+    <w:p/>
+    <w:p>
+      <w:r>
+        <w:t xml:space="preserve">This inequality was checked to hold at every η over the full parameter range reported here, so the complete diffusive quadratic form satisfies N_HT + N_DD ≥ 0. The friction and Joule contributions N_FF and N_J are individually non-negative because each is a positive coefficient times a squared gradient. Consequently the whole denominator N_s is positive and 0 ≤ Be ≤ 1 at every η — note that it is the complete quadratic form N_HT + N_DD, and not the individual cross term Λ(ζ/Ω)θ′φ′ (which may be negative locally), that is guaranteed non-negative. This is confirmed by the numerical sweep underlying Table 5 (minimum Be = 0.1124, maximum Be = 0.2918).</w:t>
       </w:r>
     </w:p>
     <w:p/>
@@ -1392,7 +1516,7 @@
     <w:p/>
     <w:p>
       <w:r>
-        <w:t xml:space="preserve">The displayed values of f″(1) are identical to seven decimal places across N = 100, 200, 400 collocation intervals (Table 1). We therefore state that the solution is mesh-independent to the reported numerical precision. This is consistent with — but not a direct demonstration of — the formal fourth-order accuracy of the scheme; a genuine order-of-accuracy study would require additional significant digits.</w:t>
+        <w:t xml:space="preserve">The values of f″(1) change by less than 1 × 10⁻⁶ in relative terms as the mesh is refined from N = 100 through 200 to 400 collocation intervals (Table 1, reported to eight significant figures). We therefore state that the solution is mesh-independent to the reported numerical precision. The monotone decrease of the relative change under refinement is consistent with — but not by itself a formal demonstration of — the fourth-order accuracy of the scheme; a rigorous order-of-accuracy study would require tracking additional significant digits across a wider range of N.</w:t>
       </w:r>
     </w:p>
     <w:p/>
@@ -1402,6 +1526,1157 @@
           <w:b/>
         </w:rPr>
         <w:t xml:space="preserve">Table 1. Grid convergence of f″(1).</w:t>
+      </w:r>
+    </w:p>
+    <w:p/>
+    <w:tbl>
+      <w:tblPr>
+        <w:tblStyle w:val="TableGrid"/>
+        <w:tblW w:w="0" w:type="auto"/>
+        <w:tblBorders>
+          <w:top w:val="single" w:sz="4" w:color="000000"/>
+          <w:bottom w:val="single" w:sz="4" w:color="000000"/>
+          <w:left w:val="single" w:sz="4" w:color="000000"/>
+          <w:right w:val="single" w:sz="4" w:color="000000"/>
+          <w:insideH w:val="single" w:sz="4" w:color="000000"/>
+          <w:insideV w:val="single" w:sz="4" w:color="000000"/>
+        </w:tblBorders>
+      </w:tblPr>
+      <w:tblGrid>
+        <w:gridCol w:w="3000"/>
+        <w:gridCol w:w="3000"/>
+        <w:gridCol w:w="3000"/>
+      </w:tblGrid>
+      <w:tr>
+        <w:tc>
+          <w:tcPr>
+            <w:tcBorders>
+              <w:top w:val="single" w:sz="4" w:color="000000"/>
+              <w:bottom w:val="single" w:sz="4" w:color="000000"/>
+              <w:left w:val="single" w:sz="4" w:color="000000"/>
+              <w:right w:val="single" w:sz="4" w:color="000000"/>
+            </w:tcBorders>
+            <w:shd w:val="clear" w:color="auto" w:fill="D9E2F3"/>
+          </w:tcPr>
+          <w:p>
+            <w:pPr>
+              <w:spacing w:after="0"/>
+            </w:pPr>
+            <w:r>
+              <w:rPr>
+                <w:b/>
+              </w:rPr>
+              <w:t xml:space="preserve">N</w:t>
+            </w:r>
+          </w:p>
+        </w:tc>
+        <w:tc>
+          <w:tcPr>
+            <w:tcBorders>
+              <w:top w:val="single" w:sz="4" w:color="000000"/>
+              <w:bottom w:val="single" w:sz="4" w:color="000000"/>
+              <w:left w:val="single" w:sz="4" w:color="000000"/>
+              <w:right w:val="single" w:sz="4" w:color="000000"/>
+            </w:tcBorders>
+            <w:shd w:val="clear" w:color="auto" w:fill="D9E2F3"/>
+          </w:tcPr>
+          <w:p>
+            <w:pPr>
+              <w:spacing w:after="0"/>
+            </w:pPr>
+            <w:r>
+              <w:rPr>
+                <w:b/>
+              </w:rPr>
+              <w:t xml:space="preserve">f″(1)</w:t>
+            </w:r>
+          </w:p>
+        </w:tc>
+        <w:tc>
+          <w:tcPr>
+            <w:tcBorders>
+              <w:top w:val="single" w:sz="4" w:color="000000"/>
+              <w:bottom w:val="single" w:sz="4" w:color="000000"/>
+              <w:left w:val="single" w:sz="4" w:color="000000"/>
+              <w:right w:val="single" w:sz="4" w:color="000000"/>
+            </w:tcBorders>
+            <w:shd w:val="clear" w:color="auto" w:fill="D9E2F3"/>
+          </w:tcPr>
+          <w:p>
+            <w:pPr>
+              <w:spacing w:after="0"/>
+            </w:pPr>
+            <w:r>
+              <w:rPr>
+                <w:b/>
+              </w:rPr>
+              <w:t xml:space="preserve">Relative change, Δf″(1)/f″(1)</w:t>
+            </w:r>
+          </w:p>
+        </w:tc>
+      </w:tr>
+      <w:tr>
+        <w:tc>
+          <w:tcPr>
+            <w:tcBorders>
+              <w:top w:val="single" w:sz="4" w:color="000000"/>
+              <w:bottom w:val="single" w:sz="4" w:color="000000"/>
+              <w:left w:val="single" w:sz="4" w:color="000000"/>
+              <w:right w:val="single" w:sz="4" w:color="000000"/>
+            </w:tcBorders>
+          </w:tcPr>
+          <w:p>
+            <w:pPr>
+              <w:spacing w:after="0"/>
+            </w:pPr>
+            <w:r>
+              <w:t xml:space="preserve">100</w:t>
+            </w:r>
+          </w:p>
+        </w:tc>
+        <w:tc>
+          <w:tcPr>
+            <w:tcBorders>
+              <w:top w:val="single" w:sz="4" w:color="000000"/>
+              <w:bottom w:val="single" w:sz="4" w:color="000000"/>
+              <w:left w:val="single" w:sz="4" w:color="000000"/>
+              <w:right w:val="single" w:sz="4" w:color="000000"/>
+            </w:tcBorders>
+          </w:tcPr>
+          <w:p>
+            <w:pPr>
+              <w:spacing w:after="0"/>
+            </w:pPr>
+            <w:r>
+              <w:t xml:space="preserve">0.07587814</w:t>
+            </w:r>
+          </w:p>
+        </w:tc>
+        <w:tc>
+          <w:tcPr>
+            <w:tcBorders>
+              <w:top w:val="single" w:sz="4" w:color="000000"/>
+              <w:bottom w:val="single" w:sz="4" w:color="000000"/>
+              <w:left w:val="single" w:sz="4" w:color="000000"/>
+              <w:right w:val="single" w:sz="4" w:color="000000"/>
+            </w:tcBorders>
+          </w:tcPr>
+          <w:p>
+            <w:pPr>
+              <w:spacing w:after="0"/>
+            </w:pPr>
+            <w:r>
+              <w:t xml:space="preserve">—</w:t>
+            </w:r>
+          </w:p>
+        </w:tc>
+      </w:tr>
+      <w:tr>
+        <w:tc>
+          <w:tcPr>
+            <w:tcBorders>
+              <w:top w:val="single" w:sz="4" w:color="000000"/>
+              <w:bottom w:val="single" w:sz="4" w:color="000000"/>
+              <w:left w:val="single" w:sz="4" w:color="000000"/>
+              <w:right w:val="single" w:sz="4" w:color="000000"/>
+            </w:tcBorders>
+          </w:tcPr>
+          <w:p>
+            <w:pPr>
+              <w:spacing w:after="0"/>
+            </w:pPr>
+            <w:r>
+              <w:t xml:space="preserve">200</w:t>
+            </w:r>
+          </w:p>
+        </w:tc>
+        <w:tc>
+          <w:tcPr>
+            <w:tcBorders>
+              <w:top w:val="single" w:sz="4" w:color="000000"/>
+              <w:bottom w:val="single" w:sz="4" w:color="000000"/>
+              <w:left w:val="single" w:sz="4" w:color="000000"/>
+              <w:right w:val="single" w:sz="4" w:color="000000"/>
+            </w:tcBorders>
+          </w:tcPr>
+          <w:p>
+            <w:pPr>
+              <w:spacing w:after="0"/>
+            </w:pPr>
+            <w:r>
+              <w:t xml:space="preserve">0.07587810</w:t>
+            </w:r>
+          </w:p>
+        </w:tc>
+        <w:tc>
+          <w:tcPr>
+            <w:tcBorders>
+              <w:top w:val="single" w:sz="4" w:color="000000"/>
+              <w:bottom w:val="single" w:sz="4" w:color="000000"/>
+              <w:left w:val="single" w:sz="4" w:color="000000"/>
+              <w:right w:val="single" w:sz="4" w:color="000000"/>
+            </w:tcBorders>
+          </w:tcPr>
+          <w:p>
+            <w:pPr>
+              <w:spacing w:after="0"/>
+            </w:pPr>
+            <w:r>
+              <w:t xml:space="preserve">5.3 × 10⁻⁷</w:t>
+            </w:r>
+          </w:p>
+        </w:tc>
+      </w:tr>
+      <w:tr>
+        <w:tc>
+          <w:tcPr>
+            <w:tcBorders>
+              <w:top w:val="single" w:sz="4" w:color="000000"/>
+              <w:bottom w:val="single" w:sz="4" w:color="000000"/>
+              <w:left w:val="single" w:sz="4" w:color="000000"/>
+              <w:right w:val="single" w:sz="4" w:color="000000"/>
+            </w:tcBorders>
+          </w:tcPr>
+          <w:p>
+            <w:pPr>
+              <w:spacing w:after="0"/>
+            </w:pPr>
+            <w:r>
+              <w:t xml:space="preserve">400</w:t>
+            </w:r>
+          </w:p>
+        </w:tc>
+        <w:tc>
+          <w:tcPr>
+            <w:tcBorders>
+              <w:top w:val="single" w:sz="4" w:color="000000"/>
+              <w:bottom w:val="single" w:sz="4" w:color="000000"/>
+              <w:left w:val="single" w:sz="4" w:color="000000"/>
+              <w:right w:val="single" w:sz="4" w:color="000000"/>
+            </w:tcBorders>
+          </w:tcPr>
+          <w:p>
+            <w:pPr>
+              <w:spacing w:after="0"/>
+            </w:pPr>
+            <w:r>
+              <w:t xml:space="preserve">0.07587809</w:t>
+            </w:r>
+          </w:p>
+        </w:tc>
+        <w:tc>
+          <w:tcPr>
+            <w:tcBorders>
+              <w:top w:val="single" w:sz="4" w:color="000000"/>
+              <w:bottom w:val="single" w:sz="4" w:color="000000"/>
+              <w:left w:val="single" w:sz="4" w:color="000000"/>
+              <w:right w:val="single" w:sz="4" w:color="000000"/>
+            </w:tcBorders>
+          </w:tcPr>
+          <w:p>
+            <w:pPr>
+              <w:spacing w:after="0"/>
+            </w:pPr>
+            <w:r>
+              <w:t xml:space="preserve">1.3 × 10⁻⁷</w:t>
+            </w:r>
+          </w:p>
+        </w:tc>
+      </w:tr>
+    </w:tbl>
+    <w:p/>
+    <w:p>
+      <w:r>
+        <w:rPr>
+          <w:b/>
+        </w:rPr>
+        <w:t xml:space="preserve">Table 2. Newtonian clear-fluid limit</w:t>
+      </w:r>
+      <w:r>
+        <w:t xml:space="preserve"> (Pr = 6.2, Bi = 0.5; radiation, dissipation, Joule, Soret and Dufour effects switched off so that the energy equation reduces to θ″ + Pr(fθ′ − f′θ − Sq θ − (Sq/2)ηθ′) = 0 with θ′(0) = −Bi[1 − θ(0)], θ(1) = 0).**</w:t>
+      </w:r>
+    </w:p>
+    <w:p/>
+    <w:tbl>
+      <w:tblPr>
+        <w:tblStyle w:val="TableGrid"/>
+        <w:tblW w:w="0" w:type="auto"/>
+        <w:tblBorders>
+          <w:top w:val="single" w:sz="4" w:color="000000"/>
+          <w:bottom w:val="single" w:sz="4" w:color="000000"/>
+          <w:left w:val="single" w:sz="4" w:color="000000"/>
+          <w:right w:val="single" w:sz="4" w:color="000000"/>
+          <w:insideH w:val="single" w:sz="4" w:color="000000"/>
+          <w:insideV w:val="single" w:sz="4" w:color="000000"/>
+        </w:tblBorders>
+      </w:tblPr>
+      <w:tblGrid>
+        <w:gridCol w:w="3000"/>
+        <w:gridCol w:w="3000"/>
+        <w:gridCol w:w="3000"/>
+      </w:tblGrid>
+      <w:tr>
+        <w:tc>
+          <w:tcPr>
+            <w:tcBorders>
+              <w:top w:val="single" w:sz="4" w:color="000000"/>
+              <w:bottom w:val="single" w:sz="4" w:color="000000"/>
+              <w:left w:val="single" w:sz="4" w:color="000000"/>
+              <w:right w:val="single" w:sz="4" w:color="000000"/>
+            </w:tcBorders>
+            <w:shd w:val="clear" w:color="auto" w:fill="D9E2F3"/>
+          </w:tcPr>
+          <w:p>
+            <w:pPr>
+              <w:spacing w:after="0"/>
+            </w:pPr>
+            <w:r>
+              <w:rPr>
+                <w:b/>
+              </w:rPr>
+              <w:t xml:space="preserve">Sq</w:t>
+            </w:r>
+          </w:p>
+        </w:tc>
+        <w:tc>
+          <w:tcPr>
+            <w:tcBorders>
+              <w:top w:val="single" w:sz="4" w:color="000000"/>
+              <w:bottom w:val="single" w:sz="4" w:color="000000"/>
+              <w:left w:val="single" w:sz="4" w:color="000000"/>
+              <w:right w:val="single" w:sz="4" w:color="000000"/>
+            </w:tcBorders>
+            <w:shd w:val="clear" w:color="auto" w:fill="D9E2F3"/>
+          </w:tcPr>
+          <w:p>
+            <w:pPr>
+              <w:spacing w:after="0"/>
+            </w:pPr>
+            <w:r>
+              <w:rPr>
+                <w:b/>
+              </w:rPr>
+              <w:t xml:space="preserve">f″(1)</w:t>
+            </w:r>
+          </w:p>
+        </w:tc>
+        <w:tc>
+          <w:tcPr>
+            <w:tcBorders>
+              <w:top w:val="single" w:sz="4" w:color="000000"/>
+              <w:bottom w:val="single" w:sz="4" w:color="000000"/>
+              <w:left w:val="single" w:sz="4" w:color="000000"/>
+              <w:right w:val="single" w:sz="4" w:color="000000"/>
+            </w:tcBorders>
+            <w:shd w:val="clear" w:color="auto" w:fill="D9E2F3"/>
+          </w:tcPr>
+          <w:p>
+            <w:pPr>
+              <w:spacing w:after="0"/>
+            </w:pPr>
+            <w:r>
+              <w:rPr>
+                <w:b/>
+              </w:rPr>
+              <w:t xml:space="preserve">−θ′(1)</w:t>
+            </w:r>
+          </w:p>
+        </w:tc>
+      </w:tr>
+      <w:tr>
+        <w:tc>
+          <w:tcPr>
+            <w:tcBorders>
+              <w:top w:val="single" w:sz="4" w:color="000000"/>
+              <w:bottom w:val="single" w:sz="4" w:color="000000"/>
+              <w:left w:val="single" w:sz="4" w:color="000000"/>
+              <w:right w:val="single" w:sz="4" w:color="000000"/>
+            </w:tcBorders>
+          </w:tcPr>
+          <w:p>
+            <w:pPr>
+              <w:spacing w:after="0"/>
+            </w:pPr>
+            <w:r>
+              <w:t xml:space="preserve">0.1</w:t>
+            </w:r>
+          </w:p>
+        </w:tc>
+        <w:tc>
+          <w:tcPr>
+            <w:tcBorders>
+              <w:top w:val="single" w:sz="4" w:color="000000"/>
+              <w:bottom w:val="single" w:sz="4" w:color="000000"/>
+              <w:left w:val="single" w:sz="4" w:color="000000"/>
+              <w:right w:val="single" w:sz="4" w:color="000000"/>
+            </w:tcBorders>
+          </w:tcPr>
+          <w:p>
+            <w:pPr>
+              <w:spacing w:after="0"/>
+            </w:pPr>
+            <w:r>
+              <w:t xml:space="preserve">1.650489</w:t>
+            </w:r>
+          </w:p>
+        </w:tc>
+        <w:tc>
+          <w:tcPr>
+            <w:tcBorders>
+              <w:top w:val="single" w:sz="4" w:color="000000"/>
+              <w:bottom w:val="single" w:sz="4" w:color="000000"/>
+              <w:left w:val="single" w:sz="4" w:color="000000"/>
+              <w:right w:val="single" w:sz="4" w:color="000000"/>
+            </w:tcBorders>
+          </w:tcPr>
+          <w:p>
+            <w:pPr>
+              <w:spacing w:after="0"/>
+            </w:pPr>
+            <w:r>
+              <w:t xml:space="preserve">0.716418</w:t>
+            </w:r>
+          </w:p>
+        </w:tc>
+      </w:tr>
+      <w:tr>
+        <w:tc>
+          <w:tcPr>
+            <w:tcBorders>
+              <w:top w:val="single" w:sz="4" w:color="000000"/>
+              <w:bottom w:val="single" w:sz="4" w:color="000000"/>
+              <w:left w:val="single" w:sz="4" w:color="000000"/>
+              <w:right w:val="single" w:sz="4" w:color="000000"/>
+            </w:tcBorders>
+          </w:tcPr>
+          <w:p>
+            <w:pPr>
+              <w:spacing w:after="0"/>
+            </w:pPr>
+            <w:r>
+              <w:t xml:space="preserve">0.5</w:t>
+            </w:r>
+          </w:p>
+        </w:tc>
+        <w:tc>
+          <w:tcPr>
+            <w:tcBorders>
+              <w:top w:val="single" w:sz="4" w:color="000000"/>
+              <w:bottom w:val="single" w:sz="4" w:color="000000"/>
+              <w:left w:val="single" w:sz="4" w:color="000000"/>
+              <w:right w:val="single" w:sz="4" w:color="000000"/>
+            </w:tcBorders>
+          </w:tcPr>
+          <w:p>
+            <w:pPr>
+              <w:spacing w:after="0"/>
+            </w:pPr>
+            <w:r>
+              <w:t xml:space="preserve">0.422159</w:t>
+            </w:r>
+          </w:p>
+        </w:tc>
+        <w:tc>
+          <w:tcPr>
+            <w:tcBorders>
+              <w:top w:val="single" w:sz="4" w:color="000000"/>
+              <w:bottom w:val="single" w:sz="4" w:color="000000"/>
+              <w:left w:val="single" w:sz="4" w:color="000000"/>
+              <w:right w:val="single" w:sz="4" w:color="000000"/>
+            </w:tcBorders>
+          </w:tcPr>
+          <w:p>
+            <w:pPr>
+              <w:spacing w:after="0"/>
+            </w:pPr>
+            <w:r>
+              <w:t xml:space="preserve">0.352009</w:t>
+            </w:r>
+          </w:p>
+        </w:tc>
+      </w:tr>
+      <w:tr>
+        <w:tc>
+          <w:tcPr>
+            <w:tcBorders>
+              <w:top w:val="single" w:sz="4" w:color="000000"/>
+              <w:bottom w:val="single" w:sz="4" w:color="000000"/>
+              <w:left w:val="single" w:sz="4" w:color="000000"/>
+              <w:right w:val="single" w:sz="4" w:color="000000"/>
+            </w:tcBorders>
+          </w:tcPr>
+          <w:p>
+            <w:pPr>
+              <w:spacing w:after="0"/>
+            </w:pPr>
+            <w:r>
+              <w:t xml:space="preserve">1.0</w:t>
+            </w:r>
+          </w:p>
+        </w:tc>
+        <w:tc>
+          <w:tcPr>
+            <w:tcBorders>
+              <w:top w:val="single" w:sz="4" w:color="000000"/>
+              <w:bottom w:val="single" w:sz="4" w:color="000000"/>
+              <w:left w:val="single" w:sz="4" w:color="000000"/>
+              <w:right w:val="single" w:sz="4" w:color="000000"/>
+            </w:tcBorders>
+          </w:tcPr>
+          <w:p>
+            <w:pPr>
+              <w:spacing w:after="0"/>
+            </w:pPr>
+            <w:r>
+              <w:t xml:space="preserve">−1.152174</w:t>
+            </w:r>
+          </w:p>
+        </w:tc>
+        <w:tc>
+          <w:tcPr>
+            <w:tcBorders>
+              <w:top w:val="single" w:sz="4" w:color="000000"/>
+              <w:bottom w:val="single" w:sz="4" w:color="000000"/>
+              <w:left w:val="single" w:sz="4" w:color="000000"/>
+              <w:right w:val="single" w:sz="4" w:color="000000"/>
+            </w:tcBorders>
+          </w:tcPr>
+          <w:p>
+            <w:pPr>
+              <w:spacing w:after="0"/>
+            </w:pPr>
+            <w:r>
+              <w:t xml:space="preserve">0.176000</w:t>
+            </w:r>
+          </w:p>
+        </w:tc>
+      </w:tr>
+      <w:tr>
+        <w:tc>
+          <w:tcPr>
+            <w:tcBorders>
+              <w:top w:val="single" w:sz="4" w:color="000000"/>
+              <w:bottom w:val="single" w:sz="4" w:color="000000"/>
+              <w:left w:val="single" w:sz="4" w:color="000000"/>
+              <w:right w:val="single" w:sz="4" w:color="000000"/>
+            </w:tcBorders>
+          </w:tcPr>
+          <w:p>
+            <w:pPr>
+              <w:spacing w:after="0"/>
+            </w:pPr>
+            <w:r>
+              <w:t xml:space="preserve">1.5</w:t>
+            </w:r>
+          </w:p>
+        </w:tc>
+        <w:tc>
+          <w:tcPr>
+            <w:tcBorders>
+              <w:top w:val="single" w:sz="4" w:color="000000"/>
+              <w:bottom w:val="single" w:sz="4" w:color="000000"/>
+              <w:left w:val="single" w:sz="4" w:color="000000"/>
+              <w:right w:val="single" w:sz="4" w:color="000000"/>
+            </w:tcBorders>
+          </w:tcPr>
+          <w:p>
+            <w:pPr>
+              <w:spacing w:after="0"/>
+            </w:pPr>
+            <w:r>
+              <w:t xml:space="preserve">−2.768838</w:t>
+            </w:r>
+          </w:p>
+        </w:tc>
+        <w:tc>
+          <w:tcPr>
+            <w:tcBorders>
+              <w:top w:val="single" w:sz="4" w:color="000000"/>
+              <w:bottom w:val="single" w:sz="4" w:color="000000"/>
+              <w:left w:val="single" w:sz="4" w:color="000000"/>
+              <w:right w:val="single" w:sz="4" w:color="000000"/>
+            </w:tcBorders>
+          </w:tcPr>
+          <w:p>
+            <w:pPr>
+              <w:spacing w:after="0"/>
+            </w:pPr>
+            <w:r>
+              <w:t xml:space="preserve">0.098720</w:t>
+            </w:r>
+          </w:p>
+        </w:tc>
+      </w:tr>
+    </w:tbl>
+    <w:p/>
+    <w:p/>
+    <w:p>
+      <w:pPr>
+        <w:pStyle w:val="Heading1"/>
+      </w:pPr>
+      <w:r>
+        <w:t xml:space="preserve">5. Validation</w:t>
+      </w:r>
+    </w:p>
+    <w:p/>
+    <w:p>
+      <w:r>
+        <w:t xml:space="preserve">Grid convergence (Table 1) confirms mesh independence to the reported precision. For validation of the hydrodynamic solver, the Newtonian clear-fluid limit was obtained by setting the Carreau bracket to unity (n = 1), the nanoparticle fractions φ₁ = φ₂ = 0, and the EMHD, porous and Forchheimer groups to zero (M = Ee = 0, 1/Da = 0, Fr = 0, S₁ = 0). Under these assumptions the present governing equation (23) reduces exactly to the classical Wang squeezing-film equation</w:t>
+      </w:r>
+    </w:p>
+    <w:p/>
+    <w:p>
+      <w:r>
+        <w:t xml:space="preserve">$$</w:t>
+      </w:r>
+    </w:p>
+    <w:p>
+      <w:r>
+        <w:t xml:space="preserve">f^{(4)} + f f''' - f' f'' - Sq\left(\frac{3}{2}f'' + \frac{\eta}{2}f'''\right) = 0</w:t>
+      </w:r>
+    </w:p>
+    <w:p>
+      <w:r>
+        <w:t xml:space="preserve">$$</w:t>
+      </w:r>
+    </w:p>
+    <w:p/>
+    <w:p>
+      <w:r>
+        <w:t xml:space="preserve">with f(0) = 0, f′(0) = 1, f(1) = Sq/2, f′(1) = 0, where f^{(4)} denotes the fourth derivative. A quantitative comparison of the present f″(1) against the Wang-type benchmark values is given in Table 3; the agreement is better than 0.1% across the tested range of Sq, confirming correct implementation. The Carreau Newtonian limit does not reproduce the Casson model of [23]; accordingly, comparison with [23] is restricted to a common Newtonian limiting case and should not be interpreted as validation of the full Carreau model against a Casson formulation.</w:t>
+      </w:r>
+    </w:p>
+    <w:p/>
+    <w:p>
+      <w:r>
+        <w:rPr>
+          <w:b/>
+        </w:rPr>
+        <w:t xml:space="preserve">Table 3. Validation against the Wang squeezing-film benchmark (Newtonian clear-fluid limit).</w:t>
+      </w:r>
+    </w:p>
+    <w:p/>
+    <w:tbl>
+      <w:tblPr>
+        <w:tblStyle w:val="TableGrid"/>
+        <w:tblW w:w="0" w:type="auto"/>
+        <w:tblBorders>
+          <w:top w:val="single" w:sz="4" w:color="000000"/>
+          <w:bottom w:val="single" w:sz="4" w:color="000000"/>
+          <w:left w:val="single" w:sz="4" w:color="000000"/>
+          <w:right w:val="single" w:sz="4" w:color="000000"/>
+          <w:insideH w:val="single" w:sz="4" w:color="000000"/>
+          <w:insideV w:val="single" w:sz="4" w:color="000000"/>
+        </w:tblBorders>
+      </w:tblPr>
+      <w:tblGrid>
+        <w:gridCol w:w="2250"/>
+        <w:gridCol w:w="2250"/>
+        <w:gridCol w:w="2250"/>
+        <w:gridCol w:w="2250"/>
+      </w:tblGrid>
+      <w:tr>
+        <w:tc>
+          <w:tcPr>
+            <w:tcBorders>
+              <w:top w:val="single" w:sz="4" w:color="000000"/>
+              <w:bottom w:val="single" w:sz="4" w:color="000000"/>
+              <w:left w:val="single" w:sz="4" w:color="000000"/>
+              <w:right w:val="single" w:sz="4" w:color="000000"/>
+            </w:tcBorders>
+            <w:shd w:val="clear" w:color="auto" w:fill="D9E2F3"/>
+          </w:tcPr>
+          <w:p>
+            <w:pPr>
+              <w:spacing w:after="0"/>
+            </w:pPr>
+            <w:r>
+              <w:rPr>
+                <w:b/>
+              </w:rPr>
+              <w:t xml:space="preserve">Sq</w:t>
+            </w:r>
+          </w:p>
+        </w:tc>
+        <w:tc>
+          <w:tcPr>
+            <w:tcBorders>
+              <w:top w:val="single" w:sz="4" w:color="000000"/>
+              <w:bottom w:val="single" w:sz="4" w:color="000000"/>
+              <w:left w:val="single" w:sz="4" w:color="000000"/>
+              <w:right w:val="single" w:sz="4" w:color="000000"/>
+            </w:tcBorders>
+            <w:shd w:val="clear" w:color="auto" w:fill="D9E2F3"/>
+          </w:tcPr>
+          <w:p>
+            <w:pPr>
+              <w:spacing w:after="0"/>
+            </w:pPr>
+            <w:r>
+              <w:rPr>
+                <w:b/>
+              </w:rPr>
+              <w:t xml:space="preserve">Present f″(1)</w:t>
+            </w:r>
+          </w:p>
+        </w:tc>
+        <w:tc>
+          <w:tcPr>
+            <w:tcBorders>
+              <w:top w:val="single" w:sz="4" w:color="000000"/>
+              <w:bottom w:val="single" w:sz="4" w:color="000000"/>
+              <w:left w:val="single" w:sz="4" w:color="000000"/>
+              <w:right w:val="single" w:sz="4" w:color="000000"/>
+            </w:tcBorders>
+            <w:shd w:val="clear" w:color="auto" w:fill="D9E2F3"/>
+          </w:tcPr>
+          <w:p>
+            <w:pPr>
+              <w:spacing w:after="0"/>
+            </w:pPr>
+            <w:r>
+              <w:rPr>
+                <w:b/>
+              </w:rPr>
+              <w:t xml:space="preserve">Benchmark f″(1)</w:t>
+            </w:r>
+          </w:p>
+        </w:tc>
+        <w:tc>
+          <w:tcPr>
+            <w:tcBorders>
+              <w:top w:val="single" w:sz="4" w:color="000000"/>
+              <w:bottom w:val="single" w:sz="4" w:color="000000"/>
+              <w:left w:val="single" w:sz="4" w:color="000000"/>
+              <w:right w:val="single" w:sz="4" w:color="000000"/>
+            </w:tcBorders>
+            <w:shd w:val="clear" w:color="auto" w:fill="D9E2F3"/>
+          </w:tcPr>
+          <w:p>
+            <w:pPr>
+              <w:spacing w:after="0"/>
+            </w:pPr>
+            <w:r>
+              <w:rPr>
+                <w:b/>
+              </w:rPr>
+              <w:t xml:space="preserve">Relative error (%)</w:t>
+            </w:r>
+          </w:p>
+        </w:tc>
+      </w:tr>
+      <w:tr>
+        <w:tc>
+          <w:tcPr>
+            <w:tcBorders>
+              <w:top w:val="single" w:sz="4" w:color="000000"/>
+              <w:bottom w:val="single" w:sz="4" w:color="000000"/>
+              <w:left w:val="single" w:sz="4" w:color="000000"/>
+              <w:right w:val="single" w:sz="4" w:color="000000"/>
+            </w:tcBorders>
+          </w:tcPr>
+          <w:p>
+            <w:pPr>
+              <w:spacing w:after="0"/>
+            </w:pPr>
+            <w:r>
+              <w:t xml:space="preserve">0.5</w:t>
+            </w:r>
+          </w:p>
+        </w:tc>
+        <w:tc>
+          <w:tcPr>
+            <w:tcBorders>
+              <w:top w:val="single" w:sz="4" w:color="000000"/>
+              <w:bottom w:val="single" w:sz="4" w:color="000000"/>
+              <w:left w:val="single" w:sz="4" w:color="000000"/>
+              <w:right w:val="single" w:sz="4" w:color="000000"/>
+            </w:tcBorders>
+          </w:tcPr>
+          <w:p>
+            <w:pPr>
+              <w:spacing w:after="0"/>
+            </w:pPr>
+            <w:r>
+              <w:t xml:space="preserve">0.4221590</w:t>
+            </w:r>
+          </w:p>
+        </w:tc>
+        <w:tc>
+          <w:tcPr>
+            <w:tcBorders>
+              <w:top w:val="single" w:sz="4" w:color="000000"/>
+              <w:bottom w:val="single" w:sz="4" w:color="000000"/>
+              <w:left w:val="single" w:sz="4" w:color="000000"/>
+              <w:right w:val="single" w:sz="4" w:color="000000"/>
+            </w:tcBorders>
+          </w:tcPr>
+          <w:p>
+            <w:pPr>
+              <w:spacing w:after="0"/>
+            </w:pPr>
+            <w:r>
+              <w:t xml:space="preserve">0.4219680</w:t>
+            </w:r>
+          </w:p>
+        </w:tc>
+        <w:tc>
+          <w:tcPr>
+            <w:tcBorders>
+              <w:top w:val="single" w:sz="4" w:color="000000"/>
+              <w:bottom w:val="single" w:sz="4" w:color="000000"/>
+              <w:left w:val="single" w:sz="4" w:color="000000"/>
+              <w:right w:val="single" w:sz="4" w:color="000000"/>
+            </w:tcBorders>
+          </w:tcPr>
+          <w:p>
+            <w:pPr>
+              <w:spacing w:after="0"/>
+            </w:pPr>
+            <w:r>
+              <w:t xml:space="preserve">0.045</w:t>
+            </w:r>
+          </w:p>
+        </w:tc>
+      </w:tr>
+      <w:tr>
+        <w:tc>
+          <w:tcPr>
+            <w:tcBorders>
+              <w:top w:val="single" w:sz="4" w:color="000000"/>
+              <w:bottom w:val="single" w:sz="4" w:color="000000"/>
+              <w:left w:val="single" w:sz="4" w:color="000000"/>
+              <w:right w:val="single" w:sz="4" w:color="000000"/>
+            </w:tcBorders>
+          </w:tcPr>
+          <w:p>
+            <w:pPr>
+              <w:spacing w:after="0"/>
+            </w:pPr>
+            <w:r>
+              <w:t xml:space="preserve">1.0</w:t>
+            </w:r>
+          </w:p>
+        </w:tc>
+        <w:tc>
+          <w:tcPr>
+            <w:tcBorders>
+              <w:top w:val="single" w:sz="4" w:color="000000"/>
+              <w:bottom w:val="single" w:sz="4" w:color="000000"/>
+              <w:left w:val="single" w:sz="4" w:color="000000"/>
+              <w:right w:val="single" w:sz="4" w:color="000000"/>
+            </w:tcBorders>
+          </w:tcPr>
+          <w:p>
+            <w:pPr>
+              <w:spacing w:after="0"/>
+            </w:pPr>
+            <w:r>
+              <w:t xml:space="preserve">−1.1521740</w:t>
+            </w:r>
+          </w:p>
+        </w:tc>
+        <w:tc>
+          <w:tcPr>
+            <w:tcBorders>
+              <w:top w:val="single" w:sz="4" w:color="000000"/>
+              <w:bottom w:val="single" w:sz="4" w:color="000000"/>
+              <w:left w:val="single" w:sz="4" w:color="000000"/>
+              <w:right w:val="single" w:sz="4" w:color="000000"/>
+            </w:tcBorders>
+          </w:tcPr>
+          <w:p>
+            <w:pPr>
+              <w:spacing w:after="0"/>
+            </w:pPr>
+            <w:r>
+              <w:t xml:space="preserve">−1.1530300</w:t>
+            </w:r>
+          </w:p>
+        </w:tc>
+        <w:tc>
+          <w:tcPr>
+            <w:tcBorders>
+              <w:top w:val="single" w:sz="4" w:color="000000"/>
+              <w:bottom w:val="single" w:sz="4" w:color="000000"/>
+              <w:left w:val="single" w:sz="4" w:color="000000"/>
+              <w:right w:val="single" w:sz="4" w:color="000000"/>
+            </w:tcBorders>
+          </w:tcPr>
+          <w:p>
+            <w:pPr>
+              <w:spacing w:after="0"/>
+            </w:pPr>
+            <w:r>
+              <w:t xml:space="preserve">0.074</w:t>
+            </w:r>
+          </w:p>
+        </w:tc>
+      </w:tr>
+    </w:tbl>
+    <w:p/>
+    <w:p/>
+    <w:p>
+      <w:pPr>
+        <w:pStyle w:val="Heading1"/>
+      </w:pPr>
+      <w:r>
+        <w:t xml:space="preserve">6. Results and Discussion</w:t>
+      </w:r>
+    </w:p>
+    <w:p/>
+    <w:p>
+      <w:r>
+        <w:t xml:space="preserve">Throughout this section, the "core" denotes the central region of the channel away from both walls (approximately 0.3 ≤ η ≤ 0.7), as distinct from the near-wall layers where gradients are steepest.</w:t>
+      </w:r>
+    </w:p>
+    <w:p/>
+    <w:p>
+      <w:pPr>
+        <w:pStyle w:val="Heading2"/>
+      </w:pPr>
+      <w:r>
+        <w:t xml:space="preserve">6.1 Velocity field</w:t>
+      </w:r>
+    </w:p>
+    <w:p/>
+    <w:p>
+      <w:r>
+        <w:t xml:space="preserve">[Figure placeholder: figures_emhd/Figure_1_Schematic.png]</w:t>
+      </w:r>
+    </w:p>
+    <w:p/>
+    <w:p>
+      <w:r>
+        <w:rPr>
+          <w:b/>
+        </w:rPr>
+        <w:t xml:space="preserve">Figure 1.</w:t>
+      </w:r>
+      <w:r>
+        <w:t xml:space="preserve"> Schematic of the unsteady squeezing flow of the AA7072–AA7075/methanol Carreau hybrid nanofluid between parallel porous plates under aligned electric and transverse magnetic fields.</w:t>
+      </w:r>
+    </w:p>
+    <w:p/>
+    <w:p>
+      <w:r>
+        <w:t xml:space="preserve">Figure 1 shows the physical configuration. The lower plate stretches with nominal velocity U_e = ax/(1 − γt); because a velocity-slip condition f′(0) = 1 + S₁ f″(0) is imposed, the fluid velocity at the lower wall differs from this nominal stretching velocity by the slip increment S₁ f″(0). The upper plate moves with the squeezing velocity v_h of Eq. (2). The gap is filled with a Carreau hybrid nanofluid in a Darcy–Forchheimer porous medium.</w:t>
+      </w:r>
+    </w:p>
+    <w:p/>
+    <w:p>
+      <w:r>
+        <w:t xml:space="preserve">[Figure placeholder: figures_emhd/Figure_2_Velocity_Sq.png]</w:t>
+      </w:r>
+    </w:p>
+    <w:p/>
+    <w:p>
+      <w:r>
+        <w:rPr>
+          <w:b/>
+        </w:rPr>
+        <w:t xml:space="preserve">Figure 2.</w:t>
+      </w:r>
+      <w:r>
+        <w:t xml:space="preserve"> Effect of the squeezing parameter Sq on the velocity profile f′(η). Data computed by the present solver.</w:t>
+      </w:r>
+    </w:p>
+    <w:p/>
+    <w:p>
+      <w:r>
+        <w:t xml:space="preserve">Figure 2 shows the axial velocity f′(η) for Sq = 0.2, 0.4, 0.6, 0.8. As the squeezing parameter increases, the slip-modified near-wall velocity f′(0) = 1 + S₁ f″(0) changes while the core flow is redistributed; the curves exhibit a characteristic crossover. All curves satisfy the no-slip condition f′(1) = 0 at the upper plate and the velocity-slip condition at the lower plate. Inspection of the computed profiles shows that the crossover (the η at which the profiles intersect) shifts toward the lower plate as Sq increases, reflecting the stronger streamwise redistribution of fluid associated with the squeezing motion (toward the open streamwise boundary of the gap, i.e. increasing |x|). This trend is consistent with the classical Stefan–Grimm viscous-film analysis [18, 19].</w:t>
+      </w:r>
+    </w:p>
+    <w:p/>
+    <w:p>
+      <w:r>
+        <w:t xml:space="preserve">[Figure placeholder: figures_emhd/Figure_3_Velocity_We_M.png]</w:t>
+      </w:r>
+    </w:p>
+    <w:p/>
+    <w:p>
+      <w:r>
+        <w:rPr>
+          <w:b/>
+        </w:rPr>
+        <w:t xml:space="preserve">Figure 3.</w:t>
+      </w:r>
+      <w:r>
+        <w:t xml:space="preserve"> Effect of the Weissenberg number We and magnetic parameter M on f′(η). Data computed by the present solver.</w:t>
+      </w:r>
+    </w:p>
+    <w:p/>
+    <w:p>
+      <w:r>
+        <w:t xml:space="preserve">Figure 3 illustrates the combined influence of We and M. For the shear-thickening index n = 1.5 the effect of We on the axial velocity is governed by two competing mechanisms. Increasing We raises the apparent viscosity at high shear rate, which near the walls increases the local resistance to deformation; however, by mass conservation (fixed f(1) = Sq/2) the redistributed flux can raise f′ in part of the channel. The computed profiles were examined directly to resolve this competition rather than attributing the trend to effective viscosity alone: over the plotted range the net effect of increasing We is a modest thickening of the momentum layer and a local rise in f′ in the near-core region, while the near-wall shear is simultaneously increased (reflected in the larger C_f at We = 2.0 in Table 4). This behaviour is therefore the outcome of competing wall-resistance and flux-redistribution effects, not a monotone consequence of higher viscosity. Stronger M retards the flow through the Lorentz force (via the f′ − Ee grouping), lowering the velocity profile; the M = 2 curve shows appreciably reduced flow relative to the M = 1 baseline. These trends are consistent with Wahab et al. [14] and Mkhatshwa and Khumalo [15].</w:t>
+      </w:r>
+    </w:p>
+    <w:p/>
+    <w:p>
+      <w:pPr>
+        <w:pStyle w:val="Heading2"/>
+      </w:pPr>
+      <w:r>
+        <w:t xml:space="preserve">6.2 Temperature field</w:t>
+      </w:r>
+    </w:p>
+    <w:p/>
+    <w:p>
+      <w:r>
+        <w:t xml:space="preserve">[Figure placeholder: figures_emhd/Figure_4_Temperature_Rd_Ec.png]</w:t>
+      </w:r>
+    </w:p>
+    <w:p/>
+    <w:p>
+      <w:r>
+        <w:rPr>
+          <w:b/>
+        </w:rPr>
+        <w:t xml:space="preserve">Figure 4.</w:t>
+      </w:r>
+      <w:r>
+        <w:t xml:space="preserve"> Effect of Rd and Ec on the temperature profile θ(η). Data computed by the present solver.</w:t>
+      </w:r>
+    </w:p>
+    <w:p/>
+    <w:p>
+      <w:r>
+        <w:t xml:space="preserve">Figure 4 shows the temperature profiles. Higher Ec raises θ through viscous dissipation and Joule heating. With the radiation grouping [α_κ + (4/3)Rd F³]θ″, increasing Rd enhances the effective radiative heat-transfer contribution — Rd is a dimensionless radiation parameter, not the material thermal conductivity itself — thereby increasing the effective thermal diffusion and reducing the temperature gradients, which flattens and moderates the dissipation-driven peak. Consistent with Table 4, Re^(−1/2) Nu increases from 1.3509 at Rd = 0.2 to 2.3466 at Rd = 1.0 (about a 74% radiative enhancement).</w:t>
+      </w:r>
+    </w:p>
+    <w:p/>
+    <w:p>
+      <w:pPr>
+        <w:pStyle w:val="Heading2"/>
+      </w:pPr>
+      <w:r>
+        <w:t xml:space="preserve">6.3 Concentration field</w:t>
+      </w:r>
+    </w:p>
+    <w:p/>
+    <w:p>
+      <w:r>
+        <w:t xml:space="preserve">The concentration φ(η) decreases monotonically from the lower to the upper plate. Larger Sc thins the solutal layer; K &gt; 0 depletes species through the first-order reaction. The Soret and Dufour numbers act reciprocally on the temperature and concentration fields [23, 26–28].</w:t>
+      </w:r>
+    </w:p>
+    <w:p/>
+    <w:p>
+      <w:pPr>
+        <w:pStyle w:val="Heading2"/>
+      </w:pPr>
+      <w:r>
+        <w:t xml:space="preserve">6.4 Entropy generation</w:t>
+      </w:r>
+    </w:p>
+    <w:p/>
+    <w:p>
+      <w:r>
+        <w:t xml:space="preserve">[Figure placeholder: figures_emhd/Figure_5_Entropy_Br_M.png]</w:t>
+      </w:r>
+    </w:p>
+    <w:p/>
+    <w:p>
+      <w:r>
+        <w:rPr>
+          <w:b/>
+        </w:rPr>
+        <w:t xml:space="preserve">Figure 5.</w:t>
+      </w:r>
+      <w:r>
+        <w:t xml:space="preserve"> Entropy generation number N_s(η) versus Br and M. Data computed by the present solver.</w:t>
+      </w:r>
+    </w:p>
+    <w:p/>
+    <w:p>
+      <w:r>
+        <w:t xml:space="preserve">Figure 5 shows the entropy-generation profiles. N_s(η) peaks at the walls, where the velocity and temperature gradients are largest, and falls toward the core — the near-wall-dominated distribution characteristic of wall-bounded irreversibility [34, 35]. Increasing Br amplifies N_s strongly: N_s(0) rises from 4.4484 (Br = 0.5) to 10.7492 (Br = 1.5), an increase of about 142%. Stronger M adds Joule irreversibility (N_s(0) = 8.2714 at M = 2.0 versus 7.5988 at M = 1.0). A larger dimensionless temperature difference reduces N_s(0) to 3.5495 at Ω = 2.0, consistent with Table 5.</w:t>
+      </w:r>
+    </w:p>
+    <w:p/>
+    <w:p>
+      <w:pPr>
+        <w:pStyle w:val="Heading2"/>
+      </w:pPr>
+      <w:r>
+        <w:t xml:space="preserve">6.5 Bejan number</w:t>
+      </w:r>
+    </w:p>
+    <w:p/>
+    <w:p>
+      <w:r>
+        <w:t xml:space="preserve">[Figure placeholder: figures_emhd/Figure_6_Bejan_Rd_Br.png]</w:t>
+      </w:r>
+    </w:p>
+    <w:p/>
+    <w:p>
+      <w:r>
+        <w:rPr>
+          <w:b/>
+        </w:rPr>
+        <w:t xml:space="preserve">Figure 6.</w:t>
+      </w:r>
+      <w:r>
+        <w:t xml:space="preserve"> Bejan number Be(η) versus Rd and Br. Data computed by the present solver.</w:t>
+      </w:r>
+    </w:p>
+    <w:p/>
+    <w:p>
+      <w:r>
+        <w:t xml:space="preserve">Figure 6 shows the Bejan number, which is bounded in [0, 1] at every η over the full parameter range (Section 3.2): thermal and diffusive irreversibilities dominate near the walls (high Be), while friction and Joule irreversibilities dominate in the core (low Be). Larger Rd raises Be (greater thermal share); larger Br lowers it (greater friction share). Be(0) falls from 0.2918 to 0.1207 as Br increases from 0.5 to 1.5 (Table 5). The spatial transition is consistent with Yadav and Kumar [42] and Ali et al. [41].</w:t>
+      </w:r>
+    </w:p>
+    <w:p/>
+    <w:p>
+      <w:pPr>
+        <w:pStyle w:val="Heading2"/>
+      </w:pPr>
+      <w:r>
+        <w:t xml:space="preserve">6.6 Engineering quantities</w:t>
+      </w:r>
+    </w:p>
+    <w:p/>
+    <w:p>
+      <w:r>
+        <w:t xml:space="preserve">[Figure placeholder: figures_emhd/Figure_7_Engineering_phi.png]</w:t>
+      </w:r>
+    </w:p>
+    <w:p/>
+    <w:p>
+      <w:r>
+        <w:rPr>
+          <w:b/>
+        </w:rPr>
+        <w:t xml:space="preserve">Figure 7.</w:t>
+      </w:r>
+      <w:r>
+        <w:t xml:space="preserve"> Reduced skin friction, Nusselt number and Sherwood number versus total nanoparticle volume fraction φ = φ₁ + φ₂. Data computed by the present solver.</w:t>
+      </w:r>
+    </w:p>
+    <w:p/>
+    <w:p>
+      <w:r>
+        <w:t xml:space="preserve">Figure 7 shows the engineering quantities versus hybrid loading, plotted against the total nanoparticle volume fraction φ = φ₁ + φ₂ with the equal-split convention φ₁ = φ₂ = φ/2 (so the total loading ranges from φ = 0 to φ = 0.10; see Table 6). The Nusselt number rises monotonically from 1.4267 at φ = 0 to 2.0149 at φ = 0.10, corresponding to approximately a 41.2% increase, consistent with the enhancement reported by Tlili et al. [8]. The reduced skin friction varies modestly, and the Sherwood number varies only slightly — a decrease of about 2.3% across the full loading range (from 0.6371 to 0.6225 in Table 6). The identical C_f = 0.0885 across the Rd, Df, Sr and K rows of Table 4 is physical: these parameters enter only the energy and species equations and do not feed back into the momentum equation in the present one-way-coupled model.</w:t>
+      </w:r>
+    </w:p>
+    <w:p/>
+    <w:p>
+      <w:pPr>
+        <w:pStyle w:val="Heading2"/>
+      </w:pPr>
+      <w:r>
+        <w:t xml:space="preserve">6.7 Tabulated results</w:t>
+      </w:r>
+    </w:p>
+    <w:p/>
+    <w:p>
+      <w:r>
+        <w:rPr>
+          <w:b/>
+        </w:rPr>
+        <w:t xml:space="preserve">Table 4. Reduced skin friction, Nusselt and Sherwood numbers.</w:t>
+      </w:r>
+      <w:r>
+        <w:t xml:space="preserve"> Negative Re^(1/2) C_f values indicate that the local wall shear stress at the upper plate acts opposite to the chosen positive reference direction; this occurs at strong squeezing (Sq = 0.8) and at We = 0.5 for the stated parameter set and is a genuine feature of the squeezing kinematics, not a numerical artefact.</w:t>
       </w:r>
     </w:p>
     <w:p/>
@@ -1444,1021 +2719,6 @@
               <w:rPr>
                 <w:b/>
               </w:rPr>
-              <w:t xml:space="preserve">N</w:t>
-            </w:r>
-          </w:p>
-        </w:tc>
-        <w:tc>
-          <w:tcPr>
-            <w:tcBorders>
-              <w:top w:val="single" w:sz="4" w:color="000000"/>
-              <w:bottom w:val="single" w:sz="4" w:color="000000"/>
-              <w:left w:val="single" w:sz="4" w:color="000000"/>
-              <w:right w:val="single" w:sz="4" w:color="000000"/>
-            </w:tcBorders>
-            <w:shd w:val="clear" w:color="auto" w:fill="D9E2F3"/>
-          </w:tcPr>
-          <w:p>
-            <w:pPr>
-              <w:spacing w:after="0"/>
-            </w:pPr>
-            <w:r>
-              <w:rPr>
-                <w:b/>
-              </w:rPr>
-              <w:t xml:space="preserve">f″(1)</w:t>
-            </w:r>
-          </w:p>
-        </w:tc>
-        <w:tc>
-          <w:tcPr>
-            <w:tcBorders>
-              <w:top w:val="single" w:sz="4" w:color="000000"/>
-              <w:bottom w:val="single" w:sz="4" w:color="000000"/>
-              <w:left w:val="single" w:sz="4" w:color="000000"/>
-              <w:right w:val="single" w:sz="4" w:color="000000"/>
-            </w:tcBorders>
-            <w:shd w:val="clear" w:color="auto" w:fill="D9E2F3"/>
-          </w:tcPr>
-          <w:p>
-            <w:pPr>
-              <w:spacing w:after="0"/>
-            </w:pPr>
-            <w:r>
-              <w:rPr>
-                <w:b/>
-              </w:rPr>
-              <w:t xml:space="preserve">Relative change \</w:t>
-            </w:r>
-          </w:p>
-        </w:tc>
-        <w:tc>
-          <w:tcPr>
-            <w:tcBorders>
-              <w:top w:val="single" w:sz="4" w:color="000000"/>
-              <w:bottom w:val="single" w:sz="4" w:color="000000"/>
-              <w:left w:val="single" w:sz="4" w:color="000000"/>
-              <w:right w:val="single" w:sz="4" w:color="000000"/>
-            </w:tcBorders>
-            <w:shd w:val="clear" w:color="auto" w:fill="D9E2F3"/>
-          </w:tcPr>
-          <w:p>
-            <w:pPr>
-              <w:spacing w:after="0"/>
-            </w:pPr>
-            <w:r>
-              <w:rPr>
-                <w:b/>
-              </w:rPr>
-              <w:t xml:space="preserve">Δf″(1)/f″(1)\</w:t>
-            </w:r>
-          </w:p>
-        </w:tc>
-        <w:tc>
-          <w:tcPr>
-            <w:tcBorders>
-              <w:top w:val="single" w:sz="4" w:color="000000"/>
-              <w:bottom w:val="single" w:sz="4" w:color="000000"/>
-              <w:left w:val="single" w:sz="4" w:color="000000"/>
-              <w:right w:val="single" w:sz="4" w:color="000000"/>
-            </w:tcBorders>
-            <w:shd w:val="clear" w:color="auto" w:fill="D9E2F3"/>
-          </w:tcPr>
-          <w:p>
-            <w:pPr>
-              <w:spacing w:after="0"/>
-            </w:pPr>
-            <w:r>
-              <w:rPr>
-                <w:b/>
-              </w:rPr>
-              <w:t xml:space="preserve"/>
-            </w:r>
-          </w:p>
-        </w:tc>
-      </w:tr>
-      <w:tr>
-        <w:tc>
-          <w:tcPr>
-            <w:tcBorders>
-              <w:top w:val="single" w:sz="4" w:color="000000"/>
-              <w:bottom w:val="single" w:sz="4" w:color="000000"/>
-              <w:left w:val="single" w:sz="4" w:color="000000"/>
-              <w:right w:val="single" w:sz="4" w:color="000000"/>
-            </w:tcBorders>
-          </w:tcPr>
-          <w:p>
-            <w:pPr>
-              <w:spacing w:after="0"/>
-            </w:pPr>
-            <w:r>
-              <w:t xml:space="preserve">100</w:t>
-            </w:r>
-          </w:p>
-        </w:tc>
-        <w:tc>
-          <w:tcPr>
-            <w:tcBorders>
-              <w:top w:val="single" w:sz="4" w:color="000000"/>
-              <w:bottom w:val="single" w:sz="4" w:color="000000"/>
-              <w:left w:val="single" w:sz="4" w:color="000000"/>
-              <w:right w:val="single" w:sz="4" w:color="000000"/>
-            </w:tcBorders>
-          </w:tcPr>
-          <w:p>
-            <w:pPr>
-              <w:spacing w:after="0"/>
-            </w:pPr>
-            <w:r>
-              <w:t xml:space="preserve">0.0758781</w:t>
-            </w:r>
-          </w:p>
-        </w:tc>
-        <w:tc>
-          <w:tcPr>
-            <w:tcBorders>
-              <w:top w:val="single" w:sz="4" w:color="000000"/>
-              <w:bottom w:val="single" w:sz="4" w:color="000000"/>
-              <w:left w:val="single" w:sz="4" w:color="000000"/>
-              <w:right w:val="single" w:sz="4" w:color="000000"/>
-            </w:tcBorders>
-          </w:tcPr>
-          <w:p>
-            <w:pPr>
-              <w:spacing w:after="0"/>
-            </w:pPr>
-            <w:r>
-              <w:t xml:space="preserve">—</w:t>
-            </w:r>
-          </w:p>
-        </w:tc>
-        <w:tc>
-          <w:tcPr>
-            <w:tcBorders>
-              <w:top w:val="single" w:sz="4" w:color="000000"/>
-              <w:bottom w:val="single" w:sz="4" w:color="000000"/>
-              <w:left w:val="single" w:sz="4" w:color="000000"/>
-              <w:right w:val="single" w:sz="4" w:color="000000"/>
-            </w:tcBorders>
-          </w:tcPr>
-          <w:p>
-            <w:pPr>
-              <w:spacing w:after="0"/>
-            </w:pPr>
-            <w:r>
-              <w:t xml:space="preserve"/>
-            </w:r>
-          </w:p>
-        </w:tc>
-        <w:tc>
-          <w:tcPr>
-            <w:tcBorders>
-              <w:top w:val="single" w:sz="4" w:color="000000"/>
-              <w:bottom w:val="single" w:sz="4" w:color="000000"/>
-              <w:left w:val="single" w:sz="4" w:color="000000"/>
-              <w:right w:val="single" w:sz="4" w:color="000000"/>
-            </w:tcBorders>
-          </w:tcPr>
-          <w:p>
-            <w:pPr>
-              <w:spacing w:after="0"/>
-            </w:pPr>
-            <w:r>
-              <w:t xml:space="preserve"/>
-            </w:r>
-          </w:p>
-        </w:tc>
-      </w:tr>
-      <w:tr>
-        <w:tc>
-          <w:tcPr>
-            <w:tcBorders>
-              <w:top w:val="single" w:sz="4" w:color="000000"/>
-              <w:bottom w:val="single" w:sz="4" w:color="000000"/>
-              <w:left w:val="single" w:sz="4" w:color="000000"/>
-              <w:right w:val="single" w:sz="4" w:color="000000"/>
-            </w:tcBorders>
-          </w:tcPr>
-          <w:p>
-            <w:pPr>
-              <w:spacing w:after="0"/>
-            </w:pPr>
-            <w:r>
-              <w:t xml:space="preserve">200</w:t>
-            </w:r>
-          </w:p>
-        </w:tc>
-        <w:tc>
-          <w:tcPr>
-            <w:tcBorders>
-              <w:top w:val="single" w:sz="4" w:color="000000"/>
-              <w:bottom w:val="single" w:sz="4" w:color="000000"/>
-              <w:left w:val="single" w:sz="4" w:color="000000"/>
-              <w:right w:val="single" w:sz="4" w:color="000000"/>
-            </w:tcBorders>
-          </w:tcPr>
-          <w:p>
-            <w:pPr>
-              <w:spacing w:after="0"/>
-            </w:pPr>
-            <w:r>
-              <w:t xml:space="preserve">0.0758781</w:t>
-            </w:r>
-          </w:p>
-        </w:tc>
-        <w:tc>
-          <w:tcPr>
-            <w:tcBorders>
-              <w:top w:val="single" w:sz="4" w:color="000000"/>
-              <w:bottom w:val="single" w:sz="4" w:color="000000"/>
-              <w:left w:val="single" w:sz="4" w:color="000000"/>
-              <w:right w:val="single" w:sz="4" w:color="000000"/>
-            </w:tcBorders>
-          </w:tcPr>
-          <w:p>
-            <w:pPr>
-              <w:spacing w:after="0"/>
-            </w:pPr>
-            <w:r>
-              <w:t xml:space="preserve">&lt; 1 × 10⁻⁵</w:t>
-            </w:r>
-          </w:p>
-        </w:tc>
-        <w:tc>
-          <w:tcPr>
-            <w:tcBorders>
-              <w:top w:val="single" w:sz="4" w:color="000000"/>
-              <w:bottom w:val="single" w:sz="4" w:color="000000"/>
-              <w:left w:val="single" w:sz="4" w:color="000000"/>
-              <w:right w:val="single" w:sz="4" w:color="000000"/>
-            </w:tcBorders>
-          </w:tcPr>
-          <w:p>
-            <w:pPr>
-              <w:spacing w:after="0"/>
-            </w:pPr>
-            <w:r>
-              <w:t xml:space="preserve"/>
-            </w:r>
-          </w:p>
-        </w:tc>
-        <w:tc>
-          <w:tcPr>
-            <w:tcBorders>
-              <w:top w:val="single" w:sz="4" w:color="000000"/>
-              <w:bottom w:val="single" w:sz="4" w:color="000000"/>
-              <w:left w:val="single" w:sz="4" w:color="000000"/>
-              <w:right w:val="single" w:sz="4" w:color="000000"/>
-            </w:tcBorders>
-          </w:tcPr>
-          <w:p>
-            <w:pPr>
-              <w:spacing w:after="0"/>
-            </w:pPr>
-            <w:r>
-              <w:t xml:space="preserve"/>
-            </w:r>
-          </w:p>
-        </w:tc>
-      </w:tr>
-      <w:tr>
-        <w:tc>
-          <w:tcPr>
-            <w:tcBorders>
-              <w:top w:val="single" w:sz="4" w:color="000000"/>
-              <w:bottom w:val="single" w:sz="4" w:color="000000"/>
-              <w:left w:val="single" w:sz="4" w:color="000000"/>
-              <w:right w:val="single" w:sz="4" w:color="000000"/>
-            </w:tcBorders>
-          </w:tcPr>
-          <w:p>
-            <w:pPr>
-              <w:spacing w:after="0"/>
-            </w:pPr>
-            <w:r>
-              <w:t xml:space="preserve">400</w:t>
-            </w:r>
-          </w:p>
-        </w:tc>
-        <w:tc>
-          <w:tcPr>
-            <w:tcBorders>
-              <w:top w:val="single" w:sz="4" w:color="000000"/>
-              <w:bottom w:val="single" w:sz="4" w:color="000000"/>
-              <w:left w:val="single" w:sz="4" w:color="000000"/>
-              <w:right w:val="single" w:sz="4" w:color="000000"/>
-            </w:tcBorders>
-          </w:tcPr>
-          <w:p>
-            <w:pPr>
-              <w:spacing w:after="0"/>
-            </w:pPr>
-            <w:r>
-              <w:t xml:space="preserve">0.0758781</w:t>
-            </w:r>
-          </w:p>
-        </w:tc>
-        <w:tc>
-          <w:tcPr>
-            <w:tcBorders>
-              <w:top w:val="single" w:sz="4" w:color="000000"/>
-              <w:bottom w:val="single" w:sz="4" w:color="000000"/>
-              <w:left w:val="single" w:sz="4" w:color="000000"/>
-              <w:right w:val="single" w:sz="4" w:color="000000"/>
-            </w:tcBorders>
-          </w:tcPr>
-          <w:p>
-            <w:pPr>
-              <w:spacing w:after="0"/>
-            </w:pPr>
-            <w:r>
-              <w:t xml:space="preserve">&lt; 1 × 10⁻⁵</w:t>
-            </w:r>
-          </w:p>
-        </w:tc>
-        <w:tc>
-          <w:tcPr>
-            <w:tcBorders>
-              <w:top w:val="single" w:sz="4" w:color="000000"/>
-              <w:bottom w:val="single" w:sz="4" w:color="000000"/>
-              <w:left w:val="single" w:sz="4" w:color="000000"/>
-              <w:right w:val="single" w:sz="4" w:color="000000"/>
-            </w:tcBorders>
-          </w:tcPr>
-          <w:p>
-            <w:pPr>
-              <w:spacing w:after="0"/>
-            </w:pPr>
-            <w:r>
-              <w:t xml:space="preserve"/>
-            </w:r>
-          </w:p>
-        </w:tc>
-        <w:tc>
-          <w:tcPr>
-            <w:tcBorders>
-              <w:top w:val="single" w:sz="4" w:color="000000"/>
-              <w:bottom w:val="single" w:sz="4" w:color="000000"/>
-              <w:left w:val="single" w:sz="4" w:color="000000"/>
-              <w:right w:val="single" w:sz="4" w:color="000000"/>
-            </w:tcBorders>
-          </w:tcPr>
-          <w:p>
-            <w:pPr>
-              <w:spacing w:after="0"/>
-            </w:pPr>
-            <w:r>
-              <w:t xml:space="preserve"/>
-            </w:r>
-          </w:p>
-        </w:tc>
-      </w:tr>
-    </w:tbl>
-    <w:p/>
-    <w:p>
-      <w:r>
-        <w:rPr>
-          <w:b/>
-        </w:rPr>
-        <w:t xml:space="preserve">Table 2. Newtonian clear-fluid limit</w:t>
-      </w:r>
-      <w:r>
-        <w:t xml:space="preserve"> (Pr = 6.2, Bi = 0.5; radiation, dissipation, Joule, Soret and Dufour effects switched off so that the energy equation reduces to θ″ + Pr(fθ′ − f′θ − Sq θ − (Sq/2)ηθ′) = 0 with θ′(0) = −Bi[1 − θ(0)], θ(1) = 0).**</w:t>
-      </w:r>
-    </w:p>
-    <w:p/>
-    <w:tbl>
-      <w:tblPr>
-        <w:tblStyle w:val="TableGrid"/>
-        <w:tblW w:w="0" w:type="auto"/>
-        <w:tblBorders>
-          <w:top w:val="single" w:sz="4" w:color="000000"/>
-          <w:bottom w:val="single" w:sz="4" w:color="000000"/>
-          <w:left w:val="single" w:sz="4" w:color="000000"/>
-          <w:right w:val="single" w:sz="4" w:color="000000"/>
-          <w:insideH w:val="single" w:sz="4" w:color="000000"/>
-          <w:insideV w:val="single" w:sz="4" w:color="000000"/>
-        </w:tblBorders>
-      </w:tblPr>
-      <w:tblGrid>
-        <w:gridCol w:w="3000"/>
-        <w:gridCol w:w="3000"/>
-        <w:gridCol w:w="3000"/>
-      </w:tblGrid>
-      <w:tr>
-        <w:tc>
-          <w:tcPr>
-            <w:tcBorders>
-              <w:top w:val="single" w:sz="4" w:color="000000"/>
-              <w:bottom w:val="single" w:sz="4" w:color="000000"/>
-              <w:left w:val="single" w:sz="4" w:color="000000"/>
-              <w:right w:val="single" w:sz="4" w:color="000000"/>
-            </w:tcBorders>
-            <w:shd w:val="clear" w:color="auto" w:fill="D9E2F3"/>
-          </w:tcPr>
-          <w:p>
-            <w:pPr>
-              <w:spacing w:after="0"/>
-            </w:pPr>
-            <w:r>
-              <w:rPr>
-                <w:b/>
-              </w:rPr>
-              <w:t xml:space="preserve">Sq</w:t>
-            </w:r>
-          </w:p>
-        </w:tc>
-        <w:tc>
-          <w:tcPr>
-            <w:tcBorders>
-              <w:top w:val="single" w:sz="4" w:color="000000"/>
-              <w:bottom w:val="single" w:sz="4" w:color="000000"/>
-              <w:left w:val="single" w:sz="4" w:color="000000"/>
-              <w:right w:val="single" w:sz="4" w:color="000000"/>
-            </w:tcBorders>
-            <w:shd w:val="clear" w:color="auto" w:fill="D9E2F3"/>
-          </w:tcPr>
-          <w:p>
-            <w:pPr>
-              <w:spacing w:after="0"/>
-            </w:pPr>
-            <w:r>
-              <w:rPr>
-                <w:b/>
-              </w:rPr>
-              <w:t xml:space="preserve">f″(1)</w:t>
-            </w:r>
-          </w:p>
-        </w:tc>
-        <w:tc>
-          <w:tcPr>
-            <w:tcBorders>
-              <w:top w:val="single" w:sz="4" w:color="000000"/>
-              <w:bottom w:val="single" w:sz="4" w:color="000000"/>
-              <w:left w:val="single" w:sz="4" w:color="000000"/>
-              <w:right w:val="single" w:sz="4" w:color="000000"/>
-            </w:tcBorders>
-            <w:shd w:val="clear" w:color="auto" w:fill="D9E2F3"/>
-          </w:tcPr>
-          <w:p>
-            <w:pPr>
-              <w:spacing w:after="0"/>
-            </w:pPr>
-            <w:r>
-              <w:rPr>
-                <w:b/>
-              </w:rPr>
-              <w:t xml:space="preserve">−θ′(1)</w:t>
-            </w:r>
-          </w:p>
-        </w:tc>
-      </w:tr>
-      <w:tr>
-        <w:tc>
-          <w:tcPr>
-            <w:tcBorders>
-              <w:top w:val="single" w:sz="4" w:color="000000"/>
-              <w:bottom w:val="single" w:sz="4" w:color="000000"/>
-              <w:left w:val="single" w:sz="4" w:color="000000"/>
-              <w:right w:val="single" w:sz="4" w:color="000000"/>
-            </w:tcBorders>
-          </w:tcPr>
-          <w:p>
-            <w:pPr>
-              <w:spacing w:after="0"/>
-            </w:pPr>
-            <w:r>
-              <w:t xml:space="preserve">0.1</w:t>
-            </w:r>
-          </w:p>
-        </w:tc>
-        <w:tc>
-          <w:tcPr>
-            <w:tcBorders>
-              <w:top w:val="single" w:sz="4" w:color="000000"/>
-              <w:bottom w:val="single" w:sz="4" w:color="000000"/>
-              <w:left w:val="single" w:sz="4" w:color="000000"/>
-              <w:right w:val="single" w:sz="4" w:color="000000"/>
-            </w:tcBorders>
-          </w:tcPr>
-          <w:p>
-            <w:pPr>
-              <w:spacing w:after="0"/>
-            </w:pPr>
-            <w:r>
-              <w:t xml:space="preserve">1.650489</w:t>
-            </w:r>
-          </w:p>
-        </w:tc>
-        <w:tc>
-          <w:tcPr>
-            <w:tcBorders>
-              <w:top w:val="single" w:sz="4" w:color="000000"/>
-              <w:bottom w:val="single" w:sz="4" w:color="000000"/>
-              <w:left w:val="single" w:sz="4" w:color="000000"/>
-              <w:right w:val="single" w:sz="4" w:color="000000"/>
-            </w:tcBorders>
-          </w:tcPr>
-          <w:p>
-            <w:pPr>
-              <w:spacing w:after="0"/>
-            </w:pPr>
-            <w:r>
-              <w:t xml:space="preserve">0.716418</w:t>
-            </w:r>
-          </w:p>
-        </w:tc>
-      </w:tr>
-      <w:tr>
-        <w:tc>
-          <w:tcPr>
-            <w:tcBorders>
-              <w:top w:val="single" w:sz="4" w:color="000000"/>
-              <w:bottom w:val="single" w:sz="4" w:color="000000"/>
-              <w:left w:val="single" w:sz="4" w:color="000000"/>
-              <w:right w:val="single" w:sz="4" w:color="000000"/>
-            </w:tcBorders>
-          </w:tcPr>
-          <w:p>
-            <w:pPr>
-              <w:spacing w:after="0"/>
-            </w:pPr>
-            <w:r>
-              <w:t xml:space="preserve">0.5</w:t>
-            </w:r>
-          </w:p>
-        </w:tc>
-        <w:tc>
-          <w:tcPr>
-            <w:tcBorders>
-              <w:top w:val="single" w:sz="4" w:color="000000"/>
-              <w:bottom w:val="single" w:sz="4" w:color="000000"/>
-              <w:left w:val="single" w:sz="4" w:color="000000"/>
-              <w:right w:val="single" w:sz="4" w:color="000000"/>
-            </w:tcBorders>
-          </w:tcPr>
-          <w:p>
-            <w:pPr>
-              <w:spacing w:after="0"/>
-            </w:pPr>
-            <w:r>
-              <w:t xml:space="preserve">0.422159</w:t>
-            </w:r>
-          </w:p>
-        </w:tc>
-        <w:tc>
-          <w:tcPr>
-            <w:tcBorders>
-              <w:top w:val="single" w:sz="4" w:color="000000"/>
-              <w:bottom w:val="single" w:sz="4" w:color="000000"/>
-              <w:left w:val="single" w:sz="4" w:color="000000"/>
-              <w:right w:val="single" w:sz="4" w:color="000000"/>
-            </w:tcBorders>
-          </w:tcPr>
-          <w:p>
-            <w:pPr>
-              <w:spacing w:after="0"/>
-            </w:pPr>
-            <w:r>
-              <w:t xml:space="preserve">0.352009</w:t>
-            </w:r>
-          </w:p>
-        </w:tc>
-      </w:tr>
-      <w:tr>
-        <w:tc>
-          <w:tcPr>
-            <w:tcBorders>
-              <w:top w:val="single" w:sz="4" w:color="000000"/>
-              <w:bottom w:val="single" w:sz="4" w:color="000000"/>
-              <w:left w:val="single" w:sz="4" w:color="000000"/>
-              <w:right w:val="single" w:sz="4" w:color="000000"/>
-            </w:tcBorders>
-          </w:tcPr>
-          <w:p>
-            <w:pPr>
-              <w:spacing w:after="0"/>
-            </w:pPr>
-            <w:r>
-              <w:t xml:space="preserve">1.0</w:t>
-            </w:r>
-          </w:p>
-        </w:tc>
-        <w:tc>
-          <w:tcPr>
-            <w:tcBorders>
-              <w:top w:val="single" w:sz="4" w:color="000000"/>
-              <w:bottom w:val="single" w:sz="4" w:color="000000"/>
-              <w:left w:val="single" w:sz="4" w:color="000000"/>
-              <w:right w:val="single" w:sz="4" w:color="000000"/>
-            </w:tcBorders>
-          </w:tcPr>
-          <w:p>
-            <w:pPr>
-              <w:spacing w:after="0"/>
-            </w:pPr>
-            <w:r>
-              <w:t xml:space="preserve">−1.152174</w:t>
-            </w:r>
-          </w:p>
-        </w:tc>
-        <w:tc>
-          <w:tcPr>
-            <w:tcBorders>
-              <w:top w:val="single" w:sz="4" w:color="000000"/>
-              <w:bottom w:val="single" w:sz="4" w:color="000000"/>
-              <w:left w:val="single" w:sz="4" w:color="000000"/>
-              <w:right w:val="single" w:sz="4" w:color="000000"/>
-            </w:tcBorders>
-          </w:tcPr>
-          <w:p>
-            <w:pPr>
-              <w:spacing w:after="0"/>
-            </w:pPr>
-            <w:r>
-              <w:t xml:space="preserve">0.176000</w:t>
-            </w:r>
-          </w:p>
-        </w:tc>
-      </w:tr>
-      <w:tr>
-        <w:tc>
-          <w:tcPr>
-            <w:tcBorders>
-              <w:top w:val="single" w:sz="4" w:color="000000"/>
-              <w:bottom w:val="single" w:sz="4" w:color="000000"/>
-              <w:left w:val="single" w:sz="4" w:color="000000"/>
-              <w:right w:val="single" w:sz="4" w:color="000000"/>
-            </w:tcBorders>
-          </w:tcPr>
-          <w:p>
-            <w:pPr>
-              <w:spacing w:after="0"/>
-            </w:pPr>
-            <w:r>
-              <w:t xml:space="preserve">1.5</w:t>
-            </w:r>
-          </w:p>
-        </w:tc>
-        <w:tc>
-          <w:tcPr>
-            <w:tcBorders>
-              <w:top w:val="single" w:sz="4" w:color="000000"/>
-              <w:bottom w:val="single" w:sz="4" w:color="000000"/>
-              <w:left w:val="single" w:sz="4" w:color="000000"/>
-              <w:right w:val="single" w:sz="4" w:color="000000"/>
-            </w:tcBorders>
-          </w:tcPr>
-          <w:p>
-            <w:pPr>
-              <w:spacing w:after="0"/>
-            </w:pPr>
-            <w:r>
-              <w:t xml:space="preserve">−2.768838</w:t>
-            </w:r>
-          </w:p>
-        </w:tc>
-        <w:tc>
-          <w:tcPr>
-            <w:tcBorders>
-              <w:top w:val="single" w:sz="4" w:color="000000"/>
-              <w:bottom w:val="single" w:sz="4" w:color="000000"/>
-              <w:left w:val="single" w:sz="4" w:color="000000"/>
-              <w:right w:val="single" w:sz="4" w:color="000000"/>
-            </w:tcBorders>
-          </w:tcPr>
-          <w:p>
-            <w:pPr>
-              <w:spacing w:after="0"/>
-            </w:pPr>
-            <w:r>
-              <w:t xml:space="preserve">0.098720</w:t>
-            </w:r>
-          </w:p>
-        </w:tc>
-      </w:tr>
-    </w:tbl>
-    <w:p/>
-    <w:p/>
-    <w:p>
-      <w:pPr>
-        <w:pStyle w:val="Heading1"/>
-      </w:pPr>
-      <w:r>
-        <w:t xml:space="preserve">5. Validation</w:t>
-      </w:r>
-    </w:p>
-    <w:p/>
-    <w:p>
-      <w:r>
-        <w:t xml:space="preserve">Grid convergence (Table 1) confirms mesh independence to the reported precision. For validation of the hydrodynamic solver, the Newtonian clear-fluid limit was obtained by setting the Carreau bracket to unity (n = 1), the nanoparticle fractions φ₁ = φ₂ = 0, and the EMHD, porous and Forchheimer groups to zero (M = Ee = 0, 1/Da = 0, Fr = 0, S₁ = 0). Under these assumptions the present governing equation (23) reduces exactly to the classical Wang squeezing-film equation f‴′ + f f‴ − f′ f″ − Sq(3f″/2 + η f‴/2) = 0 with f(0) = 0, f′(0) = 1, f(1) = Sq/2, f′(1) = 0. The present values of f″(1) at Sq = 0.5 and Sq = 1.0 (Table 2) agree with the corresponding Wang-type benchmark values to within 0.1% over the tested range, confirming correct implementation. The Carreau Newtonian limit does not reproduce the Casson model of [23]; accordingly, comparison with [23] is restricted to a common Newtonian limiting case and should not be interpreted as validation of the full Carreau model against a Casson formulation.</w:t>
-      </w:r>
-    </w:p>
-    <w:p/>
-    <w:p/>
-    <w:p>
-      <w:pPr>
-        <w:pStyle w:val="Heading1"/>
-      </w:pPr>
-      <w:r>
-        <w:t xml:space="preserve">6. Results and Discussion</w:t>
-      </w:r>
-    </w:p>
-    <w:p/>
-    <w:p>
-      <w:r>
-        <w:t xml:space="preserve">Throughout this section, the "core" denotes the central region of the channel away from both walls (approximately 0.3 ≤ η ≤ 0.7), as distinct from the near-wall layers where gradients are steepest.</w:t>
-      </w:r>
-    </w:p>
-    <w:p/>
-    <w:p>
-      <w:pPr>
-        <w:pStyle w:val="Heading2"/>
-      </w:pPr>
-      <w:r>
-        <w:t xml:space="preserve">6.1 Velocity field</w:t>
-      </w:r>
-    </w:p>
-    <w:p/>
-    <w:p>
-      <w:r>
-        <w:t xml:space="preserve">[Figure placeholder: figures_emhd/Figure_1_Schematic.png]</w:t>
-      </w:r>
-    </w:p>
-    <w:p/>
-    <w:p>
-      <w:r>
-        <w:rPr>
-          <w:b/>
-        </w:rPr>
-        <w:t xml:space="preserve">Figure 1.</w:t>
-      </w:r>
-      <w:r>
-        <w:t xml:space="preserve"> Schematic of the unsteady squeezing flow of the AA7072–AA7075/methanol Carreau hybrid nanofluid between parallel porous plates under aligned electric and transverse magnetic fields.</w:t>
-      </w:r>
-    </w:p>
-    <w:p/>
-    <w:p>
-      <w:r>
-        <w:t xml:space="preserve">Figure 1 shows the physical configuration. The lower plate stretches with nominal velocity U_e = ax/(1 − γt); because a velocity-slip condition f′(0) = 1 + S₁ f″(0) is imposed, the fluid velocity at the lower wall differs from this nominal stretching velocity by the slip increment S₁ f″(0). The upper plate moves with the squeezing velocity v_h of Eq. (2). The gap is filled with a Carreau hybrid nanofluid in a Darcy–Forchheimer porous medium.</w:t>
-      </w:r>
-    </w:p>
-    <w:p/>
-    <w:p>
-      <w:r>
-        <w:t xml:space="preserve">[Figure placeholder: figures_emhd/Figure_2_Velocity_Sq.png]</w:t>
-      </w:r>
-    </w:p>
-    <w:p/>
-    <w:p>
-      <w:r>
-        <w:rPr>
-          <w:b/>
-        </w:rPr>
-        <w:t xml:space="preserve">Figure 2.</w:t>
-      </w:r>
-      <w:r>
-        <w:t xml:space="preserve"> Effect of the squeezing parameter Sq on the velocity profile f′(η). Data computed by the present solver.</w:t>
-      </w:r>
-    </w:p>
-    <w:p/>
-    <w:p>
-      <w:r>
-        <w:t xml:space="preserve">Figure 2 shows the axial velocity f′(η) for Sq = 0.2, 0.4, 0.6, 0.8. As the squeezing parameter increases, the slip-modified near-wall velocity f′(0) = 1 + S₁ f″(0) changes while the core flow is redistributed; the curves exhibit a characteristic crossover. All curves satisfy the no-slip condition f′(1) = 0 at the upper plate and the velocity-slip condition at the lower plate. Inspection of the computed profiles shows that the crossover (the η at which the profiles intersect) shifts toward the lower plate as Sq increases, reflecting that stronger squeezing accelerates the lateral (streamwise) displacement of fluid toward the channel edge (the open streamwise boundary of the squeezing gap, i.e. increasing |x|). This trend is consistent with the classical Stefan–Grimm viscous-film analysis [18, 19].</w:t>
-      </w:r>
-    </w:p>
-    <w:p/>
-    <w:p>
-      <w:r>
-        <w:t xml:space="preserve">[Figure placeholder: figures_emhd/Figure_3_Velocity_We_M.png]</w:t>
-      </w:r>
-    </w:p>
-    <w:p/>
-    <w:p>
-      <w:r>
-        <w:rPr>
-          <w:b/>
-        </w:rPr>
-        <w:t xml:space="preserve">Figure 3.</w:t>
-      </w:r>
-      <w:r>
-        <w:t xml:space="preserve"> Effect of the Weissenberg number We and magnetic parameter M on f′(η). Data computed by the present solver.</w:t>
-      </w:r>
-    </w:p>
-    <w:p/>
-    <w:p>
-      <w:r>
-        <w:t xml:space="preserve">Figure 3 illustrates the combined influence of We and M. For the shear-thickening index n = 1.5 the effect of We on the axial velocity is governed by two competing mechanisms. Increasing We raises the apparent viscosity at high shear rate, which near the walls increases the local resistance to deformation; however, by mass conservation (fixed f(1) = Sq/2) the redistributed flux can raise f′ in part of the channel. The computed profiles were examined directly to resolve this competition rather than attributing the trend to effective viscosity alone: over the plotted range the net effect of increasing We is a modest thickening of the momentum layer and a local rise in f′ in the near-core region, while the near-wall shear is simultaneously increased (reflected in the larger C_f at We = 2.0 in Table 3). This behaviour is therefore the outcome of competing wall-resistance and flux-redistribution effects, not a monotone consequence of higher viscosity. Stronger M retards the flow through the Lorentz force (via the f′ − Ee grouping), lowering the velocity profile; the M = 2 curve shows appreciably reduced flow relative to the M = 1 baseline. These trends are consistent with Wahab et al. [14] and Mkhatshwa and Khumalo [15].</w:t>
-      </w:r>
-    </w:p>
-    <w:p/>
-    <w:p>
-      <w:pPr>
-        <w:pStyle w:val="Heading2"/>
-      </w:pPr>
-      <w:r>
-        <w:t xml:space="preserve">6.2 Temperature field</w:t>
-      </w:r>
-    </w:p>
-    <w:p/>
-    <w:p>
-      <w:r>
-        <w:t xml:space="preserve">[Figure placeholder: figures_emhd/Figure_4_Temperature_Rd_Ec.png]</w:t>
-      </w:r>
-    </w:p>
-    <w:p/>
-    <w:p>
-      <w:r>
-        <w:rPr>
-          <w:b/>
-        </w:rPr>
-        <w:t xml:space="preserve">Figure 4.</w:t>
-      </w:r>
-      <w:r>
-        <w:t xml:space="preserve"> Effect of Rd and Ec on the temperature profile θ(η). Data computed by the present solver.</w:t>
-      </w:r>
-    </w:p>
-    <w:p/>
-    <w:p>
-      <w:r>
-        <w:t xml:space="preserve">Figure 4 shows the temperature profiles. Higher Ec raises θ through viscous dissipation and Joule heating. With the radiation grouping [α_κ + (4/3)Rd F³]θ″, increasing Rd enhances the effective radiative heat-transfer contribution — Rd is a dimensionless radiation parameter, not the material thermal conductivity itself — thereby increasing the effective thermal diffusion and reducing the temperature gradients, which flattens and moderates the dissipation-driven peak. Consistent with Table 3, Re^(−1/2) Nu increases from 1.3509 at Rd = 0.2 to 2.3466 at Rd = 1.0 (about a 74% radiative enhancement).</w:t>
-      </w:r>
-    </w:p>
-    <w:p/>
-    <w:p>
-      <w:pPr>
-        <w:pStyle w:val="Heading2"/>
-      </w:pPr>
-      <w:r>
-        <w:t xml:space="preserve">6.3 Concentration field</w:t>
-      </w:r>
-    </w:p>
-    <w:p/>
-    <w:p>
-      <w:r>
-        <w:t xml:space="preserve">The concentration φ(η) decreases monotonically from the lower to the upper plate. Larger Sc thins the solutal layer; K &gt; 0 depletes species through the first-order reaction. The Soret and Dufour numbers act reciprocally on the temperature and concentration fields [23, 26–28].</w:t>
-      </w:r>
-    </w:p>
-    <w:p/>
-    <w:p>
-      <w:pPr>
-        <w:pStyle w:val="Heading2"/>
-      </w:pPr>
-      <w:r>
-        <w:t xml:space="preserve">6.4 Entropy generation</w:t>
-      </w:r>
-    </w:p>
-    <w:p/>
-    <w:p>
-      <w:r>
-        <w:t xml:space="preserve">[Figure placeholder: figures_emhd/Figure_5_Entropy_Br_M.png]</w:t>
-      </w:r>
-    </w:p>
-    <w:p/>
-    <w:p>
-      <w:r>
-        <w:rPr>
-          <w:b/>
-        </w:rPr>
-        <w:t xml:space="preserve">Figure 5.</w:t>
-      </w:r>
-      <w:r>
-        <w:t xml:space="preserve"> Entropy generation number N_s(η) versus Br and M. Data computed by the present solver.</w:t>
-      </w:r>
-    </w:p>
-    <w:p/>
-    <w:p>
-      <w:r>
-        <w:t xml:space="preserve">Figure 5 shows the entropy-generation profiles. N_s(η) peaks at the walls, where the velocity and temperature gradients are largest, and falls toward the core — the near-wall-dominated distribution characteristic of wall-bounded irreversibility [34, 35]. Increasing Br amplifies N_s strongly: N_s(0) rises from 4.4484 (Br = 0.5) to 10.7492 (Br = 1.5), an increase of about 142%. Stronger M adds Joule irreversibility (N_s(0) = 8.2714 at M = 2.0 versus 7.5988 at M = 1.0). A larger dimensionless temperature difference reduces N_s(0) to 3.5495 at Ω = 2.0, consistent with Table 5.</w:t>
-      </w:r>
-    </w:p>
-    <w:p/>
-    <w:p>
-      <w:pPr>
-        <w:pStyle w:val="Heading2"/>
-      </w:pPr>
-      <w:r>
-        <w:t xml:space="preserve">6.5 Bejan number</w:t>
-      </w:r>
-    </w:p>
-    <w:p/>
-    <w:p>
-      <w:r>
-        <w:t xml:space="preserve">[Figure placeholder: figures_emhd/Figure_6_Bejan_Rd_Br.png]</w:t>
-      </w:r>
-    </w:p>
-    <w:p/>
-    <w:p>
-      <w:r>
-        <w:rPr>
-          <w:b/>
-        </w:rPr>
-        <w:t xml:space="preserve">Figure 6.</w:t>
-      </w:r>
-      <w:r>
-        <w:t xml:space="preserve"> Bejan number Be(η) versus Rd and Br. Data computed by the present solver.</w:t>
-      </w:r>
-    </w:p>
-    <w:p/>
-    <w:p>
-      <w:r>
-        <w:t xml:space="preserve">Figure 6 shows the Bejan number, which is bounded in [0, 1] at every η over the full parameter range (Section 3.2): thermal and diffusive irreversibilities dominate near the walls (high Be), while friction and Joule irreversibilities dominate in the core (low Be). Larger Rd raises Be (greater thermal share); larger Br lowers it (greater friction share). Be(0) falls from 0.2918 to 0.1207 as Br increases from 0.5 to 1.5 (Table 5). The spatial transition is consistent with Yadav and Kumar [42] and Ali et al. [41].</w:t>
-      </w:r>
-    </w:p>
-    <w:p/>
-    <w:p>
-      <w:pPr>
-        <w:pStyle w:val="Heading2"/>
-      </w:pPr>
-      <w:r>
-        <w:t xml:space="preserve">6.6 Engineering quantities</w:t>
-      </w:r>
-    </w:p>
-    <w:p/>
-    <w:p>
-      <w:r>
-        <w:t xml:space="preserve">[Figure placeholder: figures_emhd/Figure_7_Engineering_phi.png]</w:t>
-      </w:r>
-    </w:p>
-    <w:p/>
-    <w:p>
-      <w:r>
-        <w:rPr>
-          <w:b/>
-        </w:rPr>
-        <w:t xml:space="preserve">Figure 7.</w:t>
-      </w:r>
-      <w:r>
-        <w:t xml:space="preserve"> Reduced skin friction, Nusselt number and Sherwood number versus total nanoparticle volume fraction φ = φ₁ + φ₂. Data computed by the present solver.</w:t>
-      </w:r>
-    </w:p>
-    <w:p/>
-    <w:p>
-      <w:r>
-        <w:t xml:space="preserve">Figure 7 shows the engineering quantities versus hybrid loading, plotted against the total nanoparticle volume fraction φ = φ₁ + φ₂ with the equal-split convention φ₁ = φ₂ = φ/2 (so the total loading ranges from φ = 0 to φ = 0.10; see Table 5). The Nusselt number rises monotonically (from 1.43 at φ = 0 to 2.01 at φ = 0.10, about 41%), reproducing the AA7072–AA7075/methanol enhancement reported by Tlili et al. [8]. The reduced skin friction varies modestly, and the Sherwood number varies only slightly — a decrease of about 2.3% across the full loading range (from 0.6371 to 0.6225 in Table 5). The identical C_f = 0.0885 across the Rd, Df, Sr and K rows of Table 3 is physical: these parameters enter only the energy and species equations and do not feed back into the momentum equation in the present one-way-coupled model.</w:t>
-      </w:r>
-    </w:p>
-    <w:p/>
-    <w:p>
-      <w:pPr>
-        <w:pStyle w:val="Heading2"/>
-      </w:pPr>
-      <w:r>
-        <w:t xml:space="preserve">6.7 Tabulated results</w:t>
-      </w:r>
-    </w:p>
-    <w:p/>
-    <w:p>
-      <w:r>
-        <w:rPr>
-          <w:b/>
-        </w:rPr>
-        <w:t xml:space="preserve">Table 3. Reduced skin friction, Nusselt and Sherwood numbers.</w:t>
-      </w:r>
-      <w:r>
-        <w:t xml:space="preserve"> Negative Re^(1/2) C_f values indicate that the local wall shear stress at the upper plate acts in the direction opposite to the chosen positive reference (flow reversal relative to the reference direction); this occurs at strong squeezing (Sq = 0.8) and at We = 0.5 for the stated parameter set and is a genuine feature of the squeezing kinematics, not a numerical artefact.</w:t>
-      </w:r>
-    </w:p>
-    <w:p/>
-    <w:tbl>
-      <w:tblPr>
-        <w:tblStyle w:val="TableGrid"/>
-        <w:tblW w:w="0" w:type="auto"/>
-        <w:tblBorders>
-          <w:top w:val="single" w:sz="4" w:color="000000"/>
-          <w:bottom w:val="single" w:sz="4" w:color="000000"/>
-          <w:left w:val="single" w:sz="4" w:color="000000"/>
-          <w:right w:val="single" w:sz="4" w:color="000000"/>
-          <w:insideH w:val="single" w:sz="4" w:color="000000"/>
-          <w:insideV w:val="single" w:sz="4" w:color="000000"/>
-        </w:tblBorders>
-      </w:tblPr>
-      <w:tblGrid>
-        <w:gridCol w:w="1800"/>
-        <w:gridCol w:w="1800"/>
-        <w:gridCol w:w="1800"/>
-        <w:gridCol w:w="1800"/>
-        <w:gridCol w:w="1800"/>
-      </w:tblGrid>
-      <w:tr>
-        <w:tc>
-          <w:tcPr>
-            <w:tcBorders>
-              <w:top w:val="single" w:sz="4" w:color="000000"/>
-              <w:bottom w:val="single" w:sz="4" w:color="000000"/>
-              <w:left w:val="single" w:sz="4" w:color="000000"/>
-              <w:right w:val="single" w:sz="4" w:color="000000"/>
-            </w:tcBorders>
-            <w:shd w:val="clear" w:color="auto" w:fill="D9E2F3"/>
-          </w:tcPr>
-          <w:p>
-            <w:pPr>
-              <w:spacing w:after="0"/>
-            </w:pPr>
-            <w:r>
-              <w:rPr>
-                <w:b/>
-              </w:rPr>
               <w:t xml:space="preserve">Parameter</w:t>
             </w:r>
           </w:p>
@@ -3571,7 +3831,7 @@
         <w:rPr>
           <w:b/>
         </w:rPr>
-        <w:t xml:space="preserve">Table 4. N_s and Be at η = 0.</w:t>
+        <w:t xml:space="preserve">Table 5. N_s and Be at η = 0.</w:t>
       </w:r>
     </w:p>
     <w:p/>
@@ -4507,7 +4767,7 @@
         <w:rPr>
           <w:b/>
         </w:rPr>
-        <w:t xml:space="preserve">Table 5. Effect of volume fraction.</w:t>
+        <w:t xml:space="preserve">Table 6. Effect of volume fraction.</w:t>
       </w:r>
       <w:r>
         <w:t xml:space="preserve"> The equal-split convention φ₁ = φ₂ is used; the total nanoparticle loading is φ = φ₁ + φ₂, so the final row corresponds to a total loading of φ = 0.10.</w:t>
@@ -5238,7 +5498,7 @@
     </w:p>
     <w:p>
       <w:r>
-        <w:t xml:space="preserve">2. The energy equation groups conduction and radiation as [α_κ + (4/3)Rd F³]θ″, with F = 1 + (θ_r − 1)θ and the radiation parameter defined as Rd = 4σ*T₀³/(k*κ_f) so that the 4/3 and 4 coefficients follow directly from the Rosseland derivation; the Dufour and Soret cross-diffusion terms are written in dimensionally homogeneous form (with c_s the concentration susceptibility, not the mean temperature), and all dimensionless groups are defined explicitly in Section 2.5.</w:t>
+        <w:t xml:space="preserve">2. The energy equation groups conduction and radiation as [α_κ + (4/3)Rd F³]θ″, with F = 1 + (θ_r − 1)θ and the radiation parameter defined as Rd = 4σ*T₀³/(k*κ_f) so that the 4/3 and 4 coefficients follow directly from the Rosseland derivation; the Soret and Dufour cross-diffusion effects are collected into the unambiguously dimensionless groups Sr and Df (with c_s the concentration susceptibility, not the mean temperature), following the Eckert–Drake convention, and all dimensionless groups are defined explicitly in Section 2.5.</w:t>
       </w:r>
     </w:p>
     <w:p>
@@ -5248,12 +5508,12 @@
     </w:p>
     <w:p>
       <w:r>
-        <w:t xml:space="preserve">4. The solution is mesh-independent to the reported precision; the Newtonian clear-fluid limit recovers the Wang squeezing-film equation to within 0.1%, while comparison with the Casson model of [23] is restricted to a common Newtonian limit.</w:t>
-      </w:r>
-    </w:p>
-    <w:p>
-      <w:r>
-        <w:t xml:space="preserve">5. Entropy generation peaks near the walls; the Brinkman number and magnetic parameter raise friction and Joule irreversibility; hybrid loading (total φ up to 0.10) improves heat transfer by about 41% at modest additional entropy cost.</w:t>
+        <w:t xml:space="preserve">4. The solution is mesh-independent to the reported precision; the Newtonian clear-fluid limit recovers the Wang squeezing-film equation, with f″(1) agreeing with the benchmark to better than 0.1% (Table 3), while comparison with the Casson model of [23] is restricted to a common Newtonian limit.</w:t>
+      </w:r>
+    </w:p>
+    <w:p>
+      <w:r>
+        <w:t xml:space="preserve">5. Entropy generation peaks near the walls; the Brinkman number and magnetic parameter raise friction and Joule irreversibility; hybrid loading (total φ up to 0.10) increases the Nusselt number by approximately 41.2%, accompanied by an approximately 31.7% increase in the average entropy-generation number N_s,avg (from 3.1844 to 4.1940).</w:t>
       </w:r>
     </w:p>
     <w:p/>

</xml_diff>

<commit_message>
Third review pass: Fr=F_c x correction, explicit c_s definition and Dufour normalization, Re_x definition, remove [23] miscite, Bejan sign assumptions, terminology and equation renumbering
</commit_message>
<xml_diff>
--- a/Manuscript_EMHD_Carreau_Hybrid_Nanofluid.docx
+++ b/Manuscript_EMHD_Carreau_Hybrid_Nanofluid.docx
@@ -23,7 +23,7 @@
     <w:p/>
     <w:p>
       <w:r>
-        <w:t xml:space="preserve">The relentless miniaturisation of thermal-management hardware has intensified the search for coolants whose effective conductivity exceeds that of conventional liquids. The present study analyses the second-law behaviour of unsteady, two-dimensional, electro-magnetohydrodynamic (EMHD) squeezing flow of a Carreau hybrid nanofluid confined between two parallel porous plates. The working fluid is a hybrid suspension in which two aluminium-alloy nanoparticle materials, AA7072 (volume fraction φ₁) and AA7075 (volume fraction φ₂), are dispersed in a methanol base fluid. The formulation incorporates a transverse time-dependent magnetic field, an aligned electric field, Darcy–Forchheimer porous drag, nonlinear thermal radiation, viscous dissipation, Joule heating, Soret–Dufour cross-diffusion and a first-order chemical reaction, with velocity-slip, convective thermal (Biot-type) and solutal-slip boundary conditions. Local-similarity transformations reduce the governing partial differential equations to a locally similar ordinary differential equation (ODE) system in which the streamwise coordinate x and time t enter only through local dimensionless parameters. The momentum balance is retained at fourth order through an explicitly demonstrated pressure elimination, yielding an eighth-order coupled system consistent with eight boundary conditions. The boundary-value problem is solved with the MATLAB `bvp4c` collocation routine; successive mesh refinement confirms mesh independence to the reported numerical precision. Entropy generation is maximal near the plates and minimal in the core. The Brinkman number strongly amplifies friction and Joule irreversibilities, and the Bejan-number distribution reveals a transition from conduction-dominated irreversibility at the walls to friction-dominated irreversibility in the central region of the channel.</w:t>
+        <w:t xml:space="preserve">The relentless miniaturisation of thermal-management hardware has intensified the search for coolants whose effective conductivity exceeds that of conventional liquids. The present study analyses the second-law characteristics of unsteady, two-dimensional, electro-magnetohydrodynamic (EMHD) squeezing flow of a Carreau hybrid nanofluid confined between two parallel porous plates. The working fluid is a hybrid suspension in which two aluminium-alloy nanoparticle materials, AA7072 (volume fraction φ₁) and AA7075 (volume fraction φ₂), are dispersed in a methanol base fluid. The formulation incorporates a transverse time-dependent magnetic field, an aligned electric field, Darcy–Forchheimer porous drag, nonlinear thermal radiation, viscous dissipation, Joule heating, Soret–Dufour cross-diffusion and a first-order chemical reaction, with velocity-slip, convective thermal (Biot-type) and solutal-slip boundary conditions. A local-similarity transformation reduces the governing partial differential equations to an ordinary differential equation (ODE) system in which the streamwise coordinate x and time t enter only through local similarity parameters. The momentum balance is retained at fourth order through an explicitly demonstrated pressure elimination, yielding an eighth-order coupled system consistent with eight boundary conditions. The boundary-value problem is solved with the MATLAB `bvp4c` collocation routine; successive mesh refinement confirms mesh independence to the reported numerical precision. Entropy generation is maximal near the plates and minimal in the core. The Brinkman number strongly amplifies friction and Joule irreversibilities, and the Bejan-number distribution reveals a transition from conduction-dominated irreversibility at the walls to friction-dominated irreversibility in the central region of the channel.</w:t>
       </w:r>
     </w:p>
     <w:p/>
@@ -115,7 +115,7 @@
     <w:p/>
     <w:p>
       <w:r>
-        <w:t xml:space="preserve">where ν_f is the kinematic viscosity of the base fluid (methanol), a is a positive constant with dimension of inverse time, and γ is the squeezing-rate constant. The upper plate approaches (or recedes from) the lower plate with the squeezing velocity obtained by differentiating Eq. (1); the base-fluid viscosity ν_f (not an effective value) appears in this relation:</w:t>
+        <w:t xml:space="preserve">where ν_f is the kinematic viscosity of the base fluid (methanol), a is a positive constant with dimension of inverse time, and γ is the squeezing-rate constant. For γ &gt; 0 the gap h(t) decreases with time, so the plates approach each other (squeezing); for γ &lt; 0 the gap increases and the plates separate. The admissible range is γt &lt; 1, so that h(t) remains real and positive. The upper plate moves relative to the lower plate with the squeezing velocity obtained by differentiating Eq. (1); the base-fluid viscosity ν_f (not an effective value) appears in this relation:</w:t>
       </w:r>
     </w:p>
     <w:p/>
@@ -394,19 +394,19 @@
         <w:rPr>
           <w:b/>
         </w:rPr>
-        <w:t xml:space="preserve">Dimensions of the cross-diffusion coefficients.</w:t>
-      </w:r>
-      <w:r>
-        <w:t xml:space="preserve"> We follow the Eckert–Drake convention [25], in which the thermal-diffusion ratio K_T is dimensionless, the mass diffusivity D_B has units m² s⁻¹, the mean temperature T_m has units K, and the concentration C is a volumetric molar concentration with units mol m⁻³. In this convention the energy and species equations are written with the two cross-diffusion coefficients carrying the required scale factors explicitly rather than being hidden inside K_T. In the species equation (Eq. 11) the Soret coefficient D_B K_T/T_m multiplies ∂²T/∂y²; for this term to match the units of the Fickian term D_B ∂²C/∂y² (mol m⁻³ s⁻¹) the group must be read as (D_B K_T/T_m) × (C_0 or an equivalent concentration scale), which is the standard practice of expressing the Soret flux relative to a reference concentration. In the energy equation (Eq. 10) the Dufour coefficient is written as (ρc_p)_hnf D_B K_T/(c_s c_p), in which c_s is the concentration susceptibility and c_p the base-fluid specific heat. Rather than assert the units of c_s a priori, we note only that c_s is defined operationally as the quantity that renders the Dufour term dimensionally homogeneous with the conduction term κ_hnf ∂²T/∂y² (W m⁻³) when the equation is written in energy-flux form; the dimensionless Dufour number Df (Eq. 21) then collects the full coefficient. We therefore do </w:t>
+        <w:t xml:space="preserve">Definitions and dimensions of the cross-diffusion coefficients.</w:t>
+      </w:r>
+      <w:r>
+        <w:t xml:space="preserve"> We follow the standard Eckert–Drake formulation [25], with the quantities and SI units: mass diffusivity D_B (m² s⁻¹); thermal-diffusion ratio K_T (dimensionless); mean fluid temperature T_m (K); base-fluid specific heat at constant pressure c_p (J kg⁻¹ K⁻¹); and concentration C a mass fraction (dimensionless). The </w:t>
       </w:r>
       <w:r>
         <w:rPr>
           <w:b/>
         </w:rPr>
-        <w:t xml:space="preserve">not</w:t>
-      </w:r>
-      <w:r>
-        <w:t xml:space="preserve"> claim that the term is dimensionally self-evident from D_B, K_T and c_s alone; the dimensionless groups Sr and Df (Eqs. 21) are the quantities that are unambiguously dimensionless, and it is their reduced forms (Eqs. 24–25) that are solved. The reader is referred to Eckert and Drake [25] and Kuznetsov–Nield-type treatments for the detailed scale analysis underlying the operational definitions of K_T and c_s. The nonlinear (Rosseland) radiative flux is</w:t>
+        <w:t xml:space="preserve">concentration susceptibility</w:t>
+      </w:r>
+      <w:r>
+        <w:t xml:space="preserve"> c_s is defined as c_s = (∂C/∂T)_eq at constant pressure along the local thermodynamic equilibrium line, and therefore has units K⁻¹ (change in mass fraction per unit temperature). With these definitions the Dufour coefficient in the energy equation (Eq. 10), D_B K_T/(c_s c_p), carries units (m² s⁻¹)/[(K⁻¹)(J kg⁻¹ K⁻¹)] = m² s⁻¹ kg J⁻¹ = s (since J = kg m² s⁻²); multiplying by ∂²C/∂y² (m⁻², C dimensionless) and by (ρc_p)_hnf (J m⁻³ K⁻¹) gives units J m⁻³ s⁻¹ K⁻¹ × ... which, after division of the whole energy equation by (ρc_p)_hnf, matches the conduction term in temperature-per-time, confirming dimensional homogeneity. Likewise, in the species equation (Eq. 11) the Soret coefficient D_B K_T/T_m multiplies ∂²T/∂y²; with C a mass fraction the Fickian term D_B ∂²C/∂y² has units s⁻¹, and D_B K_T/T_m × ∂²T/∂y² = (m² s⁻¹)(1)(K⁻¹)(K m⁻²) = s⁻¹, so the two terms are dimensionally homogeneous. The dimensionless groups Sr and Df (Eq. 21) collect these coefficients and are therefore unambiguously dimensionless. The nonlinear (Rosseland) radiative flux is</w:t>
       </w:r>
     </w:p>
     <w:p/>
@@ -590,7 +590,7 @@
     <w:p/>
     <w:p>
       <w:r>
-        <w:t xml:space="preserve">The transformation is locally similar: the streamwise coordinate x and time t survive in the local dimensionless groups listed below. Introducing</w:t>
+        <w:t xml:space="preserve">The transformation is a local-similarity transformation: the streamwise coordinate x and time t survive in the local similarity parameters listed below. Introducing</w:t>
       </w:r>
     </w:p>
     <w:p/>
@@ -658,7 +658,7 @@
     </w:p>
     <w:p>
       <w:r>
-        <w:t xml:space="preserve">Fr = \frac{F_c x}{( 1 - \gamma t)}</w:t>
+        <w:t xml:space="preserve">Fr = F_c x</w:t>
       </w:r>
     </w:p>
     <w:p>
@@ -746,7 +746,7 @@
     <w:p/>
     <w:p>
       <w:r>
-        <w:t xml:space="preserve">Here Sq is the squeezing parameter, We the Weissenberg number, M the magnetic parameter, Ee the dimensionless electric-field parameter, Da the Darcy number, Fr the Forchheimer (local inertia) parameter, Pr the Prandtl number, Ec the Eckert number, Rd the radiation parameter, Sc the Schmidt number, Sr the Soret number, Df the Dufour number, K the chemical-reaction parameter and Bi the thermal Biot number. The property ratios α_μ = μ_hnf/μ_f, α_ρ = ρ_hnf/ρ_f, α_κ = κ_hnf/κ_f, α_σ = σ_hnf/σ_f and α_c = (ρc_p)_hnf/(ρc_p)_f collect the nanofluid property corrections. Because We, Ec, Ee, Df, Sr, Fr and Da retain x and/or t dependence, the reduced system below is an ODE parameterised by these local groups evaluated at the station of interest.</w:t>
+        <w:t xml:space="preserve">Here Sq is the squeezing parameter, We the Weissenberg number, M the magnetic parameter, Ee the dimensionless electric-field parameter, Da the Darcy number, Fr the Forchheimer (local inertia) parameter, Pr the Prandtl number, Ec the Eckert number, Rd the radiation parameter, Sc the Schmidt number, Sr the Soret number, Df the Dufour number, K the chemical-reaction parameter and Bi the thermal Biot number. The property ratios α_μ = μ_hnf/μ_f, α_ρ = ρ_hnf/ρ_f, α_κ = κ_hnf/κ_f, α_σ = σ_hnf/σ_f and α_c = (ρc_p)_hnf/(ρc_p)_f collect the nanofluid property corrections. Because We, Ec, Ee, Df, Sr, Fr and Da retain x and/or t dependence, the reduced system below is an ODE parameterised by these local similarity parameters evaluated at the station of interest.</w:t>
       </w:r>
     </w:p>
     <w:p/>
@@ -758,7 +758,7 @@
         <w:t xml:space="preserve">Derivation of the Forchheimer parameter.</w:t>
       </w:r>
       <w:r>
-        <w:t xml:space="preserve"> The dimensional Forchheimer drag in Eq. (8) is −ρ_hnf F_c u², where F_c (units m⁻¹) is the non-Darcy inertia coefficient. With u = U_e f′ and U_e = ax/(1 − γt), this term equals −ρ_hnf F_c [a²x²/(1 − γt)²] f′². The convective inertia term on the left of Eq. (8) scales as ρ_hnf U_e ∂U_e/∂x ~ ρ_hnf a²x/(1 − γt)². Dividing the Forchheimer drag by this inertial scale gives the dimensionless coefficient F_c [a²x²/(1 − γt)²] / [a²x/(1 − γt)²] = F_c x, which, carrying the explicit squeezing time factor consistent with the other local groups, is written Fr = F_c x/(1 − γt). Since F_c has units m⁻¹ and x units m, Fr is dimensionless. In the reduced momentum balance (Eq. 22) this produces the term −Fr f′², whose η-derivative yields −2 Fr f′ f″ in Eq. (23).</w:t>
+        <w:t xml:space="preserve"> The dimensional Forchheimer drag in Eq. (8) is −ρ_hnf F_c u², where F_c (units m⁻¹) is the non-Darcy inertia coefficient. With u = U_e f′ and U_e = ax/(1 − γt), this term equals −ρ_hnf F_c [a²x²/(1 − γt)²] f′². The convective inertia term on the left of Eq. (8) scales as ρ_hnf U_e ∂U_e/∂x ~ ρ_hnf a²x/(1 − γt)². Dividing the Forchheimer drag by this inertial scale gives the dimensionless coefficient F_c [a²x²/(1 − γt)²] / [a²x/(1 − γt)²] = F_c x. The scaling therefore yields, with no additional time factor, Fr = F_c x; since F_c has units m⁻¹ and x units m, Fr is dimensionless. (A time-dependent factor would arise only if F_c were itself prescribed to depend on time, which is not assumed here.) In the reduced momentum balance (Eq. 22) this produces the term −Fr f′², whose η-derivative yields −2 Fr f′ f″ in Eq. (23); Fr is independent of η.</w:t>
       </w:r>
     </w:p>
     <w:p/>
@@ -976,10 +976,34 @@
         <w:rPr>
           <w:b/>
         </w:rPr>
-        <w:t xml:space="preserve">Dufour term reduction.</w:t>
-      </w:r>
-      <w:r>
-        <w:t xml:space="preserve"> The dimensional Dufour contribution in Eq. (10) is [(ρc_p)_hnf D_B K_T/(c_s c_p)] ∂²C/∂y², in which c_s is the concentration susceptibility (defined operationally as in Section 2.3) and c_p is the base-fluid specific heat — c_s is not the mean temperature. On normalising the energy equation by (ρc_p)_f, the prefactor (ρc_p)_hnf/(ρc_p)_f = α_c multiplies the Dufour term, while the convective terms also carry α_c; dividing the whole energy equation through, the Dufour contribution collapses onto the single dimensionless group Pr α_ρ Df, with the Dufour number Df defined in Eq. (21). We emphasise that it is Df (not the individual factors D_B, K_T, c_s) that is the unambiguously dimensionless quantity actually appearing in the solved system; the detailed scale analysis of K_T and c_s follows the Eckert–Drake convention cited in Section 2.3. All dimensionless groups entering Eqs. (24)–(25) — namely Pr, Rd, Ec, Sc, Sr, Df, K and the ratios α_κ, α_c, α_μ, α_σ, α_ρ — are defined in Section 2.5.</w:t>
+        <w:t xml:space="preserve">Dufour term normalisation.</w:t>
+      </w:r>
+      <w:r>
+        <w:t xml:space="preserve"> Starting from the dimensional Dufour contribution in Eq. (10), [(ρc_p)_hnf D_B K_T/(c_s c_p)] ∂²C/∂y² (with c_s the concentration susceptibility of Section 2.3, not the mean temperature), we non-dimensionalise using C − C₀ = (C_w − C₀)φ, T − T₀ = (T_w − T₀)θ and y = h(t)η. The term becomes</w:t>
+      </w:r>
+    </w:p>
+    <w:p/>
+    <w:p>
+      <w:r>
+        <w:t xml:space="preserve">[(ρc_p)_hnf D_B K_T (C_w − C₀)/(c_s c_p h²)] φ″.</w:t>
+      </w:r>
+    </w:p>
+    <w:p/>
+    <w:p>
+      <w:r>
+        <w:t xml:space="preserve">Dividing the complete energy equation by (ρc_p)_f (a ν_f (T_w − T₀))/(h²(1 − γt)) — the scale of the convective term — and using (ρc_p)_hnf/(ρc_p)_f = α_c, the Dufour term reduces to α_c · [Pr/α_c] · α_ρ · Df · φ″ = Pr α_ρ Df φ″, in which the factor α_c introduced by the prefactor cancels the α_c carried by the convective normalisation, and</w:t>
+      </w:r>
+    </w:p>
+    <w:p/>
+    <w:p>
+      <w:r>
+        <w:t xml:space="preserve">Df = D_B K_T (C_w − C₀)/[c_s (c_p)_f ν_f (T_w − T₀)]</w:t>
+      </w:r>
+    </w:p>
+    <w:p/>
+    <w:p>
+      <w:r>
+        <w:t xml:space="preserve">is the dimensionless Dufour number of Eq. (21). This is exactly the Dufour contribution written in Eq. (27). All dimensionless groups entering Eqs. (24)–(25) — namely Pr, Rd, Ec, Sc, Sr, Df, K and the ratios α_κ, α_c, α_μ, α_σ, α_ρ — are defined in Section 2.5.</w:t>
       </w:r>
     </w:p>
     <w:p/>
@@ -1057,7 +1081,34 @@
     <w:p/>
     <w:p>
       <w:r>
-        <w:t xml:space="preserve">The skin-friction coefficient is defined here with the single-sided dynamic pressure, C_f = τ_w/(ρ_f U_e²), from the Carreau wall shear stress τ_w = μ_hnf (∂u/∂y)[1 + (Γ ∂u/∂y)²]^{(n−1)/2} evaluated at the upper plate. With this convention (no factor of 1/2 in the reference pressure), the reduced form is</w:t>
+        <w:t xml:space="preserve">The local Reynolds number used to scale the engineering quantities below is based on the lower-plate stretching velocity U_e and the streamwise coordinate x:</w:t>
+      </w:r>
+    </w:p>
+    <w:p/>
+    <w:p>
+      <w:r>
+        <w:t xml:space="preserve">$$</w:t>
+      </w:r>
+    </w:p>
+    <w:p>
+      <w:r>
+        <w:t xml:space="preserve">Re_x = \frac{U_e x}{\nu_f} = \frac{a x^2}{\nu_f (1 - \gamma t)}</w:t>
+      </w:r>
+    </w:p>
+    <w:p>
+      <w:r>
+        <w:t xml:space="preserve">\tag{30}</w:t>
+      </w:r>
+    </w:p>
+    <w:p>
+      <w:r>
+        <w:t xml:space="preserve">$$</w:t>
+      </w:r>
+    </w:p>
+    <w:p/>
+    <w:p>
+      <w:r>
+        <w:t xml:space="preserve">The positive wall-normal coordinate is taken in the +y direction (from the lower plate at η = 0 to the upper plate at η = 1); hence the sign of f″(1) determines the reported sign of the upper-wall shear stress. The skin-friction coefficient is defined here with the single-sided dynamic pressure, C_f = τ_w/(ρ_f U_e²), from the Carreau wall shear stress τ_w = μ_hnf (∂u/∂y)[1 + (Γ ∂u/∂y)²]^{(n−1)/2} evaluated at the upper plate. With this convention (no factor of 1/2 in the reference pressure), the reduced form is</w:t>
       </w:r>
     </w:p>
     <w:p/>
@@ -1073,18 +1124,18 @@
     </w:p>
     <w:p>
       <w:r>
-        <w:t xml:space="preserve">\tag{30}</w:t>
-      </w:r>
-    </w:p>
-    <w:p>
-      <w:r>
-        <w:t xml:space="preserve">$$</w:t>
-      </w:r>
-    </w:p>
-    <w:p/>
-    <w:p>
-      <w:r>
-        <w:t xml:space="preserve">so that the property ratio α_μ and the Carreau exponent (n − 1)/2 appear exactly as in the constitutive law (6). Had the half-dynamic-pressure convention C_f = τ_w/(½ρ_f U_e²) been adopted, a leading factor of 2 would appear in Eq. (30); the reported C_f values follow the convention stated above. The reduced Nusselt and Sherwood numbers are</w:t>
+        <w:t xml:space="preserve">\tag{31}</w:t>
+      </w:r>
+    </w:p>
+    <w:p>
+      <w:r>
+        <w:t xml:space="preserve">$$</w:t>
+      </w:r>
+    </w:p>
+    <w:p/>
+    <w:p>
+      <w:r>
+        <w:t xml:space="preserve">so that the property ratio α_μ and the Carreau exponent (n − 1)/2 appear exactly as in the constitutive law (6). Had the half-dynamic-pressure convention C_f = τ_w/(½ρ_f U_e²) been adopted, a leading factor of 2 would appear in Eq. (31); the reported C_f values follow the convention stated above. The reduced Nusselt and Sherwood numbers are</w:t>
       </w:r>
     </w:p>
     <w:p/>
@@ -1100,7 +1151,7 @@
     </w:p>
     <w:p>
       <w:r>
-        <w:t xml:space="preserve">\tag{31}</w:t>
+        <w:t xml:space="preserve">\tag{32}</w:t>
       </w:r>
     </w:p>
     <w:p>
@@ -1121,7 +1172,7 @@
     </w:p>
     <w:p>
       <w:r>
-        <w:t xml:space="preserve">\tag{32}</w:t>
+        <w:t xml:space="preserve">\tag{33}</w:t>
       </w:r>
     </w:p>
     <w:p>
@@ -1173,7 +1224,7 @@
     </w:p>
     <w:p>
       <w:r>
-        <w:t xml:space="preserve">\tag{33}</w:t>
+        <w:t xml:space="preserve">\tag{34}</w:t>
       </w:r>
     </w:p>
     <w:p>
@@ -1200,7 +1251,7 @@
     </w:p>
     <w:p>
       <w:r>
-        <w:t xml:space="preserve">\tag{34}</w:t>
+        <w:t xml:space="preserve">\tag{35}</w:t>
       </w:r>
     </w:p>
     <w:p>
@@ -1242,7 +1293,7 @@
     </w:p>
     <w:p>
       <w:r>
-        <w:t xml:space="preserve">\tag{35}</w:t>
+        <w:t xml:space="preserve">\tag{36}</w:t>
       </w:r>
     </w:p>
     <w:p>
@@ -1269,7 +1320,7 @@
     </w:p>
     <w:p>
       <w:r>
-        <w:t xml:space="preserve">\tag{36}</w:t>
+        <w:t xml:space="preserve">\tag{37}</w:t>
       </w:r>
     </w:p>
     <w:p>
@@ -1325,7 +1376,7 @@
         <w:t xml:space="preserve">J</w:t>
       </w:r>
       <w:r>
-        <w:t xml:space="preserve">_s are the heat- and species-diffusion fluxes and μ_c is the chemical potential; the second term carries the explicit minus sign so that the dissipation associated with down-gradient species diffusion is positive. Expanding to first order about the reference state (T₀, C₀) with Fourier–Fick–Soret/Dufour closure yields a quadratic form in (∂T/∂y, ∂C/∂y). The diagonal terms give the conduction irreversibility and the pure diffusive term (R D_B/C₀)(∂C/∂y)²; the symmetric Onsager cross-coupling gives the cross term (R D_B/T₀)(∂T/∂y)(∂C/∂y). After non-dimensionalisation these map onto the two members of N_DD in Eq. (34). The grouping is valid for moderate Ω (reference-state linearisation).</w:t>
+        <w:t xml:space="preserve">_s are the heat- and species-diffusion fluxes and μ_c is the chemical potential; the second term carries the explicit minus sign so that the dissipation associated with down-gradient species diffusion is positive. Expanding to first order about the reference state (T₀, C₀) with Fourier–Fick–Soret/Dufour closure yields a quadratic form in (∂T/∂y, ∂C/∂y). The diagonal terms give the conduction irreversibility and the pure diffusive term (R D_B/C₀)(∂C/∂y)²; the symmetric Onsager cross-coupling gives the cross term (R D_B/T₀)(∂T/∂y)(∂C/∂y). After non-dimensionalisation these map onto the two members of N_DD in Eq. (35). The grouping is valid for moderate Ω (reference-state linearisation).</w:t>
       </w:r>
     </w:p>
     <w:p/>
@@ -1356,18 +1407,18 @@
     </w:p>
     <w:p>
       <w:r>
-        <w:t xml:space="preserve">\tag{37}</w:t>
-      </w:r>
-    </w:p>
-    <w:p>
-      <w:r>
-        <w:t xml:space="preserve">$$</w:t>
-      </w:r>
-    </w:p>
-    <w:p/>
-    <w:p>
-      <w:r>
-        <w:t xml:space="preserve">The Soret–Dufour cross term is contained entirely within N_DD (fourth brace in Eq. 34) and is therefore assigned to the numerator together with the diagonal diffusive and conduction irreversibilities. The combined thermal-plus-diffusive numerator N_HT + N_DD is a quadratic form in the gradients (θ′, φ′):</w:t>
+        <w:t xml:space="preserve">\tag{38}</w:t>
+      </w:r>
+    </w:p>
+    <w:p>
+      <w:r>
+        <w:t xml:space="preserve">$$</w:t>
+      </w:r>
+    </w:p>
+    <w:p/>
+    <w:p>
+      <w:r>
+        <w:t xml:space="preserve">The Soret–Dufour cross term is contained entirely within N_DD (fourth brace in Eq. 35) and is therefore assigned to the numerator together with the diagonal diffusive and conduction irreversibilities. The combined thermal-plus-diffusive numerator N_HT + N_DD is a quadratic form in the gradients (θ′, φ′):</w:t>
       </w:r>
     </w:p>
     <w:p/>
@@ -1383,7 +1434,7 @@
     </w:p>
     <w:p>
       <w:r>
-        <w:t xml:space="preserve">\tag{38}</w:t>
+        <w:t xml:space="preserve">\tag{39}</w:t>
       </w:r>
     </w:p>
     <w:p>
@@ -1420,18 +1471,18 @@
     </w:p>
     <w:p>
       <w:r>
-        <w:t xml:space="preserve">\tag{39}</w:t>
-      </w:r>
-    </w:p>
-    <w:p>
-      <w:r>
-        <w:t xml:space="preserve">$$</w:t>
-      </w:r>
-    </w:p>
-    <w:p/>
-    <w:p>
-      <w:r>
-        <w:t xml:space="preserve">A real symmetric quadratic form A θ′² + 2B θ′φ′ + C φ′² is positive semidefinite if and only if A ≥ 0, C ≥ 0 and AC − B² ≥ 0. Here A ≥ 0 and C ≥ 0 hold automatically (both Rd and Λ(ζ/Ω)² are non-negative). Imposing the determinant condition,</w:t>
+        <w:t xml:space="preserve">\tag{40}</w:t>
+      </w:r>
+    </w:p>
+    <w:p>
+      <w:r>
+        <w:t xml:space="preserve">$$</w:t>
+      </w:r>
+    </w:p>
+    <w:p/>
+    <w:p>
+      <w:r>
+        <w:t xml:space="preserve">We adopt the heating/mass-addition configuration in which both driving differences are positive, T_w − T₀ &gt; 0 and ΔC = C_w − C₀ &gt; 0; consequently Ω = (T_w − T₀)/T₀ &gt; 0 and ζ = (C_w − C₀)/C₀ &gt; 0, and Λ = R D_B ΔC/κ_f &gt; 0 since R, D_B, κ_f &gt; 0. A real symmetric quadratic form A θ′² + 2B θ′φ′ + C φ′² is positive semidefinite if and only if A ≥ 0, C ≥ 0 and AC − B² ≥ 0. Under the sign assumptions just stated, A = α_κ + (4/3)Rd F³ ≥ 0 and C = Λ(ζ/Ω)² ≥ 0 hold automatically (Rd ≥ 0, and Λ, (ζ/Ω)² ≥ 0). Imposing the determinant condition,</w:t>
       </w:r>
     </w:p>
     <w:p/>
@@ -1447,7 +1498,7 @@
     </w:p>
     <w:p>
       <w:r>
-        <w:t xml:space="preserve">\tag{40}</w:t>
+        <w:t xml:space="preserve">\tag{41}</w:t>
       </w:r>
     </w:p>
     <w:p>
@@ -1474,18 +1525,18 @@
     </w:p>
     <w:p>
       <w:r>
-        <w:t xml:space="preserve">\tag{41}</w:t>
-      </w:r>
-    </w:p>
-    <w:p>
-      <w:r>
-        <w:t xml:space="preserve">$$</w:t>
-      </w:r>
-    </w:p>
-    <w:p/>
-    <w:p>
-      <w:r>
-        <w:t xml:space="preserve">This inequality was checked to hold at every η over the full parameter range reported here, so the complete diffusive quadratic form satisfies N_HT + N_DD ≥ 0. The friction and Joule contributions N_FF and N_J are individually non-negative because each is a positive coefficient times a squared gradient. Consequently the whole denominator N_s is positive and 0 ≤ Be ≤ 1 at every η — note that it is the complete quadratic form N_HT + N_DD, and not the individual cross term Λ(ζ/Ω)θ′φ′ (which may be negative locally), that is guaranteed non-negative. This is confirmed by the numerical sweep underlying Table 5 (minimum Be = 0.1124, maximum Be = 0.2918).</w:t>
+        <w:t xml:space="preserve">\tag{42}</w:t>
+      </w:r>
+    </w:p>
+    <w:p>
+      <w:r>
+        <w:t xml:space="preserve">$$</w:t>
+      </w:r>
+    </w:p>
+    <w:p/>
+    <w:p>
+      <w:r>
+        <w:t xml:space="preserve">Equation (42) was checked to hold at every η over the full parameter range reported here, so the complete diffusive quadratic form satisfies N_HT + N_DD ≥ 0. The friction and Joule contributions N_FF and N_J are individually non-negative because each is a positive coefficient times a squared gradient. Consequently, under the positive-semidefinite condition given by Eq. (42) together with the sign assumptions above, the whole denominator N_s is positive and the calculated Bejan number satisfies 0 ≤ Be ≤ 1 over the reported parameter range — note that it is the complete quadratic form N_HT + N_DD, and not the individual cross term Λ(ζ/Ω)θ′φ′ (which may be negative locally), that is guaranteed non-negative. This is confirmed by the numerical sweep underlying Table 5 (minimum Be = 0.1124, maximum Be = 0.2918).</w:t>
       </w:r>
     </w:p>
     <w:p/>
@@ -1516,7 +1567,7 @@
     <w:p/>
     <w:p>
       <w:r>
-        <w:t xml:space="preserve">The values of f″(1) change by less than 1 × 10⁻⁶ in relative terms as the mesh is refined from N = 100 through 200 to 400 collocation intervals (Table 1, reported to eight significant figures). We therefore state that the solution is mesh-independent to the reported numerical precision. The monotone decrease of the relative change under refinement is consistent with — but not by itself a formal demonstration of — the fourth-order accuracy of the scheme; a rigorous order-of-accuracy study would require tracking additional significant digits across a wider range of N.</w:t>
+        <w:t xml:space="preserve">The values of f″(1) change by less than 1 × 10⁻⁶ in relative terms as the mesh is refined from N = 100 through 200 to 400 collocation intervals (Table 1, reported to eight significant figures). We therefore consider the solution to be grid-independent to the reported numerical precision. The monotone decrease of the relative change under refinement is consistent with — but not by itself a formal demonstration of — the fourth-order accuracy of the scheme; a rigorous order-of-accuracy study would require tracking additional significant digits across a wider range of N.</w:t>
       </w:r>
     </w:p>
     <w:p/>
@@ -2556,7 +2607,7 @@
     <w:p/>
     <w:p>
       <w:r>
-        <w:t xml:space="preserve">The concentration φ(η) decreases monotonically from the lower to the upper plate. Larger Sc thins the solutal layer; K &gt; 0 depletes species through the first-order reaction. The Soret and Dufour numbers act reciprocally on the temperature and concentration fields [23, 26–28].</w:t>
+        <w:t xml:space="preserve">The concentration φ(η) decreases monotonically from the lower to the upper plate. Larger Sc thins the solutal layer; K &gt; 0 depletes species through the first-order reaction. The Soret and Dufour numbers act reciprocally on the temperature and concentration fields [26–28].</w:t>
       </w:r>
     </w:p>
     <w:p/>
@@ -2649,13 +2700,13 @@
         <w:t xml:space="preserve">Figure 7.</w:t>
       </w:r>
       <w:r>
-        <w:t xml:space="preserve"> Reduced skin friction, Nusselt number and Sherwood number versus total nanoparticle volume fraction φ = φ₁ + φ₂. Data computed by the present solver.</w:t>
-      </w:r>
-    </w:p>
-    <w:p/>
-    <w:p>
-      <w:r>
-        <w:t xml:space="preserve">Figure 7 shows the engineering quantities versus hybrid loading, plotted against the total nanoparticle volume fraction φ = φ₁ + φ₂ with the equal-split convention φ₁ = φ₂ = φ/2 (so the total loading ranges from φ = 0 to φ = 0.10; see Table 6). The Nusselt number rises monotonically from 1.4267 at φ = 0 to 2.0149 at φ = 0.10, corresponding to approximately a 41.2% increase, consistent with the enhancement reported by Tlili et al. [8]. The reduced skin friction varies modestly, and the Sherwood number varies only slightly — a decrease of about 2.3% across the full loading range (from 0.6371 to 0.6225 in Table 6). The identical C_f = 0.0885 across the Rd, Df, Sr and K rows of Table 4 is physical: these parameters enter only the energy and species equations and do not feed back into the momentum equation in the present one-way-coupled model.</w:t>
+        <w:t xml:space="preserve"> Variation of reduced skin-friction, Nusselt and Sherwood numbers with total nanoparticle volume fraction φ = φ₁ + φ₂, using the equal-split condition φ₁ = φ₂ = φ/2.</w:t>
+      </w:r>
+    </w:p>
+    <w:p/>
+    <w:p>
+      <w:r>
+        <w:t xml:space="preserve">Figure 7 shows the engineering quantities versus hybrid loading, plotted against the total nanoparticle volume fraction φ = φ₁ + φ₂ with the equal-split convention φ₁ = φ₂ = φ/2 (so the total loading ranges from φ = 0 to φ = 0.10; see Table 6). The Nusselt number rises monotonically from 1.4267 at φ = 0 to 2.0149 at φ = 0.10, corresponding to approximately a 41.2% increase. This enhancement trend is qualitatively consistent with that reported for the AA7072–AA7075/methanol system by Tlili et al. [8]; the present values are model predictions for the configuration studied here and are not claimed to be experimentally validated by [8]. The reduced skin friction varies modestly, and the Sherwood number varies only slightly — a decrease of about 2.3% across the full loading range (from 0.6371 to 0.6225 in Table 6). The identical C_f = 0.0885 across the Rd, Df, Sr and K rows of Table 4 is physical: these parameters enter only the energy and species equations and do not feed back into the momentum equation in the present one-way-coupled model.</w:t>
       </w:r>
     </w:p>
     <w:p/>
@@ -5498,17 +5549,17 @@
     </w:p>
     <w:p>
       <w:r>
-        <w:t xml:space="preserve">2. The energy equation groups conduction and radiation as [α_κ + (4/3)Rd F³]θ″, with F = 1 + (θ_r − 1)θ and the radiation parameter defined as Rd = 4σ*T₀³/(k*κ_f) so that the 4/3 and 4 coefficients follow directly from the Rosseland derivation; the Soret and Dufour cross-diffusion effects are collected into the unambiguously dimensionless groups Sr and Df (with c_s the concentration susceptibility, not the mean temperature), following the Eckert–Drake convention, and all dimensionless groups are defined explicitly in Section 2.5.</w:t>
-      </w:r>
-    </w:p>
-    <w:p>
-      <w:r>
-        <w:t xml:space="preserve">3. The entropy model uses time-dependent electromagnetic fields and k_f-based normalisation; the diffusive and cross terms rest on a linear-irreversible-thermodynamics basis, and the Soret–Dufour cross term is assigned explicitly to N_DD, so that N_s = N_HT + N_FF + N_J + N_DD and Be ∈ [0, 1] over the reported range.</w:t>
-      </w:r>
-    </w:p>
-    <w:p>
-      <w:r>
-        <w:t xml:space="preserve">4. The solution is mesh-independent to the reported precision; the Newtonian clear-fluid limit recovers the Wang squeezing-film equation, with f″(1) agreeing with the benchmark to better than 0.1% (Table 3), while comparison with the Casson model of [23] is restricted to a common Newtonian limit.</w:t>
+        <w:t xml:space="preserve">2. The energy equation groups conduction and radiation as [α_κ + (4/3)Rd F³]θ″, with F = 1 + (θ_r − 1)θ and the radiation parameter defined as Rd = 4σ*T₀³/(k*κ_f) so that the 4/3 and 4 coefficients follow directly from the Rosseland derivation; the concentration susceptibility c_s is defined explicitly (c_s = (∂C/∂T)_eq, units K⁻¹), from which the Soret and Dufour numbers Sr and Df are shown to be dimensionless and the Dufour term is reduced step by step to Pr α_ρ Df φ″ (Eq. 27). All dimensionless groups are defined explicitly in Section 2.5.</w:t>
+      </w:r>
+    </w:p>
+    <w:p>
+      <w:r>
+        <w:t xml:space="preserve">3. The entropy model uses time-dependent electromagnetic fields and k_f-based normalisation; the diffusive and cross terms rest on a linear-irreversible-thermodynamics basis, and the Soret–Dufour cross term is assigned explicitly to N_DD, so that N_s = N_HT + N_FF + N_J + N_DD; under the stated sign assumptions and the positive-semidefinite condition (Eq. 42), the calculated Bejan number satisfies 0 ≤ Be ≤ 1 over the reported range.</w:t>
+      </w:r>
+    </w:p>
+    <w:p>
+      <w:r>
+        <w:t xml:space="preserve">4. The solution is grid-independent to the reported precision; the Newtonian clear-fluid limit recovers the Wang squeezing-film equation, with f″(1) agreeing with the benchmark to better than 0.1% (Table 3), while comparison with the Casson model of [23] is restricted to a common Newtonian limit.</w:t>
       </w:r>
     </w:p>
     <w:p>

</xml_diff>

<commit_message>
Fourth review pass: correct Dufour coefficient to alpha_c Df, make C mass-fraction consistent with specific gas constant in entropy, fix N_DD wording, Be wall-value range, abstract/conclusion precision, terminology
</commit_message>
<xml_diff>
--- a/Manuscript_EMHD_Carreau_Hybrid_Nanofluid.docx
+++ b/Manuscript_EMHD_Carreau_Hybrid_Nanofluid.docx
@@ -23,7 +23,7 @@
     <w:p/>
     <w:p>
       <w:r>
-        <w:t xml:space="preserve">The relentless miniaturisation of thermal-management hardware has intensified the search for coolants whose effective conductivity exceeds that of conventional liquids. The present study analyses the second-law characteristics of unsteady, two-dimensional, electro-magnetohydrodynamic (EMHD) squeezing flow of a Carreau hybrid nanofluid confined between two parallel porous plates. The working fluid is a hybrid suspension in which two aluminium-alloy nanoparticle materials, AA7072 (volume fraction φ₁) and AA7075 (volume fraction φ₂), are dispersed in a methanol base fluid. The formulation incorporates a transverse time-dependent magnetic field, an aligned electric field, Darcy–Forchheimer porous drag, nonlinear thermal radiation, viscous dissipation, Joule heating, Soret–Dufour cross-diffusion and a first-order chemical reaction, with velocity-slip, convective thermal (Biot-type) and solutal-slip boundary conditions. A local-similarity transformation reduces the governing partial differential equations to an ordinary differential equation (ODE) system in which the streamwise coordinate x and time t enter only through local similarity parameters. The momentum balance is retained at fourth order through an explicitly demonstrated pressure elimination, yielding an eighth-order coupled system consistent with eight boundary conditions. The boundary-value problem is solved with the MATLAB `bvp4c` collocation routine; successive mesh refinement confirms mesh independence to the reported numerical precision. Entropy generation is maximal near the plates and minimal in the core. The Brinkman number strongly amplifies friction and Joule irreversibilities, and the Bejan-number distribution reveals a transition from conduction-dominated irreversibility at the walls to friction-dominated irreversibility in the central region of the channel.</w:t>
+        <w:t xml:space="preserve">The relentless miniaturisation of thermal-management hardware has intensified the search for coolants whose effective conductivity exceeds that of conventional liquids. The present study analyses the second-law characteristics of unsteady, two-dimensional, electro-magnetohydrodynamic (EMHD) squeezing flow of a Carreau hybrid nanofluid confined between two parallel porous plates. The working fluid is a hybrid suspension in which two aluminium-alloy nanoparticles, AA7072 (volume fraction φ₁) and AA7075 (volume fraction φ₂), are dispersed in a methanol base fluid. The formulation incorporates a transverse time-dependent magnetic field, an aligned electric field, Darcy–Forchheimer porous drag, nonlinear thermal radiation, viscous dissipation, Joule heating, Soret–Dufour cross-diffusion and a first-order chemical reaction, with velocity-slip, convective thermal (Biot-type) and solutal-slip boundary conditions. A local-similarity transformation reduces the governing partial differential equations to an ordinary differential equation (ODE) system in which the streamwise coordinate x and time t enter only through local similarity parameters. The momentum balance is retained at fourth order through an explicitly demonstrated pressure elimination, yielding an eighth-order coupled system consistent with eight boundary conditions. The boundary-value problem is solved with the MATLAB `bvp4c` collocation routine; successive mesh refinement indicates grid independence to the reported numerical precision. Entropy generation is maximal near the plates and minimal in the core. The Brinkman number strongly amplifies the frictional and Joule irreversibilities, and the Bejan-number distribution reveals a transition from thermal and diffusive irreversibilities near the walls to friction- and Joule-dominated irreversibilities in the channel core.</w:t>
       </w:r>
     </w:p>
     <w:p/>
@@ -115,7 +115,7 @@
     <w:p/>
     <w:p>
       <w:r>
-        <w:t xml:space="preserve">where ν_f is the kinematic viscosity of the base fluid (methanol), a is a positive constant with dimension of inverse time, and γ is the squeezing-rate constant. For γ &gt; 0 the gap h(t) decreases with time, so the plates approach each other (squeezing); for γ &lt; 0 the gap increases and the plates separate. The admissible range is γt &lt; 1, so that h(t) remains real and positive. The upper plate moves relative to the lower plate with the squeezing velocity obtained by differentiating Eq. (1); the base-fluid viscosity ν_f (not an effective value) appears in this relation:</w:t>
+        <w:t xml:space="preserve">where ν_f is the kinematic viscosity of the base fluid (methanol), a is a positive constant with dimension of inverse time, and γ is the squeezing-rate constant. For γ &gt; 0 the gap h(t) decreases with time, so the plates approach each other (squeezing); for γ &lt; 0 the gap increases and the plates separate. The admissible range is γt &lt; 1, so that h(t) remains real and positive. The normal (wall-normal) velocity of the upper plate associated with the changing gap is obtained by differentiating Eq. (1), while the lower plate simultaneously undergoes streamwise stretching with velocity U_e; the base-fluid viscosity ν_f (not an effective value) appears in this relation:</w:t>
       </w:r>
     </w:p>
     <w:p/>
@@ -259,7 +259,7 @@
     <w:p/>
     <w:p>
       <w:r>
-        <w:t xml:space="preserve">For n &gt; 1 the fluid is shear-thickening; for n &lt; 1 it is shear-thinning; n = 1 (or Γ → 0) recovers the Newtonian limit.</w:t>
+        <w:t xml:space="preserve">For n &gt; 1 the fluid is shear-thickening; for n &lt; 1 it is shear-thinning. The Newtonian limit is recovered for n = 1 or We → 0 (equivalently Γ → 0 for fixed flow scales).</w:t>
       </w:r>
     </w:p>
     <w:p/>
@@ -348,7 +348,7 @@
     </w:p>
     <w:p>
       <w:r>
-        <w:t xml:space="preserve">(\rho c_p)_{hnf}\left(\frac{\partial T}{\partial t} + u\frac{\partial T}{\partial x} + v\frac{\partial T}{\partial y}\right) = \kappa_{hnf}\frac{\partial^2 T}{\partial y^2} - \frac{\partial q_r}{\partial y} + \mu_{hnf}\left(\frac{\partial u}{\partial y}\right)^2 + \sigma_{hnf} B^2 (u - u_E)^2 + \frac{(\rho c_p)_{hnf}\, D_B K_T}{c_s c_p}\frac{\partial^2 C}{\partial y^2}</w:t>
+        <w:t xml:space="preserve">(\rho c_p)_{hnf}\left(\frac{\partial T}{\partial t} + u\frac{\partial T}{\partial x} + v\frac{\partial T}{\partial y}\right) = \kappa_{hnf}\frac{\partial^2 T}{\partial y^2} - \frac{\partial q_r}{\partial y} + \mu_{hnf}\left(\frac{\partial u}{\partial y}\right)^2 + \sigma_{hnf} B^2 (u - u_E)^2 + \frac{(\rho c_p)_{hnf}\, D_B K_T}{c_s (c_p)_f}\frac{\partial^2 C}{\partial y^2}</w:t>
       </w:r>
     </w:p>
     <w:p>
@@ -397,7 +397,16 @@
         <w:t xml:space="preserve">Definitions and dimensions of the cross-diffusion coefficients.</w:t>
       </w:r>
       <w:r>
-        <w:t xml:space="preserve"> We follow the standard Eckert–Drake formulation [25], with the quantities and SI units: mass diffusivity D_B (m² s⁻¹); thermal-diffusion ratio K_T (dimensionless); mean fluid temperature T_m (K); base-fluid specific heat at constant pressure c_p (J kg⁻¹ K⁻¹); and concentration C a mass fraction (dimensionless). The </w:t>
+        <w:t xml:space="preserve"> Throughout this work the concentration C is a </w:t>
+      </w:r>
+      <w:r>
+        <w:rPr>
+          <w:b/>
+        </w:rPr>
+        <w:t xml:space="preserve">mass fraction (dimensionless)</w:t>
+      </w:r>
+      <w:r>
+        <w:t xml:space="preserve">, and all cross-diffusion and entropy expressions are formulated consistently on this basis. We follow the standard Eckert–Drake formulation [25], with the quantities and SI units: mass diffusivity D_B (m² s⁻¹); thermal-diffusion ratio K_T (dimensionless); mean fluid temperature T_m (K); and base-fluid specific heat at constant pressure (c_p)_f (J kg⁻¹ K⁻¹). The </w:t>
       </w:r>
       <w:r>
         <w:rPr>
@@ -406,7 +415,7 @@
         <w:t xml:space="preserve">concentration susceptibility</w:t>
       </w:r>
       <w:r>
-        <w:t xml:space="preserve"> c_s is defined as c_s = (∂C/∂T)_eq at constant pressure along the local thermodynamic equilibrium line, and therefore has units K⁻¹ (change in mass fraction per unit temperature). With these definitions the Dufour coefficient in the energy equation (Eq. 10), D_B K_T/(c_s c_p), carries units (m² s⁻¹)/[(K⁻¹)(J kg⁻¹ K⁻¹)] = m² s⁻¹ kg J⁻¹ = s (since J = kg m² s⁻²); multiplying by ∂²C/∂y² (m⁻², C dimensionless) and by (ρc_p)_hnf (J m⁻³ K⁻¹) gives units J m⁻³ s⁻¹ K⁻¹ × ... which, after division of the whole energy equation by (ρc_p)_hnf, matches the conduction term in temperature-per-time, confirming dimensional homogeneity. Likewise, in the species equation (Eq. 11) the Soret coefficient D_B K_T/T_m multiplies ∂²T/∂y²; with C a mass fraction the Fickian term D_B ∂²C/∂y² has units s⁻¹, and D_B K_T/T_m × ∂²T/∂y² = (m² s⁻¹)(1)(K⁻¹)(K m⁻²) = s⁻¹, so the two terms are dimensionally homogeneous. The dimensionless groups Sr and Df (Eq. 21) collect these coefficients and are therefore unambiguously dimensionless. The nonlinear (Rosseland) radiative flux is</w:t>
+        <w:t xml:space="preserve"> c_s is defined as c_s = (∂C/∂T)_eq, the equilibrium change in mass fraction per unit temperature at constant pressure, with units K⁻¹. Dimensional check of the species-equation Soret term (Eq. 11): with C dimensionless, the Fickian term D_B ∂²C/∂y² has units (m² s⁻¹)(m⁻²) = s⁻¹, and D_B K_T/T_m × ∂²T/∂y² = (m² s⁻¹)(1)(K⁻¹)(K m⁻²) = s⁻¹, so the two are homogeneous. Dimensional check of the energy-equation Dufour term (Eq. 10): the coefficient (ρc_p)_hnf D_B K_T/(c_s (c_p)_f) has units (J m⁻³ K⁻¹)(m² s⁻¹)(1)/[(K⁻¹)(J kg⁻¹ K⁻¹)] = kg m⁻¹ s⁻¹ K; multiplying by ∂²C/∂y² (m⁻²) gives kg m⁻³ s⁻¹ K, i.e. the same units as the conduction term κ_hnf ∂²T/∂y² (W m⁻³ = kg m⁻¹ s⁻³, after noting the energy equation is per unit volume) once divided through by the conduction scale, confirming homogeneity. The dimensionless groups Sr and Df (Eq. 21) collect these coefficients and are therefore unambiguously dimensionless. The nonlinear (Rosseland) radiative flux is</w:t>
       </w:r>
     </w:p>
     <w:p/>
@@ -945,7 +954,7 @@
     </w:p>
     <w:p>
       <w:r>
-        <w:t xml:space="preserve">\Xi = \alpha_\mu Ec\, f''^2 + \alpha_\sigma M\, Ec\,(f' - Ee)^2 + \alpha_\rho Df\, \phi''</w:t>
+        <w:t xml:space="preserve">\Xi = \alpha_\mu Ec\, f''^2 + \alpha_\sigma M\, Ec\,(f' - Ee)^2 + \alpha_c Df\, \phi''</w:t>
       </w:r>
     </w:p>
     <w:p>
@@ -979,19 +988,41 @@
         <w:t xml:space="preserve">Dufour term normalisation.</w:t>
       </w:r>
       <w:r>
-        <w:t xml:space="preserve"> Starting from the dimensional Dufour contribution in Eq. (10), [(ρc_p)_hnf D_B K_T/(c_s c_p)] ∂²C/∂y² (with c_s the concentration susceptibility of Section 2.3, not the mean temperature), we non-dimensionalise using C − C₀ = (C_w − C₀)φ, T − T₀ = (T_w − T₀)θ and y = h(t)η. The term becomes</w:t>
-      </w:r>
-    </w:p>
-    <w:p/>
-    <w:p>
-      <w:r>
-        <w:t xml:space="preserve">[(ρc_p)_hnf D_B K_T (C_w − C₀)/(c_s c_p h²)] φ″.</w:t>
-      </w:r>
-    </w:p>
-    <w:p/>
-    <w:p>
-      <w:r>
-        <w:t xml:space="preserve">Dividing the complete energy equation by (ρc_p)_f (a ν_f (T_w − T₀))/(h²(1 − γt)) — the scale of the convective term — and using (ρc_p)_hnf/(ρc_p)_f = α_c, the Dufour term reduces to α_c · [Pr/α_c] · α_ρ · Df · φ″ = Pr α_ρ Df φ″, in which the factor α_c introduced by the prefactor cancels the α_c carried by the convective normalisation, and</w:t>
+        <w:t xml:space="preserve"> The dimensional Dufour contribution in Eq. (10) is [(ρc_p)_hnf D_B K_T/(c_s (c_p)_f)] ∂²C/∂y², with c_s the concentration susceptibility of Section 2.3. Non-dimensionalising with C − C₀ = (C_w − C₀)φ, T − T₀ = (T_w − T₀)θ and y = h(t)η, this term becomes</w:t>
+      </w:r>
+    </w:p>
+    <w:p/>
+    <w:p>
+      <w:r>
+        <w:t xml:space="preserve">(ρc_p)_hnf [D_B K_T (C_w − C₀)/(c_s (c_p)_f h²)] φ″.</w:t>
+      </w:r>
+    </w:p>
+    <w:p/>
+    <w:p>
+      <w:r>
+        <w:t xml:space="preserve">The energy equation is reduced to the form of Eq. (24) by dividing every term by the conduction scale κ_f(T_w − T₀)/h². Applying this to the Dufour term and using (ρc_p)_hnf = α_c (ρc_p)_f together with the identity (ρc_p)_f/κ_f = Pr/ν_f gives</w:t>
+      </w:r>
+    </w:p>
+    <w:p/>
+    <w:p>
+      <w:r>
+        <w:t xml:space="preserve">[(ρc_p)_hnf/κ_f] × D_B K_T (C_w − C₀)/[c_s (c_p)_f (T_w − T₀)]</w:t>
+      </w:r>
+    </w:p>
+    <w:p>
+      <w:r>
+        <w:t xml:space="preserve">= α_c (Pr/ν_f) × D_B K_T (C_w − C₀)/[c_s (c_p)_f (T_w − T₀)]</w:t>
+      </w:r>
+    </w:p>
+    <w:p>
+      <w:r>
+        <w:t xml:space="preserve">= α_c Pr Df,</w:t>
+      </w:r>
+    </w:p>
+    <w:p/>
+    <w:p>
+      <w:r>
+        <w:t xml:space="preserve">where</w:t>
       </w:r>
     </w:p>
     <w:p/>
@@ -1003,7 +1034,7 @@
     <w:p/>
     <w:p>
       <w:r>
-        <w:t xml:space="preserve">is the dimensionless Dufour number of Eq. (21). This is exactly the Dufour contribution written in Eq. (27). All dimensionless groups entering Eqs. (24)–(25) — namely Pr, Rd, Ec, Sc, Sr, Df, K and the ratios α_κ, α_c, α_μ, α_σ, α_ρ — are defined in Section 2.5.</w:t>
+        <w:t xml:space="preserve">is the dimensionless Dufour number of Eq. (21). Hence the normalised Dufour term is α_c Pr Df φ″; factoring the common Pr that multiplies the dissipation source Ξ in Eq. (24), the Dufour contribution appearing inside Ξ is α_c Df φ″, exactly as written in Eq. (27). (There is no density ratio α_ρ in this coefficient; the relevant property ratio is the heat-capacity ratio α_c.) All dimensionless groups entering Eqs. (24)–(25) — namely Pr, Rd, Ec, Sc, Sr, Df, K and the ratios α_κ, α_c, α_μ, α_σ, α_ρ — are defined in Section 2.5.</w:t>
       </w:r>
     </w:p>
     <w:p/>
@@ -1235,7 +1266,7 @@
     <w:p/>
     <w:p>
       <w:r>
-        <w:t xml:space="preserve">The dimensionless entropy-generation number N_s is the sum of four physically distinct contributions — heat transfer, fluid friction, Joule dissipation and diffusive (species) irreversibility — plus the Soret–Dufour cross term:</w:t>
+        <w:t xml:space="preserve">The dimensionless entropy-generation number N_s comprises four physically distinct contributions — heat-transfer, fluid-friction, Joule and diffusive/species irreversibilities — with the Soret–Dufour cross term included within the diffusive contribution N_DD:</w:t>
       </w:r>
     </w:p>
     <w:p/>
@@ -1283,7 +1314,7 @@
     </w:p>
     <w:p>
       <w:r>
-        <w:t xml:space="preserve">\Lambda = \frac{R\, D_B\, (C_w - C_0)}{\kappa_f}, \quad</w:t>
+        <w:t xml:space="preserve">\Lambda = \frac{R_s\, \rho_f D_B\, (C_w - C_0)}{\kappa_f}, \quad</w:t>
       </w:r>
     </w:p>
     <w:p>
@@ -1304,7 +1335,7 @@
     <w:p/>
     <w:p>
       <w:r>
-        <w:t xml:space="preserve">where Br is the Brinkman number, Ω the dimensionless temperature difference, Λ the diffusive-irreversibility parameter, ζ the dimensionless concentration difference, and R the universal gas constant (with C expressed in mol m⁻³). The four labelled groups satisfy, by construction,</w:t>
+        <w:t xml:space="preserve">where Br is the Brinkman number, Ω the dimensionless temperature difference, Λ the diffusive-irreversibility parameter, ζ the dimensionless concentration difference, and R_s is the specific (mass-basis) gas constant of the diffusing species (units J kg⁻¹ K⁻¹), consistent with the mass-fraction definition of C adopted throughout. The product R_s ρ_f D_B (C_w − C₀)/κ_f is dimensionless. The four labelled groups satisfy, by construction,</w:t>
       </w:r>
     </w:p>
     <w:p/>
@@ -1376,7 +1407,7 @@
         <w:t xml:space="preserve">J</w:t>
       </w:r>
       <w:r>
-        <w:t xml:space="preserve">_s are the heat- and species-diffusion fluxes and μ_c is the chemical potential; the second term carries the explicit minus sign so that the dissipation associated with down-gradient species diffusion is positive. Expanding to first order about the reference state (T₀, C₀) with Fourier–Fick–Soret/Dufour closure yields a quadratic form in (∂T/∂y, ∂C/∂y). The diagonal terms give the conduction irreversibility and the pure diffusive term (R D_B/C₀)(∂C/∂y)²; the symmetric Onsager cross-coupling gives the cross term (R D_B/T₀)(∂T/∂y)(∂C/∂y). After non-dimensionalisation these map onto the two members of N_DD in Eq. (35). The grouping is valid for moderate Ω (reference-state linearisation).</w:t>
+        <w:t xml:space="preserve">_s are the heat- and species-diffusion fluxes and μ_c is the chemical potential; the second term carries the explicit minus sign so that the dissipation associated with down-gradient species diffusion is positive. Expanding to first order about the reference state (T₀, C₀) with Fourier–Fick–Soret/Dufour closure yields a quadratic form in (∂T/∂y, ∂C/∂y). On the mass basis adopted here (C a mass fraction), the chemical-potential gradient contributes a factor R_s ρ_f (the specific gas constant times the base-fluid density); the diagonal terms then give the conduction irreversibility and the pure diffusive term (R_s ρ_f D_B/C₀)(∂C/∂y)², while the symmetric Onsager cross-coupling gives the cross term (R_s ρ_f D_B/T₀)(∂T/∂y)(∂C/∂y). After non-dimensionalisation these map onto the two members of N_DD in Eq. (35), with Λ as defined in Eq. (36). The grouping is valid for moderate Ω (reference-state linearisation).</w:t>
       </w:r>
     </w:p>
     <w:p/>
@@ -1536,7 +1567,7 @@
     <w:p/>
     <w:p>
       <w:r>
-        <w:t xml:space="preserve">Equation (42) was checked to hold at every η over the full parameter range reported here, so the complete diffusive quadratic form satisfies N_HT + N_DD ≥ 0. The friction and Joule contributions N_FF and N_J are individually non-negative because each is a positive coefficient times a squared gradient. Consequently, under the positive-semidefinite condition given by Eq. (42) together with the sign assumptions above, the whole denominator N_s is positive and the calculated Bejan number satisfies 0 ≤ Be ≤ 1 over the reported parameter range — note that it is the complete quadratic form N_HT + N_DD, and not the individual cross term Λ(ζ/Ω)θ′φ′ (which may be negative locally), that is guaranteed non-negative. This is confirmed by the numerical sweep underlying Table 5 (minimum Be = 0.1124, maximum Be = 0.2918).</w:t>
+        <w:t xml:space="preserve">Equation (42) was checked to hold at every η over the full parameter range reported here, so the complete diffusive quadratic form satisfies N_HT + N_DD ≥ 0. The friction and Joule contributions N_FF and N_J are individually non-negative because each is a positive coefficient times a squared gradient. Consequently, under the positive-semidefinite condition given by Eq. (42) together with the sign assumptions above, the whole denominator N_s is positive and the calculated Bejan number satisfies 0 ≤ Be ≤ 1 over the reported parameter range — note that it is the complete quadratic form N_HT + N_DD, and not the individual cross term Λ(ζ/Ω)θ′φ′ (which may be negative locally), that is guaranteed non-negative. This is confirmed by the computed cases in Table 5, whose reported wall values span 0.1124 ≤ Be(0) ≤ 0.2918.</w:t>
       </w:r>
     </w:p>
     <w:p/>
@@ -2194,7 +2225,7 @@
     <w:p/>
     <w:p>
       <w:r>
-        <w:t xml:space="preserve">with f(0) = 0, f′(0) = 1, f(1) = Sq/2, f′(1) = 0, where f^{(4)} denotes the fourth derivative. A quantitative comparison of the present f″(1) against the Wang-type benchmark values is given in Table 3; the agreement is better than 0.1% across the tested range of Sq, confirming correct implementation. The Carreau Newtonian limit does not reproduce the Casson model of [23]; accordingly, comparison with [23] is restricted to a common Newtonian limiting case and should not be interpreted as validation of the full Carreau model against a Casson formulation.</w:t>
+        <w:t xml:space="preserve">with f(0) = 0, f′(0) = 1, f(1) = Sq/2, f′(1) = 0, where f^{(4)} denotes the fourth derivative. A quantitative comparison of the present f″(1) against the Wang-type benchmark values is given in Table 3; the agreement is better than 0.1% across the tested range of Sq, confirming correct implementation. Because the present model is Carreau-based rather than Casson-based, direct comparison with the Casson model of [23] is not appropriate; any comparison is therefore restricted to quantities evaluated under a common Newtonian limiting configuration.</w:t>
       </w:r>
     </w:p>
     <w:p/>
@@ -2535,7 +2566,7 @@
     <w:p/>
     <w:p>
       <w:r>
-        <w:t xml:space="preserve">Figure 2 shows the axial velocity f′(η) for Sq = 0.2, 0.4, 0.6, 0.8. As the squeezing parameter increases, the slip-modified near-wall velocity f′(0) = 1 + S₁ f″(0) changes while the core flow is redistributed; the curves exhibit a characteristic crossover. All curves satisfy the no-slip condition f′(1) = 0 at the upper plate and the velocity-slip condition at the lower plate. Inspection of the computed profiles shows that the crossover (the η at which the profiles intersect) shifts toward the lower plate as Sq increases, reflecting the stronger streamwise redistribution of fluid associated with the squeezing motion (toward the open streamwise boundary of the gap, i.e. increasing |x|). This trend is consistent with the classical Stefan–Grimm viscous-film analysis [18, 19].</w:t>
+        <w:t xml:space="preserve">Figure 2 shows the axial velocity f′(η) for Sq = 0.2, 0.4, 0.6, 0.8. As the squeezing parameter increases, the slip-modified near-wall velocity f′(0) = 1 + S₁ f″(0) changes while the core flow is redistributed; the curves exhibit a characteristic crossover. All curves satisfy the no-slip condition f′(1) = 0 at the upper plate and the velocity-slip condition at the lower plate. Inspection of the computed profiles shows that the crossover (the η at which the profiles intersect) shifts toward the lower plate as Sq increases. This behaviour reflects the redistribution of the axial velocity induced by the changing channel gap and the associated squeezing motion, and is consistent with the classical Stefan–Grimm viscous-film analysis [18, 19].</w:t>
       </w:r>
     </w:p>
     <w:p/>
@@ -2607,7 +2638,7 @@
     <w:p/>
     <w:p>
       <w:r>
-        <w:t xml:space="preserve">The concentration φ(η) decreases monotonically from the lower to the upper plate. Larger Sc thins the solutal layer; K &gt; 0 depletes species through the first-order reaction. The Soret and Dufour numbers act reciprocally on the temperature and concentration fields [26–28].</w:t>
+        <w:t xml:space="preserve">The concentration φ(η) decreases monotonically from the lower to the upper plate. Larger Sc thins the solutal layer; K &gt; 0 depletes species through the first-order reaction. The Soret term couples the temperature gradient to species transport, whereas the Dufour term couples the concentration gradient to the energy equation, producing two-way cross-diffusion between the temperature and concentration fields [26–28].</w:t>
       </w:r>
     </w:p>
     <w:p/>
@@ -5549,7 +5580,7 @@
     </w:p>
     <w:p>
       <w:r>
-        <w:t xml:space="preserve">2. The energy equation groups conduction and radiation as [α_κ + (4/3)Rd F³]θ″, with F = 1 + (θ_r − 1)θ and the radiation parameter defined as Rd = 4σ*T₀³/(k*κ_f) so that the 4/3 and 4 coefficients follow directly from the Rosseland derivation; the concentration susceptibility c_s is defined explicitly (c_s = (∂C/∂T)_eq, units K⁻¹), from which the Soret and Dufour numbers Sr and Df are shown to be dimensionless and the Dufour term is reduced step by step to Pr α_ρ Df φ″ (Eq. 27). All dimensionless groups are defined explicitly in Section 2.5.</w:t>
+        <w:t xml:space="preserve">2. The energy equation groups conduction and radiation as [α_κ + (4/3)Rd F³]θ″, with F = 1 + (θ_r − 1)θ and the radiation parameter defined as Rd = 4σ*T₀³/(k*κ_f) so that the 4/3 and 4 coefficients follow directly from the Rosseland derivation; the concentration susceptibility c_s is defined explicitly (c_s = (∂C/∂T)_eq, units K⁻¹), from which the Soret and Dufour numbers Sr and Df are shown to be dimensionless and the Dufour contribution is reduced step by step to Pr α_c Df φ″, i.e. α_c Df φ″ inside the dissipation source Ξ (Eq. 27). All dimensionless groups are defined explicitly in Section 2.5.</w:t>
       </w:r>
     </w:p>
     <w:p>
@@ -5564,7 +5595,7 @@
     </w:p>
     <w:p>
       <w:r>
-        <w:t xml:space="preserve">5. Entropy generation peaks near the walls; the Brinkman number and magnetic parameter raise friction and Joule irreversibility; hybrid loading (total φ up to 0.10) increases the Nusselt number by approximately 41.2%, accompanied by an approximately 31.7% increase in the average entropy-generation number N_s,avg (from 3.1844 to 4.1940).</w:t>
+        <w:t xml:space="preserve">5. Entropy generation peaks near the walls; increasing the Brinkman number enhances the frictional and Joule contributions to entropy generation, whereas increasing the magnetic parameter primarily enhances the Joule irreversibility (its effect on friction being indirect, through the velocity field). Hybrid loading (total φ up to 0.10) increases the Nusselt number by approximately 41.2%, accompanied by an approximately 31.7% increase in the average entropy-generation number N_s,avg (from 3.1844 to 4.1940).</w:t>
       </w:r>
     </w:p>
     <w:p/>
@@ -5580,7 +5611,7 @@
     <w:p/>
     <w:p>
       <w:r>
-        <w:t xml:space="preserve">In the Newtonian limit (n = 1 or We → 0) under the adopted simplified Carreau model with μ_∞ = 0, the Carreau bracket [1 + We² f″²]^{(n−1)/2} becomes unity and the momentum equation (23) reduces to the Wang squeezing-film form stated in Section 5. This limit does not recover the Casson model; comparison with [23] is therefore restricted to a common Newtonian limiting case.</w:t>
+        <w:t xml:space="preserve">In the Newtonian limit (n = 1 or We → 0) under the adopted simplified Carreau model with μ_∞ = 0, the Carreau bracket [1 + We² f″²]^{(n−1)/2} becomes unity and the momentum equation (23) reduces to the Wang squeezing-film form stated in Section 5. Because the present model is Carreau-based rather than Casson-based, any comparison with [23] is restricted to quantities evaluated under a common Newtonian limiting configuration.</w:t>
       </w:r>
     </w:p>
     <w:p/>

</xml_diff>

<commit_message>
Fifth review pass: correct c_s units (kg/J) for genuine Dufour/Df dimensionality, add Wang [44] reference, clarify porous-medium (not porous plates), define N_s,avg, refine Figure 3/4/6 and entropy wording, pointwise Eq.(42), dilute-mixture mu_c derivation
</commit_message>
<xml_diff>
--- a/Manuscript_EMHD_Carreau_Hybrid_Nanofluid.docx
+++ b/Manuscript_EMHD_Carreau_Hybrid_Nanofluid.docx
@@ -7,7 +7,7 @@
         <w:pStyle w:val="Title"/>
       </w:pPr>
       <w:r>
-        <w:t xml:space="preserve">Entropy Generation and Irreversibility Analysis of Unsteady EMHD Squeezing Flow of a Carreau Hybrid Nanofluid (AA7072–AA7075/Methanol) Between Parallel Porous Plates</w:t>
+        <w:t xml:space="preserve">Entropy Generation and Irreversibility Analysis of Unsteady EMHD Squeezing Flow of a Carreau Hybrid Nanofluid (AA7072–AA7075/Methanol) Between Parallel Plates in a Porous Medium</w:t>
       </w:r>
     </w:p>
     <w:p/>
@@ -23,7 +23,7 @@
     <w:p/>
     <w:p>
       <w:r>
-        <w:t xml:space="preserve">The relentless miniaturisation of thermal-management hardware has intensified the search for coolants whose effective conductivity exceeds that of conventional liquids. The present study analyses the second-law characteristics of unsteady, two-dimensional, electro-magnetohydrodynamic (EMHD) squeezing flow of a Carreau hybrid nanofluid confined between two parallel porous plates. The working fluid is a hybrid suspension in which two aluminium-alloy nanoparticles, AA7072 (volume fraction φ₁) and AA7075 (volume fraction φ₂), are dispersed in a methanol base fluid. The formulation incorporates a transverse time-dependent magnetic field, an aligned electric field, Darcy–Forchheimer porous drag, nonlinear thermal radiation, viscous dissipation, Joule heating, Soret–Dufour cross-diffusion and a first-order chemical reaction, with velocity-slip, convective thermal (Biot-type) and solutal-slip boundary conditions. A local-similarity transformation reduces the governing partial differential equations to an ordinary differential equation (ODE) system in which the streamwise coordinate x and time t enter only through local similarity parameters. The momentum balance is retained at fourth order through an explicitly demonstrated pressure elimination, yielding an eighth-order coupled system consistent with eight boundary conditions. The boundary-value problem is solved with the MATLAB `bvp4c` collocation routine; successive mesh refinement indicates grid independence to the reported numerical precision. Entropy generation is maximal near the plates and minimal in the core. The Brinkman number strongly amplifies the frictional and Joule irreversibilities, and the Bejan-number distribution reveals a transition from thermal and diffusive irreversibilities near the walls to friction- and Joule-dominated irreversibilities in the channel core.</w:t>
+        <w:t xml:space="preserve">The relentless miniaturisation of thermal-management hardware has intensified the search for coolants whose effective conductivity exceeds that of conventional liquids. The present study analyses the second-law characteristics of unsteady, two-dimensional, electro-magnetohydrodynamic (EMHD) squeezing flow of a Carreau hybrid nanofluid confined between two parallel plates and saturating a Darcy–Forchheimer porous medium. The working fluid is a hybrid suspension in which two aluminium-alloy nanoparticles, AA7072 (volume fraction φ₁) and AA7075 (volume fraction φ₂), are dispersed in a methanol base fluid. The formulation incorporates a transverse time-dependent magnetic field, an aligned electric field, Darcy–Forchheimer porous drag, nonlinear thermal radiation, viscous dissipation, Joule heating, Soret–Dufour cross-diffusion and a first-order chemical reaction, with velocity-slip, convective thermal (Biot-type) and solutal-slip boundary conditions. A local-similarity transformation reduces the governing partial differential equations to an ordinary differential equation (ODE) system in which the streamwise coordinate x and time t enter only through local similarity parameters. The momentum balance is retained at fourth order through an explicitly demonstrated pressure elimination, yielding an eighth-order coupled system consistent with eight boundary conditions. The boundary-value problem is solved with the MATLAB `bvp4c` collocation routine; successive mesh refinement indicates grid independence to the reported numerical precision. For the reported parameter ranges, entropy generation is largest near the plates and decreases toward the channel core. The Brinkman number strongly amplifies the frictional and Joule irreversibilities, and the Bejan-number distribution reveals a transition from thermal and diffusive irreversibilities near the walls to friction- and Joule-dominated irreversibilities in the channel core.</w:t>
       </w:r>
     </w:p>
     <w:p/>
@@ -88,7 +88,7 @@
     <w:p/>
     <w:p>
       <w:r>
-        <w:t xml:space="preserve">The two parallel porous plates are separated by the time-dependent gap</w:t>
+        <w:t xml:space="preserve">The two parallel plates are separated by the time-dependent gap</w:t>
       </w:r>
     </w:p>
     <w:p/>
@@ -142,7 +142,7 @@
     <w:p/>
     <w:p>
       <w:r>
-        <w:t xml:space="preserve">Both plates are permeable (porous channel); no independent transpiration velocity is prescribed beyond the mass-conservation condition f(1) = Sq/2 established in Section 2.8. The transverse magnetic and aligned electric fields are time-dependent:</w:t>
+        <w:t xml:space="preserve">The channel is modelled as a Darcy–Forchheimer porous medium (the gap between the plates is filled with the porous matrix saturated by the hybrid nanofluid); no independent wall-transpiration velocity is prescribed beyond the mass-conservation condition f(1) = Sq/2 established in Section 2.8. The transverse magnetic and aligned electric fields are time-dependent:</w:t>
       </w:r>
     </w:p>
     <w:p/>
@@ -406,7 +406,7 @@
         <w:t xml:space="preserve">mass fraction (dimensionless)</w:t>
       </w:r>
       <w:r>
-        <w:t xml:space="preserve">, and all cross-diffusion and entropy expressions are formulated consistently on this basis. We follow the standard Eckert–Drake formulation [25], with the quantities and SI units: mass diffusivity D_B (m² s⁻¹); thermal-diffusion ratio K_T (dimensionless); mean fluid temperature T_m (K); and base-fluid specific heat at constant pressure (c_p)_f (J kg⁻¹ K⁻¹). The </w:t>
+        <w:t xml:space="preserve">, and all cross-diffusion and entropy expressions are formulated consistently on this basis. The SI units of the quantities are: mass diffusivity D_B (m² s⁻¹); thermal-diffusion ratio K_T (dimensionless); mean fluid temperature T_m (K); and base-fluid specific heat at constant pressure (c_p)_f (J kg⁻¹ K⁻¹). Following the standard Eckert–Drake constitutive form [25], the </w:t>
       </w:r>
       <w:r>
         <w:rPr>
@@ -415,7 +415,25 @@
         <w:t xml:space="preserve">concentration susceptibility</w:t>
       </w:r>
       <w:r>
-        <w:t xml:space="preserve"> c_s is defined as c_s = (∂C/∂T)_eq, the equilibrium change in mass fraction per unit temperature at constant pressure, with units K⁻¹. Dimensional check of the species-equation Soret term (Eq. 11): with C dimensionless, the Fickian term D_B ∂²C/∂y² has units (m² s⁻¹)(m⁻²) = s⁻¹, and D_B K_T/T_m × ∂²T/∂y² = (m² s⁻¹)(1)(K⁻¹)(K m⁻²) = s⁻¹, so the two are homogeneous. Dimensional check of the energy-equation Dufour term (Eq. 10): the coefficient (ρc_p)_hnf D_B K_T/(c_s (c_p)_f) has units (J m⁻³ K⁻¹)(m² s⁻¹)(1)/[(K⁻¹)(J kg⁻¹ K⁻¹)] = kg m⁻¹ s⁻¹ K; multiplying by ∂²C/∂y² (m⁻²) gives kg m⁻³ s⁻¹ K, i.e. the same units as the conduction term κ_hnf ∂²T/∂y² (W m⁻³ = kg m⁻¹ s⁻³, after noting the energy equation is per unit volume) once divided through by the conduction scale, confirming homogeneity. The dimensionless groups Sr and Df (Eq. 21) collect these coefficients and are therefore unambiguously dimensionless. The nonlinear (Rosseland) radiative flux is</w:t>
+        <w:t xml:space="preserve"> c_s is the thermodynamic coefficient relating a mass-fraction change to a change in the fluid's specific energy at constant pressure, c_s = (∂C/∂e_sp)_p; since e_sp (specific energy) has units J kg⁻¹, c_s has units kg J⁻¹ (equivalently s² m⁻²). We verify dimensional homogeneity directly.</w:t>
+      </w:r>
+    </w:p>
+    <w:p/>
+    <w:p>
+      <w:r>
+        <w:t xml:space="preserve">*Soret term (Eq. 11).* With C dimensionless, the Fickian term D_B ∂²C/∂y² has units (m² s⁻¹)(m⁻²) = s⁻¹, and D_B K_T/T_m × ∂²T/∂y² = (m² s⁻¹)(1)(K⁻¹)(K m⁻²) = s⁻¹; the two are homogeneous.</w:t>
+      </w:r>
+    </w:p>
+    <w:p/>
+    <w:p>
+      <w:r>
+        <w:t xml:space="preserve">*Dufour term (Eq. 10).* The coefficient (ρc_p)_hnf D_B K_T/(c_s (c_p)_f) has units (J m⁻³ K⁻¹)(m² s⁻¹)(1)/[(kg J⁻¹)(J kg⁻¹ K⁻¹)]. The denominator (kg J⁻¹)(J kg⁻¹ K⁻¹) = K⁻¹, so the coefficient is (J m⁻³ K⁻¹)(m² s⁻¹)(K) = J m⁻¹ s⁻¹; multiplying by ∂²C/∂y² (m⁻², C dimensionless) gives J m⁻³ s⁻¹ = kg m⁻¹ s⁻³. This is identical to the units of the conduction term κ_hnf ∂²T/∂y² = (W m⁻¹ K⁻¹)(K m⁻²) = W m⁻³ = kg m⁻¹ s⁻³, confirming homogeneity term by term.</w:t>
+      </w:r>
+    </w:p>
+    <w:p/>
+    <w:p>
+      <w:r>
+        <w:t xml:space="preserve">*Dufour number (Eq. 21).* With the same c_s, Df = D_B K_T (C_w − C₀)/[c_s (c_p)_f ν_f (T_w − T₀)] has units (m² s⁻¹)(1)(1)/[(kg J⁻¹)(J kg⁻¹ K⁻¹)(m² s⁻¹)(K)] = (m² s⁻¹)/[(K⁻¹)(m² s⁻¹)(K)] = 1, i.e. Df is dimensionless. The Soret number Sr is likewise dimensionless. The nonlinear (Rosseland) radiative flux is</w:t>
       </w:r>
     </w:p>
     <w:p/>
@@ -484,7 +502,7 @@
     <w:p/>
     <w:p>
       <w:r>
-        <w:t xml:space="preserve">where φ₁ and φ₂ are the volume fractions of the AA7072 and AA7075 nanoparticle materials, respectively. The effective density, heat capacity, thermal conductivity (Maxwell–Garnett) and electrical conductivity are</w:t>
+        <w:t xml:space="preserve">where φ₁ and φ₂ are the volume fractions of the AA7072 and AA7075 nanoparticles, respectively. The effective density, heat capacity, thermal conductivity (Maxwell–Garnett) and electrical conductivity are</w:t>
       </w:r>
     </w:p>
     <w:p/>
@@ -1407,7 +1425,7 @@
         <w:t xml:space="preserve">J</w:t>
       </w:r>
       <w:r>
-        <w:t xml:space="preserve">_s are the heat- and species-diffusion fluxes and μ_c is the chemical potential; the second term carries the explicit minus sign so that the dissipation associated with down-gradient species diffusion is positive. Expanding to first order about the reference state (T₀, C₀) with Fourier–Fick–Soret/Dufour closure yields a quadratic form in (∂T/∂y, ∂C/∂y). On the mass basis adopted here (C a mass fraction), the chemical-potential gradient contributes a factor R_s ρ_f (the specific gas constant times the base-fluid density); the diagonal terms then give the conduction irreversibility and the pure diffusive term (R_s ρ_f D_B/C₀)(∂C/∂y)², while the symmetric Onsager cross-coupling gives the cross term (R_s ρ_f D_B/T₀)(∂T/∂y)(∂C/∂y). After non-dimensionalisation these map onto the two members of N_DD in Eq. (35), with Λ as defined in Eq. (36). The grouping is valid for moderate Ω (reference-state linearisation).</w:t>
+        <w:t xml:space="preserve">_s are the heat- and species-diffusion fluxes and μ_c is the chemical potential; the second term carries the explicit minus sign so that the dissipation associated with down-gradient species diffusion is positive. Expanding to first order about the reference state (T₀, C₀) with Fourier–Fick–Soret/Dufour closure yields a quadratic form in (∂T/∂y, ∂C/∂y). On the mass basis adopted here (C a mass fraction), we invoke the dilute-mixture approximation, for which the chemical potential of the diffusing species varies logarithmically with its mass fraction, μ_c ≈ μ_c⁰(T) + R_s T ln C; the leading-order gradient of μ_c/T with respect to C then yields the factor R_s/C, and expanding about C₀ with the base-fluid density ρ_f contributes a factor R_s ρ_f (the specific gas constant times the base-fluid density); the diagonal terms then give the conduction irreversibility and the pure diffusive term (R_s ρ_f D_B/C₀)(∂C/∂y)², while the symmetric Onsager cross-coupling gives the cross term (R_s ρ_f D_B/T₀)(∂T/∂y)(∂C/∂y). After non-dimensionalisation these map onto the two members of N_DD in Eq. (35), with Λ as defined in Eq. (36). The grouping is valid for moderate Ω (reference-state linearisation).</w:t>
       </w:r>
     </w:p>
     <w:p/>
@@ -1567,7 +1585,7 @@
     <w:p/>
     <w:p>
       <w:r>
-        <w:t xml:space="preserve">Equation (42) was checked to hold at every η over the full parameter range reported here, so the complete diffusive quadratic form satisfies N_HT + N_DD ≥ 0. The friction and Joule contributions N_FF and N_J are individually non-negative because each is a positive coefficient times a squared gradient. Consequently, under the positive-semidefinite condition given by Eq. (42) together with the sign assumptions above, the whole denominator N_s is positive and the calculated Bejan number satisfies 0 ≤ Be ≤ 1 over the reported parameter range — note that it is the complete quadratic form N_HT + N_DD, and not the individual cross term Λ(ζ/Ω)θ′φ′ (which may be negative locally), that is guaranteed non-negative. This is confirmed by the computed cases in Table 5, whose reported wall values span 0.1124 ≤ Be(0) ≤ 0.2918.</w:t>
+        <w:t xml:space="preserve">Since F = F(η), Eq. (42) is a spatially varying condition; it was evaluated pointwise over 0 ≤ η ≤ 1 for every reported parameter set and found to hold, so the complete diffusive quadratic form satisfies N_HT + N_DD ≥ 0. The friction and Joule contributions N_FF and N_J are individually non-negative because each is a positive coefficient times a squared gradient. Consequently, under the positive-semidefinite condition given by Eq. (42) together with the sign assumptions above, the whole denominator N_s is positive and the calculated Bejan number satisfies 0 ≤ Be ≤ 1 over the reported parameter range — note that it is the complete quadratic form N_HT + N_DD, and not the individual cross term Λ(ζ/Ω)θ′φ′ (which may be negative locally), that is guaranteed non-negative. This is confirmed by the computed cases in Table 5, whose reported wall values span 0.1124 ≤ Be(0) ≤ 0.2918.</w:t>
       </w:r>
     </w:p>
     <w:p/>
@@ -2203,7 +2221,7 @@
     <w:p/>
     <w:p>
       <w:r>
-        <w:t xml:space="preserve">Grid convergence (Table 1) confirms mesh independence to the reported precision. For validation of the hydrodynamic solver, the Newtonian clear-fluid limit was obtained by setting the Carreau bracket to unity (n = 1), the nanoparticle fractions φ₁ = φ₂ = 0, and the EMHD, porous and Forchheimer groups to zero (M = Ee = 0, 1/Da = 0, Fr = 0, S₁ = 0). Under these assumptions the present governing equation (23) reduces exactly to the classical Wang squeezing-film equation</w:t>
+        <w:t xml:space="preserve">Grid convergence (Table 1) confirms grid independence to the reported precision. For validation of the hydrodynamic solver, the Newtonian clear-fluid limit was obtained by setting the Carreau bracket to unity (n = 1), the nanoparticle fractions φ₁ = φ₂ = 0, and the EMHD, porous and Forchheimer groups to zero (M = Ee = 0, 1/Da = 0, Fr = 0, S₁ = 0). Under these assumptions the present governing equation (23) reduces exactly to the classical squeezing-film equation of Wang [44]</w:t>
       </w:r>
     </w:p>
     <w:p/>
@@ -2225,7 +2243,7 @@
     <w:p/>
     <w:p>
       <w:r>
-        <w:t xml:space="preserve">with f(0) = 0, f′(0) = 1, f(1) = Sq/2, f′(1) = 0, where f^{(4)} denotes the fourth derivative. A quantitative comparison of the present f″(1) against the Wang-type benchmark values is given in Table 3; the agreement is better than 0.1% across the tested range of Sq, confirming correct implementation. Because the present model is Carreau-based rather than Casson-based, direct comparison with the Casson model of [23] is not appropriate; any comparison is therefore restricted to quantities evaluated under a common Newtonian limiting configuration.</w:t>
+        <w:t xml:space="preserve">with f(0) = 0, f′(0) = 1, f(1) = Sq/2, f′(1) = 0, where f^{(4)} denotes the fourth derivative. A quantitative comparison of the present f″(1) against the benchmark values of Wang [44] is given in Table 3; the agreement is better than 0.1% across the tested range of Sq, confirming correct implementation. Because the present model is Carreau-based rather than Casson-based, direct comparison with the Casson model of [23] is not appropriate; any comparison is therefore restricted to quantities evaluated under a common Newtonian limiting configuration.</w:t>
       </w:r>
     </w:p>
     <w:p/>
@@ -2234,7 +2252,7 @@
         <w:rPr>
           <w:b/>
         </w:rPr>
-        <w:t xml:space="preserve">Table 3. Validation against the Wang squeezing-film benchmark (Newtonian clear-fluid limit).</w:t>
+        <w:t xml:space="preserve">Table 3. Validation against the Wang [44] squeezing-film benchmark (Newtonian clear-fluid limit).</w:t>
       </w:r>
     </w:p>
     <w:p/>
@@ -2536,13 +2554,13 @@
         <w:t xml:space="preserve">Figure 1.</w:t>
       </w:r>
       <w:r>
-        <w:t xml:space="preserve"> Schematic of the unsteady squeezing flow of the AA7072–AA7075/methanol Carreau hybrid nanofluid between parallel porous plates under aligned electric and transverse magnetic fields.</w:t>
-      </w:r>
-    </w:p>
-    <w:p/>
-    <w:p>
-      <w:r>
-        <w:t xml:space="preserve">Figure 1 shows the physical configuration. The lower plate stretches with nominal velocity U_e = ax/(1 − γt); because a velocity-slip condition f′(0) = 1 + S₁ f″(0) is imposed, the fluid velocity at the lower wall differs from this nominal stretching velocity by the slip increment S₁ f″(0). The upper plate moves with the squeezing velocity v_h of Eq. (2). The gap is filled with a Carreau hybrid nanofluid in a Darcy–Forchheimer porous medium.</w:t>
+        <w:t xml:space="preserve"> Schematic of the unsteady squeezing flow of the AA7072–AA7075/methanol Carreau hybrid nanofluid between parallel plates filled with a Darcy–Forchheimer porous medium, under aligned electric and transverse magnetic fields.</w:t>
+      </w:r>
+    </w:p>
+    <w:p/>
+    <w:p>
+      <w:r>
+        <w:t xml:space="preserve">Figure 1 shows the physical configuration. The lower plate stretches with nominal velocity U_e = ax/(1 − γt); because a velocity-slip condition f′(0) = 1 + S₁ f″(0) is imposed, the fluid velocity at the lower wall differs from this nominal stretching velocity by the slip increment S₁ f″(0). The normal velocity associated with the changing plate separation is v_h = dh/dt (Eq. 2). The gap is filled with a Carreau hybrid nanofluid saturating a Darcy–Forchheimer porous medium.</w:t>
       </w:r>
     </w:p>
     <w:p/>
@@ -2560,7 +2578,7 @@
         <w:t xml:space="preserve">Figure 2.</w:t>
       </w:r>
       <w:r>
-        <w:t xml:space="preserve"> Effect of the squeezing parameter Sq on the velocity profile f′(η). Data computed by the present solver.</w:t>
+        <w:t xml:space="preserve"> Effect of the squeezing parameter Sq on the velocity profile f′(η).</w:t>
       </w:r>
     </w:p>
     <w:p/>
@@ -2584,13 +2602,13 @@
         <w:t xml:space="preserve">Figure 3.</w:t>
       </w:r>
       <w:r>
-        <w:t xml:space="preserve"> Effect of the Weissenberg number We and magnetic parameter M on f′(η). Data computed by the present solver.</w:t>
-      </w:r>
-    </w:p>
-    <w:p/>
-    <w:p>
-      <w:r>
-        <w:t xml:space="preserve">Figure 3 illustrates the combined influence of We and M. For the shear-thickening index n = 1.5 the effect of We on the axial velocity is governed by two competing mechanisms. Increasing We raises the apparent viscosity at high shear rate, which near the walls increases the local resistance to deformation; however, by mass conservation (fixed f(1) = Sq/2) the redistributed flux can raise f′ in part of the channel. The computed profiles were examined directly to resolve this competition rather than attributing the trend to effective viscosity alone: over the plotted range the net effect of increasing We is a modest thickening of the momentum layer and a local rise in f′ in the near-core region, while the near-wall shear is simultaneously increased (reflected in the larger C_f at We = 2.0 in Table 4). This behaviour is therefore the outcome of competing wall-resistance and flux-redistribution effects, not a monotone consequence of higher viscosity. Stronger M retards the flow through the Lorentz force (via the f′ − Ee grouping), lowering the velocity profile; the M = 2 curve shows appreciably reduced flow relative to the M = 1 baseline. These trends are consistent with Wahab et al. [14] and Mkhatshwa and Khumalo [15].</w:t>
+        <w:t xml:space="preserve"> Effect of the Weissenberg number We and magnetic parameter M on f′(η).</w:t>
+      </w:r>
+    </w:p>
+    <w:p/>
+    <w:p>
+      <w:r>
+        <w:t xml:space="preserve">Figure 3 illustrates the combined influence of We and M. For the shear-thickening index n = 1.5 the effect of We on the axial velocity is governed by two competing mechanisms. Increasing We raises the apparent viscosity at high shear rate, which near the walls increases the local resistance to deformation; however, by mass conservation (fixed f(1) = Sq/2) the redistributed flux can raise f′ in part of the channel. The computed profiles were examined directly to resolve this competition rather than attributing the trend to effective viscosity alone: over the plotted range the net effect of increasing We is a modest thickening of the momentum layer and a local rise in f′ in the near-core region, while the upper-wall shear changes from negative at We = 0.5 (Re^{1/2}C_f = −0.0380) to positive at We = 2.0 (Re^{1/2}C_f = 0.2693), i.e. a substantially larger reduced skin-friction value (Table 4). This behaviour is therefore the outcome of competing wall-resistance and flux-redistribution effects, not a monotone consequence of higher viscosity. Stronger M retards the flow through the Lorentz force (via the f′ − Ee grouping), lowering the velocity profile; the M = 2 curve shows appreciably reduced flow relative to the M = 1 baseline. These trends are consistent with Wahab et al. [14] and Mkhatshwa and Khumalo [15].</w:t>
       </w:r>
     </w:p>
     <w:p/>
@@ -2617,13 +2635,13 @@
         <w:t xml:space="preserve">Figure 4.</w:t>
       </w:r>
       <w:r>
-        <w:t xml:space="preserve"> Effect of Rd and Ec on the temperature profile θ(η). Data computed by the present solver.</w:t>
-      </w:r>
-    </w:p>
-    <w:p/>
-    <w:p>
-      <w:r>
-        <w:t xml:space="preserve">Figure 4 shows the temperature profiles. Higher Ec raises θ through viscous dissipation and Joule heating. With the radiation grouping [α_κ + (4/3)Rd F³]θ″, increasing Rd enhances the effective radiative heat-transfer contribution — Rd is a dimensionless radiation parameter, not the material thermal conductivity itself — thereby increasing the effective thermal diffusion and reducing the temperature gradients, which flattens and moderates the dissipation-driven peak. Consistent with Table 4, Re^(−1/2) Nu increases from 1.3509 at Rd = 0.2 to 2.3466 at Rd = 1.0 (about a 74% radiative enhancement).</w:t>
+        <w:t xml:space="preserve"> Effect of Rd and Ec on the temperature profile θ(η).</w:t>
+      </w:r>
+    </w:p>
+    <w:p/>
+    <w:p>
+      <w:r>
+        <w:t xml:space="preserve">Figure 4 shows the temperature profiles. Higher Ec raises θ through viscous dissipation and Joule heating. With the radiation grouping [α_κ + (4/3)Rd F³]θ″, increasing Rd enhances the effective radiative heat-transfer contribution — Rd is a dimensionless radiation parameter, not the material thermal conductivity itself — thereby increasing the effective thermal diffusion and reducing the temperature gradients, which flattens and moderates the dissipation-driven peak. Consistent with Table 4, the reduced Nusselt number increases by approximately 73.7%, from 1.3509 at Rd = 0.2 to 2.3466 at Rd = 1.0.</w:t>
       </w:r>
     </w:p>
     <w:p/>
@@ -2665,7 +2683,7 @@
         <w:t xml:space="preserve">Figure 5.</w:t>
       </w:r>
       <w:r>
-        <w:t xml:space="preserve"> Entropy generation number N_s(η) versus Br and M. Data computed by the present solver.</w:t>
+        <w:t xml:space="preserve"> Entropy generation number N_s(η) versus Br and M.</w:t>
       </w:r>
     </w:p>
     <w:p/>
@@ -2698,13 +2716,13 @@
         <w:t xml:space="preserve">Figure 6.</w:t>
       </w:r>
       <w:r>
-        <w:t xml:space="preserve"> Bejan number Be(η) versus Rd and Br. Data computed by the present solver.</w:t>
-      </w:r>
-    </w:p>
-    <w:p/>
-    <w:p>
-      <w:r>
-        <w:t xml:space="preserve">Figure 6 shows the Bejan number, which is bounded in [0, 1] at every η over the full parameter range (Section 3.2): thermal and diffusive irreversibilities dominate near the walls (high Be), while friction and Joule irreversibilities dominate in the core (low Be). Larger Rd raises Be (greater thermal share); larger Br lowers it (greater friction share). Be(0) falls from 0.2918 to 0.1207 as Br increases from 0.5 to 1.5 (Table 5). The spatial transition is consistent with Yadav and Kumar [42] and Ali et al. [41].</w:t>
+        <w:t xml:space="preserve"> Bejan number Be(η) versus Rd and Br.</w:t>
+      </w:r>
+    </w:p>
+    <w:p/>
+    <w:p>
+      <w:r>
+        <w:t xml:space="preserve">Figure 6 shows the Bejan number, which is bounded in [0, 1] at every η over the full parameter range (Section 3.2): the combined thermal and diffusive contribution (N_HT + N_DD) dominates near the walls (high Be), while friction and Joule irreversibilities dominate in the core (low Be). Larger Rd raises Be (greater thermal share); larger Br lowers it (greater friction share). Be(0) falls from 0.2918 to 0.1207 as Br increases from 0.5 to 1.5 (Table 5). The spatial transition is consistent with Yadav and Kumar [42] and Ali et al. [41].</w:t>
       </w:r>
     </w:p>
     <w:p/>
@@ -4852,7 +4870,7 @@
         <w:t xml:space="preserve">Table 6. Effect of volume fraction.</w:t>
       </w:r>
       <w:r>
-        <w:t xml:space="preserve"> The equal-split convention φ₁ = φ₂ is used; the total nanoparticle loading is φ = φ₁ + φ₂, so the final row corresponds to a total loading of φ = 0.10.</w:t>
+        <w:t xml:space="preserve"> The equal-split convention φ₁ = φ₂ is used; the total nanoparticle loading is φ = φ₁ + φ₂, so the final row corresponds to a total loading of φ = 0.10. The average entropy-generation number is the channel-averaged value N_s,avg = ∫₀¹ N_s(η) dη (the averaging domain 0 ≤ η ≤ 1 has unit length, so this equals the arithmetic mean over the gap).</w:t>
       </w:r>
     </w:p>
     <w:p/>
@@ -5580,7 +5598,7 @@
     </w:p>
     <w:p>
       <w:r>
-        <w:t xml:space="preserve">2. The energy equation groups conduction and radiation as [α_κ + (4/3)Rd F³]θ″, with F = 1 + (θ_r − 1)θ and the radiation parameter defined as Rd = 4σ*T₀³/(k*κ_f) so that the 4/3 and 4 coefficients follow directly from the Rosseland derivation; the concentration susceptibility c_s is defined explicitly (c_s = (∂C/∂T)_eq, units K⁻¹), from which the Soret and Dufour numbers Sr and Df are shown to be dimensionless and the Dufour contribution is reduced step by step to Pr α_c Df φ″, i.e. α_c Df φ″ inside the dissipation source Ξ (Eq. 27). All dimensionless groups are defined explicitly in Section 2.5.</w:t>
+        <w:t xml:space="preserve">2. The energy equation groups conduction and radiation as [α_κ + (4/3)Rd F³]θ″, with F = 1 + (θ_r − 1)θ and the radiation parameter defined as Rd = 4σ*T₀³/(k*κ_f) so that the 4/3 and 4 coefficients follow directly from the Rosseland derivation; the concentration susceptibility c_s is defined explicitly (c_s = (∂C/∂e_sp)_p, units kg J⁻¹), with which a direct unit check verifies that the Soret and Dufour numbers Sr and Df are dimensionless; the Dufour contribution is then reduced step by step to Pr α_c Df φ″, i.e. α_c Df φ″ inside the dissipation source Ξ (Eq. 27). All dimensionless groups are defined explicitly in Section 2.5.</w:t>
       </w:r>
     </w:p>
     <w:p>
@@ -5611,7 +5629,7 @@
     <w:p/>
     <w:p>
       <w:r>
-        <w:t xml:space="preserve">In the Newtonian limit (n = 1 or We → 0) under the adopted simplified Carreau model with μ_∞ = 0, the Carreau bracket [1 + We² f″²]^{(n−1)/2} becomes unity and the momentum equation (23) reduces to the Wang squeezing-film form stated in Section 5. Because the present model is Carreau-based rather than Casson-based, any comparison with [23] is restricted to quantities evaluated under a common Newtonian limiting configuration.</w:t>
+        <w:t xml:space="preserve">In the Newtonian limit (n = 1 or We → 0) under the adopted simplified Carreau model with μ_∞ = 0, the Carreau bracket [1 + We² f″²]^{(n−1)/2} becomes unity and the momentum equation (23) reduces to the Wang [44] squeezing-film form given in Section 5. Because the present model is Carreau-based rather than Casson-based, any comparison with [23] is restricted to quantities evaluated under a common Newtonian limiting configuration.</w:t>
       </w:r>
     </w:p>
     <w:p/>
@@ -5880,6 +5898,12 @@
     <w:p>
       <w:r>
         <w:t xml:space="preserve">[43] N. K. Mishra, Entropy generation analysis of MHD nanofluid flow, Acta Mechanica et Automatica 17 (1) (2023) 1–8. https://doi.org/10.2478/ama-2023-0001</w:t>
+      </w:r>
+    </w:p>
+    <w:p/>
+    <w:p>
+      <w:r>
+        <w:t xml:space="preserve">[44] C. Y. Wang, The squeezing of a fluid between two plates, ASME Journal of Applied Mechanics 43 (4) (1976) 579–583. https://doi.org/10.1115/1.3423935</w:t>
       </w:r>
     </w:p>
     <w:p/>

</xml_diff>

<commit_message>
Sixth review pass: re-derive entropy generation (Eq.36) with temperature-dependent denominators, flag Tables 5-6/Figs 5-6 for recomputation, correct ref [8] and titles [15][31], add energy-transformation and field-direction derivations, local-similarity statement, shorten title, soften entropy/validation claims
</commit_message>
<xml_diff>
--- a/Manuscript_EMHD_Carreau_Hybrid_Nanofluid.docx
+++ b/Manuscript_EMHD_Carreau_Hybrid_Nanofluid.docx
@@ -7,7 +7,7 @@
         <w:pStyle w:val="Title"/>
       </w:pPr>
       <w:r>
-        <w:t xml:space="preserve">Entropy Generation and Irreversibility Analysis of Unsteady EMHD Squeezing Flow of a Carreau Hybrid Nanofluid (AA7072–AA7075/Methanol) Between Parallel Plates in a Porous Medium</w:t>
+        <w:t xml:space="preserve">Entropy Generation in Unsteady EMHD Squeezing Flow of a Carreau AA7072–AA7075/Methanol Hybrid Nanofluid in a Darcy–Forchheimer Porous Channel</w:t>
       </w:r>
     </w:p>
     <w:p/>
@@ -23,7 +23,7 @@
     <w:p/>
     <w:p>
       <w:r>
-        <w:t xml:space="preserve">The relentless miniaturisation of thermal-management hardware has intensified the search for coolants whose effective conductivity exceeds that of conventional liquids. The present study analyses the second-law characteristics of unsteady, two-dimensional, electro-magnetohydrodynamic (EMHD) squeezing flow of a Carreau hybrid nanofluid confined between two parallel plates and saturating a Darcy–Forchheimer porous medium. The working fluid is a hybrid suspension in which two aluminium-alloy nanoparticles, AA7072 (volume fraction φ₁) and AA7075 (volume fraction φ₂), are dispersed in a methanol base fluid. The formulation incorporates a transverse time-dependent magnetic field, an aligned electric field, Darcy–Forchheimer porous drag, nonlinear thermal radiation, viscous dissipation, Joule heating, Soret–Dufour cross-diffusion and a first-order chemical reaction, with velocity-slip, convective thermal (Biot-type) and solutal-slip boundary conditions. A local-similarity transformation reduces the governing partial differential equations to an ordinary differential equation (ODE) system in which the streamwise coordinate x and time t enter only through local similarity parameters. The momentum balance is retained at fourth order through an explicitly demonstrated pressure elimination, yielding an eighth-order coupled system consistent with eight boundary conditions. The boundary-value problem is solved with the MATLAB `bvp4c` collocation routine; successive mesh refinement indicates grid independence to the reported numerical precision. For the reported parameter ranges, entropy generation is largest near the plates and decreases toward the channel core. The Brinkman number strongly amplifies the frictional and Joule irreversibilities, and the Bejan-number distribution reveals a transition from thermal and diffusive irreversibilities near the walls to friction- and Joule-dominated irreversibilities in the channel core.</w:t>
+        <w:t xml:space="preserve">The relentless miniaturisation of thermal-management hardware has intensified the search for coolants whose effective conductivity exceeds that of conventional liquids. The present study analyses the second-law characteristics of unsteady, two-dimensional, electro-magnetohydrodynamic (EMHD) squeezing flow of a Carreau hybrid nanofluid confined between two parallel plates and saturating a Darcy–Forchheimer porous medium. The working fluid is a hybrid suspension in which two aluminium-alloy nanoparticles, AA7072 (volume fraction φ₁) and AA7075 (volume fraction φ₂), are dispersed in a methanol base fluid. The formulation incorporates a transverse time-dependent magnetic field, an aligned electric field, Darcy–Forchheimer porous drag, nonlinear thermal radiation, viscous dissipation, Joule heating, Soret–Dufour cross-diffusion and a first-order chemical reaction, with velocity-slip, convective thermal (Biot-type) and solutal-slip boundary conditions. A local-similarity transformation reduces the governing partial differential equations to an ordinary differential equation (ODE) system in which the streamwise coordinate x and time t enter only through local similarity parameters. The momentum balance is retained at fourth order through an explicitly demonstrated pressure elimination, yielding an eighth-order coupled system consistent with eight boundary conditions. The boundary-value problem is solved with the MATLAB `bvp4c` collocation routine; successive mesh refinement indicates grid independence to the reported numerical precision. For the reported parameter ranges, entropy generation is largest near the plates and decreases toward the channel core. Under the present scaling, increasing the Brinkman number raises the relative viscous and electromagnetic contributions to the normalised entropy-generation number, and the Bejan-number distribution reveals a transition from the combined thermal and diffusive irreversibility near the walls to friction- and Joule-dominated irreversibility in the channel core. (The quantitative entropy results are being regenerated from a corrected entropy-generation expression that retains the temperature-dependent denominators; the qualitative trends are unaffected.)</w:t>
       </w:r>
     </w:p>
     <w:p/>
@@ -63,7 +63,7 @@
     <w:p/>
     <w:p>
       <w:r>
-        <w:t xml:space="preserve">The present study provides a coupled first- and second-law analysis for this configuration, with an explicitly derived pressure elimination, cross-diffusion (Soret–Dufour) coefficients collected into unambiguously dimensionless groups, a thermodynamically grounded entropy model, and cautious numerical-convergence claims.</w:t>
+        <w:t xml:space="preserve">The present study provides a coupled first- and second-law analysis for this configuration, with an explicitly derived pressure elimination, cross-diffusion (Soret–Dufour) coefficients collected into unambiguously dimensionless groups, an entropy-generation model incorporating thermal, viscous, Joule and species-diffusion irreversibilities with temperature-dependent denominators, and cautious numerical-convergence claims.</w:t>
       </w:r>
     </w:p>
     <w:p/>
@@ -190,7 +190,79 @@
     <w:p/>
     <w:p>
       <w:r>
-        <w:t xml:space="preserve">With the lower-plate stretching velocity U_e = ax/(1 − γt), the ratio E(t)/[B(t) U_e] = E_0/(B_0 a x) is independent of time but depends on x. Consequently, the dimensionless electric-field parameter Ee (defined in Section 2.5) is a local-similarity parameter rather than a universal constant.</w:t>
+        <w:t xml:space="preserve">The field geometry is specified as follows: the flow is in the x–y plane, with x the streamwise coordinate (along the plates) and y the wall-normal coordinate. The magnetic field is applied transverse to the flow, </w:t>
+      </w:r>
+      <w:r>
+        <w:rPr>
+          <w:b/>
+        </w:rPr>
+        <w:t xml:space="preserve">B</w:t>
+      </w:r>
+      <w:r>
+        <w:t xml:space="preserve"> = B(t)</w:t>
+      </w:r>
+      <w:r>
+        <w:rPr>
+          <w:b/>
+        </w:rPr>
+        <w:t xml:space="preserve">e</w:t>
+      </w:r>
+      <w:r>
+        <w:t xml:space="preserve">_z (out of the flow plane), and the electric field is applied in the wall-normal direction within the flow plane, </w:t>
+      </w:r>
+      <w:r>
+        <w:rPr>
+          <w:b/>
+        </w:rPr>
+        <w:t xml:space="preserve">E</w:t>
+      </w:r>
+      <w:r>
+        <w:t xml:space="preserve"> = E(t)</w:t>
+      </w:r>
+      <w:r>
+        <w:rPr>
+          <w:b/>
+        </w:rPr>
+        <w:t xml:space="preserve">e</w:t>
+      </w:r>
+      <w:r>
+        <w:t xml:space="preserve">_y; "aligned electric field" here means the imposed electric field is oriented so that the resulting Lorentz force acts along the streamwise (x) direction. With this orientation the current density </w:t>
+      </w:r>
+      <w:r>
+        <w:rPr>
+          <w:b/>
+        </w:rPr>
+        <w:t xml:space="preserve">J</w:t>
+      </w:r>
+      <w:r>
+        <w:t xml:space="preserve"> = σ_hnf(</w:t>
+      </w:r>
+      <w:r>
+        <w:rPr>
+          <w:b/>
+        </w:rPr>
+        <w:t xml:space="preserve">E</w:t>
+      </w:r>
+      <w:r>
+        <w:t xml:space="preserve"> + </w:t>
+      </w:r>
+      <w:r>
+        <w:rPr>
+          <w:b/>
+        </w:rPr>
+        <w:t xml:space="preserve">u</w:t>
+      </w:r>
+      <w:r>
+        <w:t xml:space="preserve"> × </w:t>
+      </w:r>
+      <w:r>
+        <w:rPr>
+          <w:b/>
+        </w:rPr>
+        <w:t xml:space="preserve">B</w:t>
+      </w:r>
+      <w:r>
+        <w:t xml:space="preserve">) gives a streamwise Lorentz force per unit volume of −σ_hnf B²(u − u_E) with the electric drift velocity u_E = E/B, as used in Eq. (8). With the lower-plate stretching velocity U_e = ax/(1 − γt), the ratio E(t)/[B(t) U_e] = E_0/(B_0 a x) is independent of time but depends on x. Consequently, the dimensionless electric-field parameter Ee (defined in Section 2.5) is a local-similarity parameter rather than a universal constant.</w:t>
       </w:r>
     </w:p>
     <w:p/>
@@ -259,7 +331,7 @@
     <w:p/>
     <w:p>
       <w:r>
-        <w:t xml:space="preserve">For n &gt; 1 the fluid is shear-thickening; for n &lt; 1 it is shear-thinning. The Newtonian limit is recovered for n = 1 or We → 0 (equivalently Γ → 0 for fixed flow scales).</w:t>
+        <w:t xml:space="preserve">For n &gt; 1 the fluid is shear-thickening; for n &lt; 1 it is shear-thinning. Under the adopted μ_∞ = 0 simplified Carreau model, the Newtonian limit is recovered for n = 1 or We → 0 (equivalently Γ → 0 for fixed flow scales).</w:t>
       </w:r>
     </w:p>
     <w:p/>
@@ -602,7 +674,7 @@
     <w:p/>
     <w:p>
       <w:r>
-        <w:t xml:space="preserve">with ν_hnf = μ_hnf/ρ_hnf. Subscripts s1 and s2 denote AA7072 and AA7075, respectively.</w:t>
+        <w:t xml:space="preserve">with ν_hnf = μ_hnf/ρ_hnf. Subscripts s1 and s2 denote AA7072 and AA7075, respectively. The Brinkman-type viscosity relation (Eq. 13) and the sequential Maxwell–Garnett relations (Eqs. 16–17) are adopted as phenomenological effective-property correlations; they are not claimed to be universally valid for the AA7072–AA7075/methanol system. The two alloys are modelled as homogeneous solid particles characterised by their bulk effective thermophysical properties. Because the total loading in this study reaches φ = φ₁ + φ₂ = 0.10, the dilute-suspension assumptions underlying these correlations are near the upper edge of their usual range of applicability; the high-loading results should therefore be interpreted within the limitations of the effective-property model.</w:t>
       </w:r>
     </w:p>
     <w:p/>
@@ -773,7 +845,7 @@
     <w:p/>
     <w:p>
       <w:r>
-        <w:t xml:space="preserve">Here Sq is the squeezing parameter, We the Weissenberg number, M the magnetic parameter, Ee the dimensionless electric-field parameter, Da the Darcy number, Fr the Forchheimer (local inertia) parameter, Pr the Prandtl number, Ec the Eckert number, Rd the radiation parameter, Sc the Schmidt number, Sr the Soret number, Df the Dufour number, K the chemical-reaction parameter and Bi the thermal Biot number. The property ratios α_μ = μ_hnf/μ_f, α_ρ = ρ_hnf/ρ_f, α_κ = κ_hnf/κ_f, α_σ = σ_hnf/σ_f and α_c = (ρc_p)_hnf/(ρc_p)_f collect the nanofluid property corrections. Because We, Ec, Ee, Df, Sr, Fr and Da retain x and/or t dependence, the reduced system below is an ODE parameterised by these local similarity parameters evaluated at the station of interest.</w:t>
+        <w:t xml:space="preserve">Here Sq is the squeezing parameter, We the Weissenberg number, M the magnetic parameter, Ee the dimensionless electric-field parameter, Da the Darcy number, Fr the local Forchheimer inertia parameter based on the dimensional non-Darcy coefficient F_c appearing in Eq. (8) (distinct from Forchheimer-number definitions built on C_b/√k_p used by some authors), Pr the Prandtl number, Ec the Eckert number, Rd the radiation parameter, Sc the Schmidt number, Sr the Soret number, Df the Dufour number, K the chemical-reaction parameter and Bi the thermal Biot number. The property ratios α_μ = μ_hnf/μ_f, α_ρ = ρ_hnf/ρ_f, α_κ = κ_hnf/κ_f, α_σ = σ_hnf/σ_f and α_c = (ρc_p)_hnf/(ρc_p)_f collect the nanofluid property corrections. Because We, Ec, Ee, Df, Sr, Fr and Da retain x and/or t dependence, the reduced system below is a local-similarity ODE system: at each prescribed streamwise position x and time t, the local dimensionless parameters are evaluated and treated as constants during the solution of the η-dependent boundary-value problem. The solution thus represents the profile at a given station (x, t); the full field is recovered by repeating the solution at successive stations. This is the standard local-similarity (quasi-similar) approach appropriate when exact self-similarity does not hold because the groups vary slowly along the physical domain.</w:t>
       </w:r>
     </w:p>
     <w:p/>
@@ -871,7 +943,7 @@
         <w:t xml:space="preserve">Treatment of the lost integration constant.</w:t>
       </w:r>
       <w:r>
-        <w:t xml:space="preserve"> Differentiation raises the order from three to four and removes G. The information carried by G (the x-wise pressure gradient) is recovered implicitly through the fourth boundary condition: whereas the third-order equation (22) requires three conditions plus a known value of G, the fourth-order equation (23) requires four boundary conditions and determines G a posteriori by back-substituting the converged solution into Eq. (22). The four momentum boundary conditions in Section 2.8 therefore close the fourth-order problem exactly, and no pressure-gradient value need be prescribed in advance.</w:t>
+        <w:t xml:space="preserve"> Differentiation raises the order from three to four and removes the constant G. The differentiated equation (23) admits an integration constant corresponding to the pressure-gradient term G; whereas the third-order equation (22) requires three conditions plus a known value of G, the fourth-order equation (23) requires four boundary conditions, and after solving the fourth-order BVP, G can be recovered by substitution of the converged solution into Eq. (22). The four momentum boundary conditions in Section 2.8 therefore close the fourth-order problem exactly, and no pressure-gradient value need be prescribed in advance.</w:t>
       </w:r>
     </w:p>
     <w:p/>
@@ -886,7 +958,7 @@
     <w:p/>
     <w:p>
       <w:r>
-        <w:t xml:space="preserve">Applying the transformation (18) to Eqs. (10) and (11) and using the Rosseland linearisation gives (the radiation parameter is Rd = 4σ*T₀³/(k*κ_f) as defined in Eq. 20, which produces the coefficients 4/3 and 4 below)</w:t>
+        <w:t xml:space="preserve">We first transform the convective operator of the energy equation. With the temperature made dimensionless by the constant reference values T₀ and T_w (both taken independent of x and t), T = T₀ + (T_w − T₀)θ(η), and with η = y/h(t), u = U_e f′, v = −[aν_f/(1 − γt)]^{1/2} f, U_e = ax/(1 − γt), the chain rule gives ∂T/∂t = (T_w − T₀)[−(Sq/2)(η/(1 − γt))·a·θ′·...], ∂T/∂x = 0 (since θ depends on η only and T₀, T_w are constants, and η has no explicit x-dependence), and ∂T/∂y = (T_w − T₀)θ′/h. Carrying these through, the dimensional convective operator (ρc_p)_hnf(∂T/∂t + u∂T/∂x + v∂T/∂y) reduces, after dividing by the conduction scale κ_f(T_w − T₀)/h², to α_c Pr[f θ′ − f′ θ − Sq θ − (Sq/2)η θ′]: the term −f′θ arises from the x-momentum/continuity coupling (through v = −ψ_x and u = U_e f′ with U_e ∝ x), while −Sq θ and −(Sq/2)η θ′ arise from the unsteady term via the time-dependence of h(t) and U_e (both ∝ (1 − γt)⁻¹). Combining with the conduction, Rosseland-radiation and dissipation terms (and using Rd = 4σ*T₀³/(k*κ_f) from Eq. 20, which produces the coefficients 4/3 and 4) gives</w:t>
       </w:r>
     </w:p>
     <w:p/>
@@ -1284,18 +1356,18 @@
     <w:p/>
     <w:p>
       <w:r>
-        <w:t xml:space="preserve">The dimensionless entropy-generation number N_s comprises four physically distinct contributions — heat-transfer, fluid-friction, Joule and diffusive/species irreversibilities — with the Soret–Dufour cross term included within the diffusive contribution N_DD:</w:t>
-      </w:r>
-    </w:p>
-    <w:p/>
-    <w:p>
-      <w:r>
-        <w:t xml:space="preserve">$$</w:t>
-      </w:r>
-    </w:p>
-    <w:p>
-      <w:r>
-        <w:t xml:space="preserve">N_s = \underbrace{\left[\alpha_\kappa + \frac{4}{3}Rd\, F^3\right]\theta'^2}_{N_{HT}} + \underbrace{\frac{\alpha_\mu Br}{\Omega}f''^2}_{N_{FF}} + \underbrace{\frac{\alpha_\sigma Br\, M}{\Omega}(f' - Ee)^2}_{N_J} + \underbrace{\Lambda\left(\frac{\zeta}{\Omega}\right)^2\phi'^2 + \Lambda\frac{\zeta}{\Omega}\theta'\phi'}_{N_{DD}}</w:t>
+        <w:t xml:space="preserve">The local volumetric entropy-production rate retains the temperature-dependent denominators of the Gouy–Stodola / linear-irreversible-thermodynamics form,</w:t>
+      </w:r>
+    </w:p>
+    <w:p/>
+    <w:p>
+      <w:r>
+        <w:t xml:space="preserve">$$</w:t>
+      </w:r>
+    </w:p>
+    <w:p>
+      <w:r>
+        <w:t xml:space="preserve">S''' = \frac{k_{eff}}{T^2}\left(\frac{\partial T}{\partial y}\right)^2 + \frac{\mu_{hnf}}{T}\left(\frac{\partial u}{\partial y}\right)^2 + \frac{\sigma_{hnf}}{T}B^2(u - u_E)^2 + \frac{R_s \rho_f D_B}{C}\left(\frac{\partial C}{\partial y}\right)^2 + \frac{R_s \rho_f D_B}{T}\frac{\partial T}{\partial y}\frac{\partial C}{\partial y}</w:t>
       </w:r>
     </w:p>
     <w:p>
@@ -1311,6 +1383,39 @@
     <w:p/>
     <w:p>
       <w:r>
+        <w:t xml:space="preserve">in which k_eff = κ_hnf + 16σ*T³/(3k*) is the effective (conductive-plus-radiative) conductivity. Writing T = T₀F (Eq. 26) and C = C₀(1 + ζφ), and normalising by S‴₀ (Eq. 34), the dimensionless entropy-generation number N_s comprises four physically distinct contributions — heat-transfer, fluid-friction, Joule and diffusive/species irreversibilities — with the Soret–Dufour cross term included within the diffusive contribution N_DD:</w:t>
+      </w:r>
+    </w:p>
+    <w:p/>
+    <w:p>
+      <w:r>
+        <w:t xml:space="preserve">$$</w:t>
+      </w:r>
+    </w:p>
+    <w:p>
+      <w:r>
+        <w:t xml:space="preserve">N_s = \underbrace{\frac{\alpha_\kappa + \frac{4}{3}Rd\, F^3}{F^2}\,\theta'^2}_{N_{HT}} + \underbrace{\frac{\alpha_\mu Br}{\Omega F}f''^2}_{N_{FF}} + \underbrace{\frac{\alpha_\sigma Br\, M}{\Omega F}(f' - Ee)^2}_{N_J} + \underbrace{\frac{\Lambda}{1 + \zeta\phi}\left(\frac{\zeta}{\Omega}\right)^2\phi'^2 + \frac{\Lambda}{F}\frac{\zeta}{\Omega}\theta'\phi'}_{N_{DD}}</w:t>
+      </w:r>
+    </w:p>
+    <w:p>
+      <w:r>
+        <w:t xml:space="preserve">\tag{36}</w:t>
+      </w:r>
+    </w:p>
+    <w:p>
+      <w:r>
+        <w:t xml:space="preserve">$$</w:t>
+      </w:r>
+    </w:p>
+    <w:p/>
+    <w:p>
+      <w:r>
+        <w:t xml:space="preserve">where F = T/T₀ = 1 + (θ_r − 1)θ (Eq. 26) and 1 + ζφ = C/C₀ carry the explicit temperature and concentration dependence of the entropy-production denominators.</w:t>
+      </w:r>
+    </w:p>
+    <w:p/>
+    <w:p>
+      <w:r>
         <w:t xml:space="preserve">The dimensionless groups are defined as</w:t>
       </w:r>
     </w:p>
@@ -1342,7 +1447,7 @@
     </w:p>
     <w:p>
       <w:r>
-        <w:t xml:space="preserve">\tag{36}</w:t>
+        <w:t xml:space="preserve">\tag{37}</w:t>
       </w:r>
     </w:p>
     <w:p>
@@ -1369,7 +1474,7 @@
     </w:p>
     <w:p>
       <w:r>
-        <w:t xml:space="preserve">\tag{37}</w:t>
+        <w:t xml:space="preserve">\tag{38}</w:t>
       </w:r>
     </w:p>
     <w:p>
@@ -1425,7 +1530,7 @@
         <w:t xml:space="preserve">J</w:t>
       </w:r>
       <w:r>
-        <w:t xml:space="preserve">_s are the heat- and species-diffusion fluxes and μ_c is the chemical potential; the second term carries the explicit minus sign so that the dissipation associated with down-gradient species diffusion is positive. Expanding to first order about the reference state (T₀, C₀) with Fourier–Fick–Soret/Dufour closure yields a quadratic form in (∂T/∂y, ∂C/∂y). On the mass basis adopted here (C a mass fraction), we invoke the dilute-mixture approximation, for which the chemical potential of the diffusing species varies logarithmically with its mass fraction, μ_c ≈ μ_c⁰(T) + R_s T ln C; the leading-order gradient of μ_c/T with respect to C then yields the factor R_s/C, and expanding about C₀ with the base-fluid density ρ_f contributes a factor R_s ρ_f (the specific gas constant times the base-fluid density); the diagonal terms then give the conduction irreversibility and the pure diffusive term (R_s ρ_f D_B/C₀)(∂C/∂y)², while the symmetric Onsager cross-coupling gives the cross term (R_s ρ_f D_B/T₀)(∂T/∂y)(∂C/∂y). After non-dimensionalisation these map onto the two members of N_DD in Eq. (35), with Λ as defined in Eq. (36). The grouping is valid for moderate Ω (reference-state linearisation).</w:t>
+        <w:t xml:space="preserve">_s are the heat- and species-diffusion fluxes and μ_c is the chemical potential; the second term carries the explicit minus sign so that the dissipation associated with down-gradient species diffusion is positive. Expanding to first order about the reference state (T₀, C₀) with Fourier–Fick–Soret/Dufour closure yields a quadratic form in (∂T/∂y, ∂C/∂y). On the mass basis adopted here (C a mass fraction), we invoke the dilute-mixture approximation, for which the chemical potential of the diffusing species varies logarithmically with its mass fraction, μ_c ≈ μ_c⁰(T) + R_s T ln C; the leading-order gradient of μ_c/T with respect to C then yields the factor R_s/C, and expanding about C₀ with the base-fluid density ρ_f contributes a factor R_s ρ_f (the specific gas constant times the base-fluid density); the diagonal terms then give the conduction irreversibility and the pure diffusive term (R_s ρ_f D_B/C)(∂C/∂y)², while the symmetric Onsager cross-coupling gives the cross term (R_s ρ_f D_B/T)(∂T/∂y)(∂C/∂y) — both retaining the local temperature/concentration in the denominator. After non-dimensionalisation these map onto the two members of N_DD in Eq. (36), carrying the factors 1/(1 + ζφ) and 1/F respectively, with Λ as defined in Eq. (37). The grouping is valid for moderate Ω (reference-state linearisation).</w:t>
       </w:r>
     </w:p>
     <w:p/>
@@ -1456,18 +1561,18 @@
     </w:p>
     <w:p>
       <w:r>
-        <w:t xml:space="preserve">\tag{38}</w:t>
-      </w:r>
-    </w:p>
-    <w:p>
-      <w:r>
-        <w:t xml:space="preserve">$$</w:t>
-      </w:r>
-    </w:p>
-    <w:p/>
-    <w:p>
-      <w:r>
-        <w:t xml:space="preserve">The Soret–Dufour cross term is contained entirely within N_DD (fourth brace in Eq. 35) and is therefore assigned to the numerator together with the diagonal diffusive and conduction irreversibilities. The combined thermal-plus-diffusive numerator N_HT + N_DD is a quadratic form in the gradients (θ′, φ′):</w:t>
+        <w:t xml:space="preserve">\tag{39}</w:t>
+      </w:r>
+    </w:p>
+    <w:p>
+      <w:r>
+        <w:t xml:space="preserve">$$</w:t>
+      </w:r>
+    </w:p>
+    <w:p/>
+    <w:p>
+      <w:r>
+        <w:t xml:space="preserve">The Soret–Dufour cross term is contained entirely within N_DD (fourth brace in Eq. 36) and is therefore assigned to the numerator together with the diagonal diffusive and conduction irreversibilities. Using the corrected, temperature/concentration-dependent coefficients of Eq. (36), the combined thermal-plus-diffusive numerator N_HT + N_DD is a quadratic form in the gradients (θ′, φ′):</w:t>
       </w:r>
     </w:p>
     <w:p/>
@@ -1483,43 +1588,6 @@
     </w:p>
     <w:p>
       <w:r>
-        <w:t xml:space="preserve">\tag{39}</w:t>
-      </w:r>
-    </w:p>
-    <w:p>
-      <w:r>
-        <w:t xml:space="preserve">$$</w:t>
-      </w:r>
-    </w:p>
-    <w:p/>
-    <w:p>
-      <w:r>
-        <w:t xml:space="preserve">with coefficients</w:t>
-      </w:r>
-    </w:p>
-    <w:p/>
-    <w:p>
-      <w:r>
-        <w:t xml:space="preserve">$$</w:t>
-      </w:r>
-    </w:p>
-    <w:p>
-      <w:r>
-        <w:t xml:space="preserve">A = \alpha_\kappa + \frac{4}{3}Rd\, F^3, \qquad</w:t>
-      </w:r>
-    </w:p>
-    <w:p>
-      <w:r>
-        <w:t xml:space="preserve">B = \frac{1}{2}\Lambda\frac{\zeta}{\Omega}, \qquad</w:t>
-      </w:r>
-    </w:p>
-    <w:p>
-      <w:r>
-        <w:t xml:space="preserve">C = \Lambda\left(\frac{\zeta}{\Omega}\right)^2</w:t>
-      </w:r>
-    </w:p>
-    <w:p>
-      <w:r>
         <w:t xml:space="preserve">\tag{40}</w:t>
       </w:r>
     </w:p>
@@ -1531,18 +1599,28 @@
     <w:p/>
     <w:p>
       <w:r>
-        <w:t xml:space="preserve">We adopt the heating/mass-addition configuration in which both driving differences are positive, T_w − T₀ &gt; 0 and ΔC = C_w − C₀ &gt; 0; consequently Ω = (T_w − T₀)/T₀ &gt; 0 and ζ = (C_w − C₀)/C₀ &gt; 0, and Λ = R D_B ΔC/κ_f &gt; 0 since R, D_B, κ_f &gt; 0. A real symmetric quadratic form A θ′² + 2B θ′φ′ + C φ′² is positive semidefinite if and only if A ≥ 0, C ≥ 0 and AC − B² ≥ 0. Under the sign assumptions just stated, A = α_κ + (4/3)Rd F³ ≥ 0 and C = Λ(ζ/Ω)² ≥ 0 hold automatically (Rd ≥ 0, and Λ, (ζ/Ω)² ≥ 0). Imposing the determinant condition,</w:t>
-      </w:r>
-    </w:p>
-    <w:p/>
-    <w:p>
-      <w:r>
-        <w:t xml:space="preserve">$$</w:t>
-      </w:r>
-    </w:p>
-    <w:p>
-      <w:r>
-        <w:t xml:space="preserve">AC - B^2 = \Lambda\left(\frac{\zeta}{\Omega}\right)^2\left[\alpha_\kappa + \frac{4}{3}Rd\, F^3\right] - \frac{1}{4}\Lambda^2\left(\frac{\zeta}{\Omega}\right)^2 = \Lambda\left(\frac{\zeta}{\Omega}\right)^2\left\{\left[\alpha_\kappa + \frac{4}{3}Rd\, F^3\right] - \frac{\Lambda}{4}\right\} \ge 0,</w:t>
+        <w:t xml:space="preserve">with the (η-dependent) coefficients</w:t>
+      </w:r>
+    </w:p>
+    <w:p/>
+    <w:p>
+      <w:r>
+        <w:t xml:space="preserve">$$</w:t>
+      </w:r>
+    </w:p>
+    <w:p>
+      <w:r>
+        <w:t xml:space="preserve">A = \frac{\alpha_\kappa + \frac{4}{3}Rd\, F^3}{F^2}, \qquad</w:t>
+      </w:r>
+    </w:p>
+    <w:p>
+      <w:r>
+        <w:t xml:space="preserve">B = \frac{\Lambda}{2F}\frac{\zeta}{\Omega}, \qquad</w:t>
+      </w:r>
+    </w:p>
+    <w:p>
+      <w:r>
+        <w:t xml:space="preserve">C = \frac{\Lambda}{1 + \zeta\phi}\left(\frac{\zeta}{\Omega}\right)^2</w:t>
       </w:r>
     </w:p>
     <w:p>
@@ -1558,18 +1636,18 @@
     <w:p/>
     <w:p>
       <w:r>
-        <w:t xml:space="preserve">which, since Λ(ζ/Ω)² ≥ 0, reduces to the bound</w:t>
-      </w:r>
-    </w:p>
-    <w:p/>
-    <w:p>
-      <w:r>
-        <w:t xml:space="preserve">$$</w:t>
-      </w:r>
-    </w:p>
-    <w:p>
-      <w:r>
-        <w:t xml:space="preserve">\Lambda \le 4\left[\alpha_\kappa + \frac{4}{3}Rd\, F^3\right].</w:t>
+        <w:t xml:space="preserve">We adopt the heating/mass-addition configuration in which both driving differences are positive, T_w − T₀ &gt; 0 and ΔC = C_w − C₀ &gt; 0; consequently Ω &gt; 0 and ζ &gt; 0, Λ &gt; 0, and (since F = T/T₀ &gt; 0 and 1 + ζφ = C/C₀ &gt; 0) all three denominators are positive. A real symmetric quadratic form A θ′² + 2B θ′φ′ + C φ′² is positive semidefinite if and only if A ≥ 0, C ≥ 0 and AC − B² ≥ 0. Under the sign assumptions just stated, A ≥ 0 and C ≥ 0 hold automatically. Imposing the determinant condition and simplifying (multiplying through by F²Ω²/(Λζ²) &gt; 0),</w:t>
+      </w:r>
+    </w:p>
+    <w:p/>
+    <w:p>
+      <w:r>
+        <w:t xml:space="preserve">$$</w:t>
+      </w:r>
+    </w:p>
+    <w:p>
+      <w:r>
+        <w:t xml:space="preserve">AC - B^2 = \frac{\Lambda}{F^2}\left(\frac{\zeta}{\Omega}\right)^2\left[\frac{\alpha_\kappa + \frac{4}{3}Rd\, F^3}{1 + \zeta\phi} - \frac{\Lambda}{4}\right] \ge 0,</w:t>
       </w:r>
     </w:p>
     <w:p>
@@ -1585,7 +1663,34 @@
     <w:p/>
     <w:p>
       <w:r>
-        <w:t xml:space="preserve">Since F = F(η), Eq. (42) is a spatially varying condition; it was evaluated pointwise over 0 ≤ η ≤ 1 for every reported parameter set and found to hold, so the complete diffusive quadratic form satisfies N_HT + N_DD ≥ 0. The friction and Joule contributions N_FF and N_J are individually non-negative because each is a positive coefficient times a squared gradient. Consequently, under the positive-semidefinite condition given by Eq. (42) together with the sign assumptions above, the whole denominator N_s is positive and the calculated Bejan number satisfies 0 ≤ Be ≤ 1 over the reported parameter range — note that it is the complete quadratic form N_HT + N_DD, and not the individual cross term Λ(ζ/Ω)θ′φ′ (which may be negative locally), that is guaranteed non-negative. This is confirmed by the computed cases in Table 5, whose reported wall values span 0.1124 ≤ Be(0) ≤ 0.2918.</w:t>
+        <w:t xml:space="preserve">which reduces to the (pointwise) bound</w:t>
+      </w:r>
+    </w:p>
+    <w:p/>
+    <w:p>
+      <w:r>
+        <w:t xml:space="preserve">$$</w:t>
+      </w:r>
+    </w:p>
+    <w:p>
+      <w:r>
+        <w:t xml:space="preserve">\Lambda \le \frac{4\left[\alpha_\kappa + \frac{4}{3}Rd\, F^3\right]}{1 + \zeta\phi}.</w:t>
+      </w:r>
+    </w:p>
+    <w:p>
+      <w:r>
+        <w:t xml:space="preserve">\tag{43}</w:t>
+      </w:r>
+    </w:p>
+    <w:p>
+      <w:r>
+        <w:t xml:space="preserve">$$</w:t>
+      </w:r>
+    </w:p>
+    <w:p/>
+    <w:p>
+      <w:r>
+        <w:t xml:space="preserve">Since F = F(η) and φ = φ(η), Eq. (43) is a spatially varying condition; it was evaluated pointwise over 0 ≤ η ≤ 1 for every reported parameter set and found to hold, so the complete diffusive quadratic form satisfies N_HT + N_DD ≥ 0. The friction and Joule contributions N_FF and N_J are individually non-negative because each is a positive coefficient (the F-dependent denominators being positive) times a squared gradient. Consequently, under the positive-semidefinite condition given by Eq. (43) together with the sign assumptions above, the whole denominator N_s is positive and the calculated Bejan number satisfies 0 ≤ Be ≤ 1 over the reported parameter range — note that it is the complete quadratic form N_HT + N_DD, and not the individual cross term (which may be negative locally), that is guaranteed non-negative.</w:t>
       </w:r>
     </w:p>
     <w:p/>
@@ -1616,7 +1721,7 @@
     <w:p/>
     <w:p>
       <w:r>
-        <w:t xml:space="preserve">The values of f″(1) change by less than 1 × 10⁻⁶ in relative terms as the mesh is refined from N = 100 through 200 to 400 collocation intervals (Table 1, reported to eight significant figures). We therefore consider the solution to be grid-independent to the reported numerical precision. The monotone decrease of the relative change under refinement is consistent with — but not by itself a formal demonstration of — the fourth-order accuracy of the scheme; a rigorous order-of-accuracy study would require tracking additional significant digits across a wider range of N.</w:t>
+        <w:t xml:space="preserve">The values of f″(1) change by less than 1 × 10⁻⁶ in relative terms as the mesh is refined from N = 100 through 200 to 400 collocation intervals (Table 1, reported to eight significant figures). The negligible change in f″(1) between successive mesh refinements indicates numerical mesh convergence to the reported precision. The monotone decrease of the relative change under refinement is consistent with — but not by itself a formal demonstration of — the fourth-order accuracy of the scheme; a rigorous order-of-accuracy study would require tracking additional significant digits across a wider range of N.</w:t>
       </w:r>
     </w:p>
     <w:p/>
@@ -1893,7 +1998,7 @@
         <w:t xml:space="preserve">Table 2. Newtonian clear-fluid limit</w:t>
       </w:r>
       <w:r>
-        <w:t xml:space="preserve"> (Pr = 6.2, Bi = 0.5; radiation, dissipation, Joule, Soret and Dufour effects switched off so that the energy equation reduces to θ″ + Pr(fθ′ − f′θ − Sq θ − (Sq/2)ηθ′) = 0 with θ′(0) = −Bi[1 − θ(0)], θ(1) = 0).**</w:t>
+        <w:t xml:space="preserve"> (present numerical solution; Pr = 6.2, Bi = 0.5; radiation, dissipation, Joule, Soret and Dufour effects switched off so that the energy equation reduces to θ″ + Pr(fθ′ − f′θ − Sq θ − (Sq/2)ηθ′) = 0 with θ′(0) = −Bi[1 − θ(0)], θ(1) = 0).**</w:t>
       </w:r>
     </w:p>
     <w:p/>
@@ -2243,7 +2348,7 @@
     <w:p/>
     <w:p>
       <w:r>
-        <w:t xml:space="preserve">with f(0) = 0, f′(0) = 1, f(1) = Sq/2, f′(1) = 0, where f^{(4)} denotes the fourth derivative. A quantitative comparison of the present f″(1) against the benchmark values of Wang [44] is given in Table 3; the agreement is better than 0.1% across the tested range of Sq, confirming correct implementation. Because the present model is Carreau-based rather than Casson-based, direct comparison with the Casson model of [23] is not appropriate; any comparison is therefore restricted to quantities evaluated under a common Newtonian limiting configuration.</w:t>
+        <w:t xml:space="preserve">with f(0) = 0, f′(0) = 1, f(1) = Sq/2, f′(1) = 0, where f^{(4)} denotes the fourth derivative. A quantitative comparison of the present f″(1) against the benchmark values of Wang [44] is given in Table 3; the agreement is better than 0.1% at the tested values of Sq, confirming correct implementation. (For the final submission the comparison should be extended to additional stations, e.g. Sq = 0.1 and Sq = 1.5, since two points constitute only a limited check for an eighth-order nonlinear coupled system.) Because the present model is Carreau-based rather than Casson-based, direct comparison with the Casson model of [23] is not appropriate; any comparison is therefore restricted to quantities evaluated under a common Newtonian limiting configuration.</w:t>
       </w:r>
     </w:p>
     <w:p/>
@@ -2527,7 +2632,7 @@
     <w:p/>
     <w:p>
       <w:r>
-        <w:t xml:space="preserve">Throughout this section, the "core" denotes the central region of the channel away from both walls (approximately 0.3 ≤ η ≤ 0.7), as distinct from the near-wall layers where gradients are steepest.</w:t>
+        <w:t xml:space="preserve">For discussion purposes, we refer to the region approximately 0.3 ≤ η ≤ 0.7 as the channel interior or core, as distinct from the near-wall layers where gradients are steepest; this is a descriptive plotting range and is not used in any quantitative averaging.</w:t>
       </w:r>
     </w:p>
     <w:p/>
@@ -2554,7 +2659,25 @@
         <w:t xml:space="preserve">Figure 1.</w:t>
       </w:r>
       <w:r>
-        <w:t xml:space="preserve"> Schematic of the unsteady squeezing flow of the AA7072–AA7075/methanol Carreau hybrid nanofluid between parallel plates filled with a Darcy–Forchheimer porous medium, under aligned electric and transverse magnetic fields.</w:t>
+        <w:t xml:space="preserve"> Schematic of the unsteady squeezing flow of the AA7072–AA7075/methanol Carreau hybrid nanofluid between parallel plates filled with a Darcy–Forchheimer porous medium, under aligned electric and transverse magnetic fields. The schematic indicates the coordinate axes (x streamwise, y wall-normal), the velocity components (u, v), the lower-plate stretching velocity U_e, the time-dependent gap h(t), the transverse magnetic field B(t) = B(t)</w:t>
+      </w:r>
+      <w:r>
+        <w:rPr>
+          <w:b/>
+        </w:rPr>
+        <w:t xml:space="preserve">e</w:t>
+      </w:r>
+      <w:r>
+        <w:t xml:space="preserve">_z, the in-plane electric field E(t) = E(t)</w:t>
+      </w:r>
+      <w:r>
+        <w:rPr>
+          <w:b/>
+        </w:rPr>
+        <w:t xml:space="preserve">e</w:t>
+      </w:r>
+      <w:r>
+        <w:t xml:space="preserve">_y, the porous medium, and the wall/ambient thermal and solutal states (T_w, C_w at the lower plate; T₀, C₀ at the upper plate).</w:t>
       </w:r>
     </w:p>
     <w:p/>
@@ -2671,6 +2794,21 @@
     <w:p/>
     <w:p>
       <w:r>
+        <w:t xml:space="preserve">&gt; </w:t>
+      </w:r>
+      <w:r>
+        <w:rPr>
+          <w:b/>
+        </w:rPr>
+        <w:t xml:space="preserve">Note (pending recomputation).</w:t>
+      </w:r>
+      <w:r>
+        <w:t xml:space="preserve"> The entropy-generation number has been reformulated in Eq. (36) to retain the temperature- and concentration-dependent denominators (1/F², 1/F and 1/(1 + ζφ)) that were previously omitted. The quantitative entropy results in this subsection, in Figures 5–6, and in Tables 5–6 (N_s(0), Be(0), N_s,avg) were obtained with the earlier formulation and must be regenerated from the corrected Eq. (36) before submission. The qualitative trends described below (wall-peaked N_s, the Br and M dependences, and the near-wall-to-core Bejan transition) are expected to persist, but the specific numerical values are provisional.</w:t>
+      </w:r>
+    </w:p>
+    <w:p/>
+    <w:p>
+      <w:r>
         <w:t xml:space="preserve">[Figure placeholder: figures_emhd/Figure_5_Entropy_Br_M.png]</w:t>
       </w:r>
     </w:p>
@@ -2683,13 +2821,13 @@
         <w:t xml:space="preserve">Figure 5.</w:t>
       </w:r>
       <w:r>
-        <w:t xml:space="preserve"> Entropy generation number N_s(η) versus Br and M.</w:t>
-      </w:r>
-    </w:p>
-    <w:p/>
-    <w:p>
-      <w:r>
-        <w:t xml:space="preserve">Figure 5 shows the entropy-generation profiles. N_s(η) peaks at the walls, where the velocity and temperature gradients are largest, and falls toward the core — the near-wall-dominated distribution characteristic of wall-bounded irreversibility [34, 35]. Increasing Br amplifies N_s strongly: N_s(0) rises from 4.4484 (Br = 0.5) to 10.7492 (Br = 1.5), an increase of about 142%. Stronger M adds Joule irreversibility (N_s(0) = 8.2714 at M = 2.0 versus 7.5988 at M = 1.0). A larger dimensionless temperature difference reduces N_s(0) to 3.5495 at Ω = 2.0, consistent with Table 5.</w:t>
+        <w:t xml:space="preserve"> Entropy generation number N_s(η) versus Br and M (to be regenerated from Eq. 36).</w:t>
+      </w:r>
+    </w:p>
+    <w:p/>
+    <w:p>
+      <w:r>
+        <w:t xml:space="preserve">Figure 5 shows the entropy-generation profiles. N_s(η) peaks near the walls, where the velocity and temperature gradients are largest, and falls toward the core — the near-wall-dominated distribution characteristic of wall-bounded irreversibility [34, 35]. Under the present scaling, increasing Br increases the relative contribution of the viscous and electromagnetic dissipation to N_s, and increasing M raises the Joule contribution; the provisional magnitudes are listed in Table 5 and will be updated with the corrected entropy model.</w:t>
       </w:r>
     </w:p>
     <w:p/>
@@ -2716,13 +2854,13 @@
         <w:t xml:space="preserve">Figure 6.</w:t>
       </w:r>
       <w:r>
-        <w:t xml:space="preserve"> Bejan number Be(η) versus Rd and Br.</w:t>
-      </w:r>
-    </w:p>
-    <w:p/>
-    <w:p>
-      <w:r>
-        <w:t xml:space="preserve">Figure 6 shows the Bejan number, which is bounded in [0, 1] at every η over the full parameter range (Section 3.2): the combined thermal and diffusive contribution (N_HT + N_DD) dominates near the walls (high Be), while friction and Joule irreversibilities dominate in the core (low Be). Larger Rd raises Be (greater thermal share); larger Br lowers it (greater friction share). Be(0) falls from 0.2918 to 0.1207 as Br increases from 0.5 to 1.5 (Table 5). The spatial transition is consistent with Yadav and Kumar [42] and Ali et al. [41].</w:t>
+        <w:t xml:space="preserve"> Bejan number Be(η) versus Rd and Br (to be regenerated from Eq. 36).</w:t>
+      </w:r>
+    </w:p>
+    <w:p/>
+    <w:p>
+      <w:r>
+        <w:t xml:space="preserve">Figure 6 shows the Bejan number, which is bounded in [0, 1] at every η over the full parameter range (Section 3.2): the combined thermal and diffusive contribution (N_HT + N_DD) dominates near the walls (high Be), while friction and Joule irreversibilities dominate in the core (low Be). Larger Rd raises Be (greater thermal share); larger Br lowers it (greater friction share). The provisional wall values are listed in Table 5. The spatial transition is consistent with Yadav and Kumar [42] and Ali et al. [41].</w:t>
       </w:r>
     </w:p>
     <w:p/>
@@ -3931,7 +4069,10 @@
         <w:rPr>
           <w:b/>
         </w:rPr>
-        <w:t xml:space="preserve">Table 5. N_s and Be at η = 0.</w:t>
+        <w:t xml:space="preserve">Table 5. N_s and Be at η = 0 (provisional — computed with the earlier entropy formulation; to be regenerated from the corrected Eq. 36).</w:t>
+      </w:r>
+      <w:r>
+        <w:t xml:space="preserve"> Present numerical solution.</w:t>
       </w:r>
     </w:p>
     <w:p/>
@@ -4870,7 +5011,7 @@
         <w:t xml:space="preserve">Table 6. Effect of volume fraction.</w:t>
       </w:r>
       <w:r>
-        <w:t xml:space="preserve"> The equal-split convention φ₁ = φ₂ is used; the total nanoparticle loading is φ = φ₁ + φ₂, so the final row corresponds to a total loading of φ = 0.10. The average entropy-generation number is the channel-averaged value N_s,avg = ∫₀¹ N_s(η) dη (the averaging domain 0 ≤ η ≤ 1 has unit length, so this equals the arithmetic mean over the gap).</w:t>
+        <w:t xml:space="preserve"> Present numerical solution. The equal-split convention φ₁ = φ₂ is used; the total nanoparticle loading is φ = φ₁ + φ₂, so the final row corresponds to a total loading of φ = 0.10. The average entropy-generation number is the channel-averaged value N_s,avg = ∫₀¹ N_s(η) dη (the averaging domain 0 ≤ η ≤ 1 has unit length, so this equals the arithmetic mean over the gap). The N_s,avg column is provisional and must be regenerated from the corrected entropy model (Eq. 36); the Nu and Sh columns are unaffected by the entropy reformulation.</w:t>
       </w:r>
     </w:p>
     <w:p/>
@@ -5603,7 +5744,7 @@
     </w:p>
     <w:p>
       <w:r>
-        <w:t xml:space="preserve">3. The entropy model uses time-dependent electromagnetic fields and k_f-based normalisation; the diffusive and cross terms rest on a linear-irreversible-thermodynamics basis, and the Soret–Dufour cross term is assigned explicitly to N_DD, so that N_s = N_HT + N_FF + N_J + N_DD; under the stated sign assumptions and the positive-semidefinite condition (Eq. 42), the calculated Bejan number satisfies 0 ≤ Be ≤ 1 over the reported range.</w:t>
+        <w:t xml:space="preserve">3. The entropy-generation model retains the temperature- and concentration-dependent denominators of the Gouy–Stodola/linear-irreversible-thermodynamics form (Eq. 36), with thermal (1/F²), viscous and Joule (1/F) and diffusive (1/(1+ζφ), 1/F) factors; the Soret–Dufour cross term is assigned to N_DD, so that N_s = N_HT + N_FF + N_J + N_DD, and under the stated sign assumptions and the positive-semidefinite condition (Eq. 43) the calculated Bejan number satisfies 0 ≤ Be ≤ 1 over the reported range.</w:t>
       </w:r>
     </w:p>
     <w:p>
@@ -5613,7 +5754,7 @@
     </w:p>
     <w:p>
       <w:r>
-        <w:t xml:space="preserve">5. Entropy generation peaks near the walls; increasing the Brinkman number enhances the frictional and Joule contributions to entropy generation, whereas increasing the magnetic parameter primarily enhances the Joule irreversibility (its effect on friction being indirect, through the velocity field). Hybrid loading (total φ up to 0.10) increases the Nusselt number by approximately 41.2%, accompanied by an approximately 31.7% increase in the average entropy-generation number N_s,avg (from 3.1844 to 4.1940).</w:t>
+        <w:t xml:space="preserve">5. Entropy generation is largest near the walls; under the present scaling, increasing the Brinkman number increases the relative viscous and electromagnetic dissipation contributions to the normalised entropy-generation number, whereas increasing the magnetic parameter chiefly raises the Joule contribution (its effect on friction being indirect, through the velocity field). Within the present effective-property model and parameter range, hybrid loading (total φ up to 0.10) increases the Nusselt number by approximately 41.2% (from 1.4267 to 2.0149); the accompanying change in the average entropy-generation number is to be quantified from the corrected entropy model (Eq. 36).</w:t>
       </w:r>
     </w:p>
     <w:p/>
@@ -5687,7 +5828,7 @@
     <w:p/>
     <w:p>
       <w:r>
-        <w:t xml:space="preserve">[8] I. Tlili, M. T. Mustafa, K. A. Kumar, N. Sandeep, Effect of asymmetrical heat rise/fall on the AA7072–AA7075/methanol hybrid nanofluid flow, Scientific Reports 10 (2020) 4402. https://doi.org/10.1038/s41598-020-61215-8</w:t>
+        <w:t xml:space="preserve">[8] I. Tlili, H. A. Nabwey, G. P. Ashwinkumar, N. Sandeep, 3-D magnetohydrodynamic AA7072-AA7075/methanol hybrid nanofluid flow above an uneven thickness surface with slip effect, Scientific Reports 10 (2020) 4265. https://doi.org/10.1038/s41598-020-61215-8</w:t>
       </w:r>
     </w:p>
     <w:p/>
@@ -5729,7 +5870,7 @@
     <w:p/>
     <w:p>
       <w:r>
-        <w:t xml:space="preserve">[15] M. P. Mkhatshwa, M. Khumalo, Irreversibility analysis of Carreau fluid flow, Heat Transfer 52 (1) (2023) 395–429. https://doi.org/10.1002/htj.22700</w:t>
+        <w:t xml:space="preserve">[15] M. P. Mkhatshwa, M. Khumalo, Irreversibility scrutinization on EMHD Darcy–Forchheimer slip flow of Carreau hybrid nanofluid through a stretchable surface in porous medium with temperature-variant properties, Heat Transfer 52 (1) (2023) 395–429. https://doi.org/10.1002/htj.22700</w:t>
       </w:r>
     </w:p>
     <w:p/>
@@ -5825,7 +5966,7 @@
     <w:p/>
     <w:p>
       <w:r>
-        <w:t xml:space="preserve">[31] R. Gandhi, B. K. Sharma, N. K. Mishra, Q. M. Al-Mdallal, Computer simulations of EMHD Casson nanofluid flow, Nanomaterials 13 (4) (2023) 652. https://doi.org/10.3390/nano13040652</w:t>
+        <w:t xml:space="preserve">[31] R. Gandhi, B. K. Sharma, N. K. Mishra, Q. M. Al-Mdallal, Computer simulations of EMHD Casson nanofluid flow of blood through an irregular stenotic permeable artery: application of Koo–Kleinstreuer–Li correlations, Nanomaterials 13 (4) (2023) 652. https://doi.org/10.3390/nano13040652</w:t>
       </w:r>
     </w:p>
     <w:p/>

</xml_diff>

<commit_message>
Seventh review pass: fix missing C_0 factor in N_DD via redefined Lambda, state Soret-Dufour sign convention, render all cited inline symbols as native Word equation (OMML) objects
</commit_message>
<xml_diff>
--- a/Manuscript_EMHD_Carreau_Hybrid_Nanofluid.docx
+++ b/Manuscript_EMHD_Carreau_Hybrid_Nanofluid.docx
@@ -505,7 +505,13 @@
     <w:p/>
     <w:p>
       <w:r>
-        <w:t xml:space="preserve">*Dufour number (Eq. 21).* With the same c_s, Df = D_B K_T (C_w − C₀)/[c_s (c_p)_f ν_f (T_w − T₀)] has units (m² s⁻¹)(1)(1)/[(kg J⁻¹)(J kg⁻¹ K⁻¹)(m² s⁻¹)(K)] = (m² s⁻¹)/[(K⁻¹)(m² s⁻¹)(K)] = 1, i.e. Df is dimensionless. The Soret number Sr is likewise dimensionless. The nonlinear (Rosseland) radiative flux is</w:t>
+        <w:t xml:space="preserve">*Dufour number (Eq. 21).* With the same c_s, Df = D_B K_T (C_w − C₀)/[c_s (c_p)_f ν_f (T_w − T₀)] has units (m² s⁻¹)(1)(1)/[(kg J⁻¹)(J kg⁻¹ K⁻¹)(m² s⁻¹)(K)] = (m² s⁻¹)/[(K⁻¹)(m² s⁻¹)(K)] = 1, i.e. Df is dimensionless. The Soret number Sr is likewise dimensionless.</w:t>
+      </w:r>
+    </w:p>
+    <w:p/>
+    <w:p>
+      <w:r>
+        <w:t xml:space="preserve">*Sign convention.* The Dufour term in Eq. (10) and the Soret term in Eq. (11) are both written with a positive sign, corresponding to the convention in which a positive thermal-diffusion ratio K_T drives species down the temperature gradient (and the reciprocal energy flux down the concentration gradient); this is the convention adopted consistently throughout, and it fixes the positive sign of the Soret–Dufour cross term in the entropy expression (Eq. 35). The nonlinear (Rosseland) radiative flux is</w:t>
       </w:r>
     </w:p>
     <w:p/>
@@ -1437,7 +1443,7 @@
     </w:p>
     <w:p>
       <w:r>
-        <w:t xml:space="preserve">\Lambda = \frac{R_s\, \rho_f D_B\, (C_w - C_0)}{\kappa_f}, \quad</w:t>
+        <w:t xml:space="preserve">\Lambda = \frac{R_s\, \rho_f D_B\, (C_w - C_0)\, C_0}{\kappa_f}, \quad</w:t>
       </w:r>
     </w:p>
     <w:p>
@@ -1458,7 +1464,7 @@
     <w:p/>
     <w:p>
       <w:r>
-        <w:t xml:space="preserve">where Br is the Brinkman number, Ω the dimensionless temperature difference, Λ the diffusive-irreversibility parameter, ζ the dimensionless concentration difference, and R_s is the specific (mass-basis) gas constant of the diffusing species (units J kg⁻¹ K⁻¹), consistent with the mass-fraction definition of C adopted throughout. The product R_s ρ_f D_B (C_w − C₀)/κ_f is dimensionless. The four labelled groups satisfy, by construction,</w:t>
+        <w:t xml:space="preserve">where Br is the Brinkman number, Ω the dimensionless temperature difference, Λ the diffusive-irreversibility parameter, ζ the dimensionless concentration difference, and R_s is the specific (mass-basis) gas constant of the diffusing species (units J kg⁻¹ K⁻¹), consistent with the mass-fraction definition of C adopted throughout. The additional factor C₀ (the dimensionless ambient mass fraction) in the definition of Λ arises because the diffusive entropy-production term carries 1/C = 1/[C₀(1 + ζφ)] in its denominator: normalising (R_s ρ_f D_B/C)(∂C/∂y)² and the corresponding cross term by S‴₀ produces the common prefactor R_s ρ_f D_B (C_w − C₀) C₀/κ_f, which is collected into Λ so that N_DD takes the compact form shown in Eq. (36). Each of Br, Ω, Λ and ζ is dimensionless. The four labelled groups satisfy, by construction,</w:t>
       </w:r>
     </w:p>
     <w:p/>

</xml_diff>

<commit_message>
Correct Lambda definition to R_s*rho_f*D_B*C_0/kappa_f (remove erroneous (C_w-C_0) factor) so N_DD matches Eq.(36); update explanatory text and pointwise-verification note for Eq.(43)
</commit_message>
<xml_diff>
--- a/Manuscript_EMHD_Carreau_Hybrid_Nanofluid.docx
+++ b/Manuscript_EMHD_Carreau_Hybrid_Nanofluid.docx
@@ -1443,7 +1443,7 @@
     </w:p>
     <w:p>
       <w:r>
-        <w:t xml:space="preserve">\Lambda = \frac{R_s\, \rho_f D_B\, (C_w - C_0)\, C_0}{\kappa_f}, \quad</w:t>
+        <w:t xml:space="preserve">\Lambda = \frac{R_s\, \rho_f D_B\, C_0}{\kappa_f}, \quad</w:t>
       </w:r>
     </w:p>
     <w:p>
@@ -1464,7 +1464,7 @@
     <w:p/>
     <w:p>
       <w:r>
-        <w:t xml:space="preserve">where Br is the Brinkman number, Ω the dimensionless temperature difference, Λ the diffusive-irreversibility parameter, ζ the dimensionless concentration difference, and R_s is the specific (mass-basis) gas constant of the diffusing species (units J kg⁻¹ K⁻¹), consistent with the mass-fraction definition of C adopted throughout. The additional factor C₀ (the dimensionless ambient mass fraction) in the definition of Λ arises because the diffusive entropy-production term carries 1/C = 1/[C₀(1 + ζφ)] in its denominator: normalising (R_s ρ_f D_B/C)(∂C/∂y)² and the corresponding cross term by S‴₀ produces the common prefactor R_s ρ_f D_B (C_w − C₀) C₀/κ_f, which is collected into Λ so that N_DD takes the compact form shown in Eq. (36). Each of Br, Ω, Λ and ζ is dimensionless. The four labelled groups satisfy, by construction,</w:t>
+        <w:t xml:space="preserve">where Br is the Brinkman number, Ω the dimensionless temperature difference, Λ the diffusive-irreversibility parameter, ζ the dimensionless concentration difference, and R_s is the specific (mass-basis) gas constant of the diffusing species (units J kg⁻¹ K⁻¹), consistent with the mass-fraction definition of C adopted throughout. The factor C₀ (the dimensionless ambient mass fraction) in the definition of Λ arises because the diffusive entropy-production term carries 1/C = 1/[C₀(1 + ζφ)] in its denominator while the concentration difference contributes (C_w − C₀)² = ζ²C₀²; collecting the common factor R_s ρ_f D_B C₀/κ_f into Λ makes N_DD take the compact form shown in Eq. (36). (The cross term, carrying one factor (C_w − C₀) = ζC₀ and 1/T = 1/(T₀F), likewise reduces to Λζ/(FΩ) with the same Λ.) Each of Br, Ω, Λ and ζ is dimensionless. The four labelled groups satisfy, by construction,</w:t>
       </w:r>
     </w:p>
     <w:p/>
@@ -1696,7 +1696,7 @@
     <w:p/>
     <w:p>
       <w:r>
-        <w:t xml:space="preserve">Since F = F(η) and φ = φ(η), Eq. (43) is a spatially varying condition; it was evaluated pointwise over 0 ≤ η ≤ 1 for every reported parameter set and found to hold, so the complete diffusive quadratic form satisfies N_HT + N_DD ≥ 0. The friction and Joule contributions N_FF and N_J are individually non-negative because each is a positive coefficient (the F-dependent denominators being positive) times a squared gradient. Consequently, under the positive-semidefinite condition given by Eq. (43) together with the sign assumptions above, the whole denominator N_s is positive and the calculated Bejan number satisfies 0 ≤ Be ≤ 1 over the reported parameter range — note that it is the complete quadratic form N_HT + N_DD, and not the individual cross term (which may be negative locally), that is guaranteed non-negative.</w:t>
+        <w:t xml:space="preserve">Since F = F(η) and φ = φ(η), Eq. (43) is a spatially varying condition; with Λ as corrected in Eq. (37), it is to be evaluated pointwise over 0 ≤ η ≤ 1 for every reported parameter set (this check is to be repeated when the entropy quantities are regenerated from Eq. 36, see Section 6.4). Where it holds, the complete diffusive quadratic form satisfies N_HT + N_DD ≥ 0. The friction and Joule contributions N_FF and N_J are individually non-negative because each is a positive coefficient (the F-dependent denominators being positive) times a squared gradient. Consequently, under the positive-semidefinite condition given by Eq. (43) together with the sign assumptions above, the whole denominator N_s is positive and the calculated Bejan number satisfies 0 ≤ Be ≤ 1 over the reported parameter range — note that it is the complete quadratic form N_HT + N_DD, and not the individual cross term (which may be negative locally), that is guaranteed non-negative.</w:t>
       </w:r>
     </w:p>
     <w:p/>

</xml_diff>